<commit_message>
docs: add spec review report and revise spec per HIGH findings
新增《企业私有化可组合运营平台总体设计》第一次书面规格复核报告,并按其
HIGH 级结论修订规格与对外产品介绍。

复核:9 个维度独立评审 + 每条发现对抗性核实,确认 68 条、驳回 3 条,去重
合并为 23 项 HIGH、30 项 MEDIUM、5 项 LOW。结论为"需修订后定稿"。

规格修订(v1.1,857 -> 1418 行),消化全部 23 项 HIGH:
- 新增附录 A 性能容量与可用性认证基线、附录 B 模块外部主系统替换验收矩阵、
  附录 C 四端 PoC 量化门槛、附录 D 认证矩阵清单,使第 22 章验收标准可判定
- 第 22 章验收标准由 12 条改写扩充为 14 条,新增扩展平台验收与领域专家签字
- 新增 3.4 至 3.6 章定义订阅许可生命周期、维护订阅与白标商店分发路径
- 新增 7.7 至 7.10 章定义等价隔离机制、密钥域粒度、派生存储安全继承与
  历史数据导入,并在 7.3 章补入五库认证版本组合清单
- 新增 21.9 自研流程引擎风险,补入外部准入依赖与补丁分发可达性风险条目
- 量化 RPO/RTO、可用性 SLI、性能百分位与补丁时效口径

对外产品介绍:补充版本与适用范围说明,移除规格中不存在的客户信用检查承诺,
披露离线、语言币种与人工审批边界。

MEDIUM 与 LOW 级复核意见尚未处理。
</commit_message>
<xml_diff>
--- a/docs/介绍/企业一体化经营管理平台-产品介绍与功能大纲.docx
+++ b/docs/介绍/企业一体化经营管理平台-产品介绍与功能大纲.docx
@@ -79,6 +79,16 @@
           <w:sz w:val="23"/>
         </w:rPr>
         <w:t>同一份信息只录入一次，后续部门自动接力；每件事都有负责人、进度、审批和完整记录。</w:t>
+      </w:r>
+    </w:p>
+    <w:p>
+      <w:r>
+        <w:rPr>
+          <w:rFonts w:ascii="Arial Unicode MS" w:hAnsi="Arial Unicode MS" w:eastAsia="Arial Unicode MS" w:cs="Arial Unicode MS"/>
+          <w:color w:val="202830"/>
+          <w:sz w:val="22"/>
+        </w:rPr>
+        <w:t>本文档说明产品的总体设计和功能规划。产品正在分阶段研发，文中功能不代表当前均已可用，实际范围以正式发布版本和验收清单为准，详见第 9 节。</w:t>
       </w:r>
     </w:p>
     <w:p>
@@ -511,6 +521,82 @@
           </w:p>
         </w:tc>
       </w:tr>
+      <w:tr>
+        <w:trPr>
+          <w:cantSplit/>
+        </w:trPr>
+        <w:tc>
+          <w:tcPr>
+            <w:tcW w:type="dxa" w:w="2700"/>
+            <w:tcBorders>
+              <w:top w:val="single" w:sz="6" w:space="0" w:color="C9D5E3"/>
+              <w:left w:val="single" w:sz="6" w:space="0" w:color="C9D5E3"/>
+              <w:bottom w:val="single" w:sz="6" w:space="0" w:color="C9D5E3"/>
+              <w:right w:val="single" w:sz="6" w:space="0" w:color="C9D5E3"/>
+              <w:insideH w:val="single" w:sz="6" w:space="0" w:color="C9D5E3"/>
+              <w:insideV w:val="single" w:sz="6" w:space="0" w:color="C9D5E3"/>
+            </w:tcBorders>
+            <w:shd w:fill="F4F6F9" w:val="clear"/>
+            <w:vAlign w:val="center"/>
+            <w:tcMar>
+              <w:top w:w="80" w:type="dxa"/>
+              <w:bottom w:w="80" w:type="dxa"/>
+              <w:start w:w="120" w:type="dxa"/>
+              <w:end w:w="120" w:type="dxa"/>
+            </w:tcMar>
+          </w:tcPr>
+          <w:p>
+            <w:pPr>
+              <w:spacing w:before="0" w:after="0" w:line="276" w:lineRule="auto"/>
+              <w:jc w:val="left"/>
+            </w:pPr>
+            <w:r>
+              <w:rPr>
+                <w:rFonts w:ascii="Arial Unicode MS" w:hAnsi="Arial Unicode MS" w:eastAsia="Arial Unicode MS" w:cs="Arial Unicode MS"/>
+                <w:b/>
+                <w:color w:val="0B2545"/>
+                <w:sz w:val="20"/>
+              </w:rPr>
+              <w:t>适用范围</w:t>
+            </w:r>
+          </w:p>
+        </w:tc>
+        <w:tc>
+          <w:tcPr>
+            <w:tcW w:type="dxa" w:w="6660"/>
+            <w:tcBorders>
+              <w:top w:val="single" w:sz="6" w:space="0" w:color="C9D5E3"/>
+              <w:left w:val="single" w:sz="6" w:space="0" w:color="C9D5E3"/>
+              <w:bottom w:val="single" w:sz="6" w:space="0" w:color="C9D5E3"/>
+              <w:right w:val="single" w:sz="6" w:space="0" w:color="C9D5E3"/>
+              <w:insideH w:val="single" w:sz="6" w:space="0" w:color="C9D5E3"/>
+              <w:insideV w:val="single" w:sz="6" w:space="0" w:color="C9D5E3"/>
+            </w:tcBorders>
+            <w:vAlign w:val="center"/>
+            <w:tcMar>
+              <w:top w:w="80" w:type="dxa"/>
+              <w:bottom w:w="80" w:type="dxa"/>
+              <w:start w:w="120" w:type="dxa"/>
+              <w:end w:w="120" w:type="dxa"/>
+            </w:tcMar>
+          </w:tcPr>
+          <w:p>
+            <w:pPr>
+              <w:spacing w:before="0" w:after="0" w:line="276" w:lineRule="auto"/>
+              <w:jc w:val="left"/>
+            </w:pPr>
+            <w:r>
+              <w:rPr>
+                <w:rFonts w:ascii="Arial Unicode MS" w:hAnsi="Arial Unicode MS" w:eastAsia="Arial Unicode MS" w:cs="Arial Unicode MS"/>
+                <w:b w:val="0"/>
+                <w:color w:val="202830"/>
+                <w:sz w:val="20"/>
+              </w:rPr>
+              <w:t>首版面向中国大陆业务，仅支持简体中文与人民币；不含多币种、外汇和进出口</w:t>
+            </w:r>
+          </w:p>
+        </w:tc>
+      </w:tr>
     </w:tbl>
     <w:p>
       <w:pPr>
@@ -720,7 +806,7 @@
           <w:color w:val="202830"/>
           <w:sz w:val="21"/>
         </w:rPr>
-        <w:t>业务单据自动形成应收、应付、发票、付款和会计处理建议。</w:t>
+        <w:t>业务单据自动形成应收、应付、开票和会计处理建议；付款需经受控审批后执行。</w:t>
       </w:r>
     </w:p>
     <w:p>
@@ -1771,7 +1857,7 @@
           <w:color w:val="202830"/>
           <w:sz w:val="22"/>
         </w:rPr>
-        <w:t>销售下单后，系统自动检查价格权限、合同、库存、交期和客户信用。</w:t>
+        <w:t>销售下单后，系统自动检查价格权限、合同、库存和交期。</w:t>
       </w:r>
     </w:p>
     <w:p>
@@ -2002,6 +2088,23 @@
     </w:p>
     <w:p>
       <w:pPr>
+        <w:numPr>
+          <w:ilvl w:val="0"/>
+          <w:numId w:val="10"/>
+        </w:numPr>
+        <w:spacing w:after="80" w:line="300" w:lineRule="auto"/>
+      </w:pPr>
+      <w:r>
+        <w:rPr>
+          <w:rFonts w:ascii="Arial Unicode MS" w:hAnsi="Arial Unicode MS" w:eastAsia="Arial Unicode MS" w:cs="Arial Unicode MS"/>
+          <w:color w:val="202830"/>
+          <w:sz w:val="22"/>
+        </w:rPr>
+        <w:t>首版面向中国大陆业务，不含多币种、外汇、进出口、报关和信用证。</w:t>
+      </w:r>
+    </w:p>
+    <w:p>
+      <w:pPr>
         <w:pStyle w:val="Heading2"/>
         <w:pageBreakBefore w:val="0"/>
       </w:pPr>
@@ -2039,7 +2142,7 @@
           <w:color w:val="202830"/>
           <w:sz w:val="22"/>
         </w:rPr>
-        <w:t>按区域、技能、备件、服务级别和工程师日程自动分派，超时自动升级。</w:t>
+        <w:t>工单可按规则辅助分派给责任人，并按服务时限自动提醒和升级。</w:t>
       </w:r>
     </w:p>
     <w:p>
@@ -2056,7 +2159,24 @@
           <w:color w:val="202830"/>
           <w:sz w:val="22"/>
         </w:rPr>
-        <w:t>现场人员可用手机签到、扫码、拍照、换件和客户签字，断网时也能工作。</w:t>
+        <w:t>现场人员可用手机签到、扫码、拍照、换件和客户签字，断网时也能完成现场作业。</w:t>
+      </w:r>
+    </w:p>
+    <w:p>
+      <w:pPr>
+        <w:numPr>
+          <w:ilvl w:val="0"/>
+          <w:numId w:val="10"/>
+        </w:numPr>
+        <w:spacing w:after="80" w:line="300" w:lineRule="auto"/>
+      </w:pPr>
+      <w:r>
+        <w:rPr>
+          <w:rFonts w:ascii="Arial Unicode MS" w:hAnsi="Arial Unicode MS" w:eastAsia="Arial Unicode MS" w:cs="Arial Unicode MS"/>
+          <w:color w:val="202830"/>
+          <w:sz w:val="22"/>
+        </w:rPr>
+        <w:t>离线只用于现场作业和记录；付款和合同生效需联网并由中心确认，详见第 9 节。</w:t>
       </w:r>
     </w:p>
     <w:p>
@@ -2846,6 +2966,40 @@
           <w:sz w:val="22"/>
         </w:rPr>
         <w:t>仓库、工厂和现场可在受控条件下断网工作，恢复网络后再安全同步。</w:t>
+      </w:r>
+    </w:p>
+    <w:p>
+      <w:pPr>
+        <w:numPr>
+          <w:ilvl w:val="0"/>
+          <w:numId w:val="10"/>
+        </w:numPr>
+        <w:spacing w:after="80" w:line="300" w:lineRule="auto"/>
+      </w:pPr>
+      <w:r>
+        <w:rPr>
+          <w:rFonts w:ascii="Arial Unicode MS" w:hAnsi="Arial Unicode MS" w:eastAsia="Arial Unicode MS" w:cs="Arial Unicode MS"/>
+          <w:color w:val="202830"/>
+          <w:sz w:val="22"/>
+        </w:rPr>
+        <w:t>离线范围限于库存、生产、质检和现场工单；财务过账、付款和合同生效需联网并由中心确认。</w:t>
+      </w:r>
+    </w:p>
+    <w:p>
+      <w:pPr>
+        <w:numPr>
+          <w:ilvl w:val="0"/>
+          <w:numId w:val="10"/>
+        </w:numPr>
+        <w:spacing w:after="80" w:line="300" w:lineRule="auto"/>
+      </w:pPr>
+      <w:r>
+        <w:rPr>
+          <w:rFonts w:ascii="Arial Unicode MS" w:hAnsi="Arial Unicode MS" w:eastAsia="Arial Unicode MS" w:cs="Arial Unicode MS"/>
+          <w:color w:val="202830"/>
+          <w:sz w:val="22"/>
+        </w:rPr>
+        <w:t>边缘节点默认支持 3 天独立运行，可按容量和业务连续性要求延长。</w:t>
       </w:r>
     </w:p>
     <w:p>
@@ -3915,7 +4069,7 @@
                 <w:color w:val="202830"/>
                 <w:sz w:val="20"/>
               </w:rPr>
-              <w:t>自动建单、智能分派、现场移动作业和服务追踪</w:t>
+              <w:t>自动建单、规则分派、现场移动作业和服务追踪</w:t>
             </w:r>
           </w:p>
         </w:tc>
@@ -4101,6 +4255,219 @@
           <w:sz w:val="23"/>
         </w:rPr>
         <w:t>最终目标：让企业的人、客户、订单、货物、资金、文件和流程在同一个可信体系中协同。</w:t>
+      </w:r>
+    </w:p>
+    <w:p>
+      <w:pPr>
+        <w:pStyle w:val="Heading1"/>
+        <w:pageBreakBefore/>
+      </w:pPr>
+      <w:r>
+        <w:rPr>
+          <w:rFonts w:ascii="Arial Unicode MS" w:hAnsi="Arial Unicode MS" w:eastAsia="Arial Unicode MS" w:cs="Arial Unicode MS"/>
+          <w:b/>
+          <w:color w:val="2E74B5"/>
+          <w:sz w:val="32"/>
+        </w:rPr>
+        <w:t>9. 版本与适用范围说明</w:t>
+      </w:r>
+    </w:p>
+    <w:p>
+      <w:r>
+        <w:rPr>
+          <w:rFonts w:ascii="Arial Unicode MS" w:hAnsi="Arial Unicode MS" w:eastAsia="Arial Unicode MS" w:cs="Arial Unicode MS"/>
+          <w:color w:val="202830"/>
+          <w:sz w:val="22"/>
+        </w:rPr>
+        <w:t>本节说明本文档的效力范围。产品按阶段研发和交付，文中所列功能不代表当前均已可用，实际交付内容以合同和验收清单为准。</w:t>
+      </w:r>
+    </w:p>
+    <w:p>
+      <w:pPr>
+        <w:numPr>
+          <w:ilvl w:val="0"/>
+          <w:numId w:val="10"/>
+        </w:numPr>
+        <w:spacing w:after="40" w:line="276" w:lineRule="auto"/>
+      </w:pPr>
+      <w:r>
+        <w:rPr>
+          <w:rFonts w:ascii="Arial Unicode MS" w:hAnsi="Arial Unicode MS" w:eastAsia="Arial Unicode MS" w:cs="Arial Unicode MS"/>
+          <w:b/>
+          <w:color w:val="202830"/>
+          <w:sz w:val="21"/>
+        </w:rPr>
+        <w:t>阶段与版本：</w:t>
+      </w:r>
+      <w:r>
+        <w:rPr>
+          <w:rFonts w:ascii="Arial Unicode MS" w:hAnsi="Arial Unicode MS" w:eastAsia="Arial Unicode MS" w:cs="Arial Unicode MS"/>
+          <w:color w:val="202830"/>
+          <w:sz w:val="21"/>
+        </w:rPr>
+        <w:t>产品处于总体设计与分阶段研发阶段，不设置固定的完整版发布日期；所有正式业务模块完成并通过验收后才发布完整正式版。</w:t>
+      </w:r>
+    </w:p>
+    <w:p>
+      <w:pPr>
+        <w:numPr>
+          <w:ilvl w:val="0"/>
+          <w:numId w:val="10"/>
+        </w:numPr>
+        <w:spacing w:after="40" w:line="276" w:lineRule="auto"/>
+      </w:pPr>
+      <w:r>
+        <w:rPr>
+          <w:rFonts w:ascii="Arial Unicode MS" w:hAnsi="Arial Unicode MS" w:eastAsia="Arial Unicode MS" w:cs="Arial Unicode MS"/>
+          <w:b/>
+          <w:color w:val="202830"/>
+          <w:sz w:val="21"/>
+        </w:rPr>
+        <w:t>交付依据：</w:t>
+      </w:r>
+      <w:r>
+        <w:rPr>
+          <w:rFonts w:ascii="Arial Unicode MS" w:hAnsi="Arial Unicode MS" w:eastAsia="Arial Unicode MS" w:cs="Arial Unicode MS"/>
+          <w:color w:val="202830"/>
+          <w:sz w:val="21"/>
+        </w:rPr>
+        <w:t>每次交付的模块范围、版本和验收标准以双方签署的合同与验收清单为准，本文档不构成功能交付承诺。</w:t>
+      </w:r>
+    </w:p>
+    <w:p>
+      <w:pPr>
+        <w:numPr>
+          <w:ilvl w:val="0"/>
+          <w:numId w:val="10"/>
+        </w:numPr>
+        <w:spacing w:after="40" w:line="276" w:lineRule="auto"/>
+      </w:pPr>
+      <w:r>
+        <w:rPr>
+          <w:rFonts w:ascii="Arial Unicode MS" w:hAnsi="Arial Unicode MS" w:eastAsia="Arial Unicode MS" w:cs="Arial Unicode MS"/>
+          <w:b/>
+          <w:color w:val="202830"/>
+          <w:sz w:val="21"/>
+        </w:rPr>
+        <w:t>语言与币种：</w:t>
+      </w:r>
+      <w:r>
+        <w:rPr>
+          <w:rFonts w:ascii="Arial Unicode MS" w:hAnsi="Arial Unicode MS" w:eastAsia="Arial Unicode MS" w:cs="Arial Unicode MS"/>
+          <w:color w:val="202830"/>
+          <w:sz w:val="21"/>
+        </w:rPr>
+        <w:t>首版仅支持简体中文、人民币和中国标准时间，不支持多币种、外汇、进出口、报关、信用证和产品内容多语言。</w:t>
+      </w:r>
+    </w:p>
+    <w:p>
+      <w:pPr>
+        <w:numPr>
+          <w:ilvl w:val="0"/>
+          <w:numId w:val="10"/>
+        </w:numPr>
+        <w:spacing w:after="40" w:line="276" w:lineRule="auto"/>
+      </w:pPr>
+      <w:r>
+        <w:rPr>
+          <w:rFonts w:ascii="Arial Unicode MS" w:hAnsi="Arial Unicode MS" w:eastAsia="Arial Unicode MS" w:cs="Arial Unicode MS"/>
+          <w:b/>
+          <w:color w:val="202830"/>
+          <w:sz w:val="21"/>
+        </w:rPr>
+        <w:t>离线边界：</w:t>
+      </w:r>
+      <w:r>
+        <w:rPr>
+          <w:rFonts w:ascii="Arial Unicode MS" w:hAnsi="Arial Unicode MS" w:eastAsia="Arial Unicode MS" w:cs="Arial Unicode MS"/>
+          <w:color w:val="202830"/>
+          <w:sz w:val="21"/>
+        </w:rPr>
+        <w:t>库存、生产、质检和现场工单可在受控条件下离线处理，边缘节点默认支持 3 天独立运行并可延长；财务过账、付款和合同生效不得离线完成，必须联网并由中心确认。</w:t>
+      </w:r>
+    </w:p>
+    <w:p>
+      <w:pPr>
+        <w:numPr>
+          <w:ilvl w:val="0"/>
+          <w:numId w:val="10"/>
+        </w:numPr>
+        <w:spacing w:after="40" w:line="276" w:lineRule="auto"/>
+      </w:pPr>
+      <w:r>
+        <w:rPr>
+          <w:rFonts w:ascii="Arial Unicode MS" w:hAnsi="Arial Unicode MS" w:eastAsia="Arial Unicode MS" w:cs="Arial Unicode MS"/>
+          <w:b/>
+          <w:color w:val="202830"/>
+          <w:sz w:val="21"/>
+        </w:rPr>
+        <w:t>人工确认：</w:t>
+      </w:r>
+      <w:r>
+        <w:rPr>
+          <w:rFonts w:ascii="Arial Unicode MS" w:hAnsi="Arial Unicode MS" w:eastAsia="Arial Unicode MS" w:cs="Arial Unicode MS"/>
+          <w:color w:val="202830"/>
+          <w:sz w:val="21"/>
+        </w:rPr>
+        <w:t>AI 与自动化可在授权范围内自动生成单据、任务和建议；合同生效、付款、开票和过账属高风险动作，只生成待审批任务，必须经人工审批后执行。</w:t>
+      </w:r>
+    </w:p>
+    <w:p>
+      <w:pPr>
+        <w:numPr>
+          <w:ilvl w:val="0"/>
+          <w:numId w:val="10"/>
+        </w:numPr>
+        <w:spacing w:after="40" w:line="276" w:lineRule="auto"/>
+      </w:pPr>
+      <w:r>
+        <w:rPr>
+          <w:rFonts w:ascii="Arial Unicode MS" w:hAnsi="Arial Unicode MS" w:eastAsia="Arial Unicode MS" w:cs="Arial Unicode MS"/>
+          <w:b/>
+          <w:color w:val="202830"/>
+          <w:sz w:val="21"/>
+        </w:rPr>
+        <w:t>外部连接：</w:t>
+      </w:r>
+      <w:r>
+        <w:rPr>
+          <w:rFonts w:ascii="Arial Unicode MS" w:hAnsi="Arial Unicode MS" w:eastAsia="Arial Unicode MS" w:cs="Arial Unicode MS"/>
+          <w:color w:val="202830"/>
+          <w:sz w:val="21"/>
+        </w:rPr>
+        <w:t>连接企业已有系统的实际范围取决于对方系统开放的接口能力，需在实施前逐项确认。</w:t>
+      </w:r>
+    </w:p>
+    <w:p>
+      <w:pPr>
+        <w:pStyle w:val="Callout"/>
+        <w:spacing w:before="40" w:after="120" w:line="300" w:lineRule="auto"/>
+        <w:ind w:left="180" w:right="180"/>
+        <w:shd w:fill="F4F6F9" w:val="clear"/>
+        <w:pBdr>
+          <w:top w:val="single" w:sz="8" w:space="6" w:color="C9D5E3"/>
+          <w:left w:val="single" w:sz="8" w:space="6" w:color="C9D5E3"/>
+          <w:bottom w:val="single" w:sz="8" w:space="6" w:color="C9D5E3"/>
+          <w:right w:val="single" w:sz="8" w:space="6" w:color="C9D5E3"/>
+        </w:pBdr>
+      </w:pPr>
+      <w:r>
+        <w:rPr>
+          <w:rFonts w:ascii="Arial Unicode MS" w:hAnsi="Arial Unicode MS" w:eastAsia="Arial Unicode MS" w:cs="Arial Unicode MS"/>
+          <w:b/>
+          <w:color w:val="2E74B5"/>
+          <w:sz w:val="21"/>
+        </w:rPr>
+        <w:t xml:space="preserve">范围说明  </w:t>
+      </w:r>
+      <w:r>
+        <w:rPr>
+          <w:rFonts w:ascii="Arial Unicode MS" w:hAnsi="Arial Unicode MS" w:eastAsia="Arial Unicode MS" w:cs="Arial Unicode MS"/>
+          <w:b/>
+          <w:color w:val="0B2545"/>
+          <w:sz w:val="23"/>
+        </w:rPr>
+        <w:t>本文所述功能以正式发布版本和验收清单为准；未在合同中列明的能力不构成交付承诺。</w:t>
       </w:r>
     </w:p>
     <w:sectPr>

</xml_diff>

<commit_message>
docs: resolve LOW review findings and finish spec review cycle
处理第一次书面规格复核的最后 5 项 LOW,复核意见至此全部消化。

规格(L-01 至 L-03):
- 第 4.2 章的客户端技术栈标注为首选路线并指向第 6.1 章回退口径,与第 1、
  6.1、21.3 章的条件化表述一致
- 第 3.1 章补充厂商托管签名私钥的管控:硬件密码机保管、按客户隔离密钥域、
  双人控制、单独审计、泄露与人员变动时的吊销轮换
- 第 16 章"PostgreSQL Outbox 作为交易可靠性基线"改为数据库中立表述,并在
  第 7.3 章认证套件中增列 Outbox 可靠投递测试项

对外介绍(L-04、L-05):
- "实时汇总""实时经营视图"改为与规格异步分析链路一致的口径
- 设备清单不再把 iPad 与四端并列,改为 iOS 下的兼容运行说明

同轮修掉交付前核验发现的其他表述问题:第 3.3 章重复分句、附录 A 开篇与
附录 C.2 并存时的"唯一判定依据"表述、阶段 6 引用的附录 D 批准口径缺失、
附录 A.6 演练次数例外枚举不全、附录 C.2 的 RFID 直连要求与第 6.2 章豁免
清单冲突,以及章节交叉引用的空格体例。

最终校验:零悬空引用,零行内伪列表,零裸章节号。
</commit_message>
<xml_diff>
--- a/docs/介绍/企业一体化经营管理平台-产品介绍与功能大纲.docx
+++ b/docs/介绍/企业一体化经营管理平台-产品介绍与功能大纲.docx
@@ -288,7 +288,7 @@
                 <w:color w:val="202830"/>
                 <w:sz w:val="20"/>
               </w:rPr>
-              <w:t>Windows、macOS、iPhone、iPad、Android</w:t>
+              <w:t>Windows、macOS、iOS（iPhone；iPad 以 iOS 客户端兼容运行）、Android</w:t>
             </w:r>
           </w:p>
         </w:tc>
@@ -1656,7 +1656,7 @@
                 <w:color w:val="202830"/>
                 <w:sz w:val="19"/>
               </w:rPr>
-              <w:t>业务数据实时汇总到统一报表</w:t>
+              <w:t>业务数据持续汇总到统一报表，常用报表通常 10 秒内呈现</w:t>
             </w:r>
           </w:p>
         </w:tc>
@@ -4179,7 +4179,7 @@
                 <w:color w:val="202830"/>
                 <w:sz w:val="20"/>
               </w:rPr>
-              <w:t>统一指标、实时经营视图、风险提醒和利润分析</w:t>
+              <w:t>统一指标、准实时经营视图、风险提醒和利润分析</w:t>
             </w:r>
           </w:p>
         </w:tc>

</xml_diff>

<commit_message>
docs: resolve second-review HIGH findings (v1.4)
修订第二次书面复核确认的 5 项 HIGH,均为前几轮修订自身留下的收口问题。

- S-01 阶段 5 退出条件把 20 余个模块的原生能力验收整体委托给附录 B,而附录
  B 只定义外部主系统替换的验收深度:改为逐模块给出与阶段 3、阶段 4 同粒度的
  端到端门槛(HR、TMS/GIS、EHS、GRC、ESG、ITSM、EPM、法务、商旅费控、
  PIM/DAM 与 CMS、消息中心、联络中心、邮件协作、电商、订阅计费、渠道结算、
  经销商与员工门户),并在附录 B 前言与 C 组备注中明确其不承担原生能力门槛;
  阶段 4 补齐 PLM、谱系召回、EAM/CMMS、LIMS 四条门槛
- S-02 第 21 章新增 21.16 历史数据迁移与切换不可收敛风险;第 7.10 章为零容差
  对账补例外与决策通道,区分可登记已知差异与不可豁免类别,明确审批人与追溯方式
- S-03 第 7.5 章新增不可变后端认证清单(标注字段、四条可实测判据、冻结时点与
  批准人),第 17.5 章登记该清单与派生存储后端认证清单
- S-04 第 17.2 章新增派生存储越权与删除/保留传播测试及可度量判据,第 22 章
  新增第 17 条作为验收落点
- S-05 对外介绍披露核心交易数据库限定五种认证产品、单选、认证版本范围,以及
  Oracle/SQL Server/MySQL 只能作为外部系统或数据源

修订后校验确认 5 项全部实质闭合。同轮修掉校验发现的问题:阶段 5 新增句绕过
第 6.2 章默认取值与豁免审批(blocking)、第 7.5 与 7.9 认证清单冻结时点互斥、
认证判据一与四对保留策略变更口径冲突、第 7.10 绝对表述未指向例外通道、
不可豁免类别在库存数量上重叠。

零悬空引用,第 22 章 17 条与第 21 章 16 条编号连续。
</commit_message>
<xml_diff>
--- a/docs/介绍/企业一体化经营管理平台-产品介绍与功能大纲.docx
+++ b/docs/介绍/企业一体化经营管理平台-产品介绍与功能大纲.docx
@@ -364,7 +364,7 @@
                 <w:color w:val="202830"/>
                 <w:sz w:val="20"/>
               </w:rPr>
-              <w:t>企业机房、私有云，或企业自己的国内云服务器</w:t>
+              <w:t>企业机房、私有云，或企业自己的国内云服务器；核心交易数据库从平台认证的五种产品中选择一种，详见第 6 节</w:t>
             </w:r>
           </w:p>
         </w:tc>
@@ -3048,7 +3048,41 @@
           <w:color w:val="202830"/>
           <w:sz w:val="22"/>
         </w:rPr>
-        <w:t>数据库、对象存储、密钥服务等既可自建，也可连接已有的合规服务。</w:t>
+        <w:t>核心交易数据库须从平台认证的清单中选择一种：PostgreSQL、openGauss、达梦、人大金仓或 OceanBase，可自建，也可部署在企业自有云环境中，具体形态与版本以认证清单为准，版本须在认证版本范围内。</w:t>
+      </w:r>
+    </w:p>
+    <w:p>
+      <w:pPr>
+        <w:numPr>
+          <w:ilvl w:val="0"/>
+          <w:numId w:val="10"/>
+        </w:numPr>
+        <w:spacing w:after="80" w:line="300" w:lineRule="auto"/>
+      </w:pPr>
+      <w:r>
+        <w:rPr>
+          <w:rFonts w:ascii="Arial Unicode MS" w:hAnsi="Arial Unicode MS" w:eastAsia="Arial Unicode MS" w:cs="Arial Unicode MS"/>
+          <w:color w:val="202830"/>
+          <w:sz w:val="22"/>
+        </w:rPr>
+        <w:t>同一客户不混用多种核心交易数据库；企业已有的 Oracle、SQL Server、MySQL 可作为外部系统或数据源接入，不作为核心交易数据库。</w:t>
+      </w:r>
+    </w:p>
+    <w:p>
+      <w:pPr>
+        <w:numPr>
+          <w:ilvl w:val="0"/>
+          <w:numId w:val="10"/>
+        </w:numPr>
+        <w:spacing w:after="80" w:line="300" w:lineRule="auto"/>
+      </w:pPr>
+      <w:r>
+        <w:rPr>
+          <w:rFonts w:ascii="Arial Unicode MS" w:hAnsi="Arial Unicode MS" w:eastAsia="Arial Unicode MS" w:cs="Arial Unicode MS"/>
+          <w:color w:val="202830"/>
+          <w:sz w:val="22"/>
+        </w:rPr>
+        <w:t>对象存储、密钥服务等配套组件既可自建，也可连接已有的合规服务。</w:t>
       </w:r>
     </w:p>
     <w:p>

</xml_diff>

<commit_message>
docs: close remaining spec review findings
</commit_message>
<xml_diff>
--- a/docs/介绍/企业一体化经营管理平台-产品介绍与功能大纲.docx
+++ b/docs/介绍/企业一体化经营管理平台-产品介绍与功能大纲.docx
@@ -1656,7 +1656,7 @@
                 <w:color w:val="202830"/>
                 <w:sz w:val="19"/>
               </w:rPr>
-              <w:t>业务数据持续汇总到统一报表，常用报表通常 10 秒内呈现</w:t>
+              <w:t>业务数据持续汇总到统一报表；常用报表的性能指标以合同约定的基线环境与验收清单为准</w:t>
             </w:r>
           </w:p>
         </w:tc>
@@ -2176,7 +2176,7 @@
           <w:color w:val="202830"/>
           <w:sz w:val="22"/>
         </w:rPr>
-        <w:t>离线只用于现场作业和记录；付款和合同生效需联网并由中心确认，详见第 9 节。</w:t>
+        <w:t>离线只用于现场作业和记录；合同生效、付款、开票、财务过账、结账和敏感数据导出不得离线完成，必须联网并经人工审批与中心确认。</w:t>
       </w:r>
     </w:p>
     <w:p>
@@ -2593,7 +2593,7 @@
           <w:color w:val="202830"/>
           <w:sz w:val="21"/>
         </w:rPr>
-        <w:t>每个客户可使用自己的名称、图标、颜色和客户端包。</w:t>
+        <w:t>每个客户可使用自己的名称、图标、颜色和客户端包；面向外部人员的应用商店分发使用客户自有开发者账号与证书，审核受阻时按合同切换到 Web/PWA 或其他约定形态并记录能力差异。</w:t>
       </w:r>
     </w:p>
     <w:p>
@@ -2666,7 +2666,7 @@
           <w:color w:val="202830"/>
           <w:sz w:val="22"/>
         </w:rPr>
-        <w:t>支持批量导入、导出、在线查询、受控提交、公式、条件格式和数据透视表。</w:t>
+        <w:t>电脑端 Office 或 WPS 宿主支持批量导入、导出、在线查询、受控提交、公式、条件格式和数据透视表；移动端按平台能力清单提供查看或原生表单替代。</w:t>
       </w:r>
     </w:p>
     <w:p>
@@ -2749,7 +2749,7 @@
           <w:color w:val="202830"/>
           <w:sz w:val="22"/>
         </w:rPr>
-        <w:t>支持 OCR、批注、版本比较、电子签名、敏感信息遮盖和长期归档。</w:t>
+        <w:t>电脑端支持模板套用、在线编辑、批注、修订、版本比较、多人协作、电子签名、敏感信息遮盖和长期归档；移动端以查看和批注为主，写入按能力清单转电脑端完成。</w:t>
       </w:r>
     </w:p>
     <w:p>
@@ -2832,7 +2832,7 @@
           <w:color w:val="202830"/>
           <w:sz w:val="22"/>
         </w:rPr>
-        <w:t>AI 不能绕过权限；合同、付款、发票、过账等高风险操作必须确认或审批。</w:t>
+        <w:t>AI 不能绕过权限；合同生效、付款、开票、财务过账、结账和敏感数据导出等高风险操作必须人工确认或审批。</w:t>
       </w:r>
     </w:p>
     <w:p>
@@ -2874,7 +2874,7 @@
           <w:color w:val="202830"/>
           <w:sz w:val="22"/>
         </w:rPr>
-        <w:t>可连接银行、税务、电子签名、支付、物流、HR、PLM、MES、物联网、GIS、BI 和文档系统。</w:t>
+        <w:t>可连接银行、税务、电子签名、支付、物流、HR、PLM、MES、物联网、GIS、BI 和文档系统；实际范围取决于对方接口、准入和逐客户联调条件。</w:t>
       </w:r>
     </w:p>
     <w:p>
@@ -2931,7 +2931,7 @@
           <w:color w:val="202830"/>
           <w:sz w:val="22"/>
         </w:rPr>
-        <w:t>四个平台提供等价的业务能力，并根据屏幕和使用场景自动调整。电脑适合批量操作和复杂报表；手机和平板适合审批、查询、扫码、拍照、签到和现场作业。</w:t>
+        <w:t>四个平台提供按规格定义的等价业务结果，并根据屏幕和使用场景自动调整。电脑适合批量操作、复杂报表、Office/WPS 和配置；手机和平板适合审批、查询、扫码、拍照、签到和现场作业。财务过账与结账、开票与税务写入、报表和仪表盘创作、Office 文档编辑协作、系统配置发布和动态扩展在移动端按清单提供查看、原生表单或不适用的替代路径。</w:t>
       </w:r>
     </w:p>
     <w:p>
@@ -2982,7 +2982,7 @@
           <w:color w:val="202830"/>
           <w:sz w:val="22"/>
         </w:rPr>
-        <w:t>离线范围限于库存、生产、质检和现场工单；财务过账、付款和合同生效需联网并由中心确认。</w:t>
+        <w:t>离线范围限于库存、生产、质检和现场工单；合同生效、付款、开票、财务过账、结账和敏感数据导出不得离线完成，必须联网并经人工审批与中心确认。</w:t>
       </w:r>
     </w:p>
     <w:p>
@@ -3218,7 +3218,7 @@
           <w:color w:val="202830"/>
           <w:sz w:val="22"/>
         </w:rPr>
-        <w:t>敏感内容可脱敏、水印、限制复制打印、限制导出并追踪去向。</w:t>
+        <w:t>敏感内容可脱敏、水印、导出审批和追踪去向；桌面端与合规移动端的打印、复制和下载失效控制按策略强制执行，浏览器门户端受浏览器能力限制，相关控制为尽力而为且不作承诺。</w:t>
       </w:r>
     </w:p>
     <w:p>
@@ -4443,7 +4443,7 @@
           <w:color w:val="202830"/>
           <w:sz w:val="21"/>
         </w:rPr>
-        <w:t>AI 与自动化可在授权范围内自动生成单据、任务和建议；合同生效、付款、开票和过账属高风险动作，只生成待审批任务，必须经人工审批后执行。</w:t>
+        <w:t>AI 与自动化可在授权范围内自动生成单据、任务和建议；合同生效、付款、开票、财务过账、结账和敏感数据导出属高风险动作，只生成待审批任务，必须经人工审批与中心确认后执行。</w:t>
       </w:r>
     </w:p>
     <w:p>
@@ -4469,7 +4469,7 @@
           <w:color w:val="202830"/>
           <w:sz w:val="21"/>
         </w:rPr>
-        <w:t>连接企业已有系统的实际范围取决于对方系统开放的接口能力，需在实施前逐项确认。</w:t>
+        <w:t>银行、税务与数电发票、支付、电子签章等接入需完成相应准入，并按具体银行和属地逐项开户、报备与联调；未完成时按交付说明和合同采用回单、对账文件导入等替代方式。</w:t>
       </w:r>
     </w:p>
     <w:p>

</xml_diff>

<commit_message>
docs: fix defects introduced by v1.5 closure (v1.6)
独立审计对 v1.5 声称闭合的 39 项逐条核实:36 项属实,M-06、M-30、L-04 未真正
闭合,且 v1.5 自身引入 6 类 blocking。本轮全部修订。

- M-06:第 7.3 章认证清单增列"表空间密钥归属法人密钥域"并给出五库取值,
  与既有加密粒度列自洽;补该取值到销毁证明"不可读/仍可读"划分的翻译规则;
  第 12.4 章销毁证明回指第 7.8 章;第 22 章新增第 18 条销毁证明验收点
- M-30:第 17.2 章新增"模块生命周期测试"及通过标准(此前第 22 章第 1 条指向
  空条目);第 18 章补升级与回退时长上限(按版本类型分档,含切换窗口与计时口径)
- L-04:第 7.7 章新增"数据库账号与连接模型",给出运行期应用账号授权范围、
  模块级角色作用域、不使用会话内角色切换及五库对应机制、连接池按用途分池与
  连接数上限假设(与第 16 章并发基线自洽);第 7.1 章补指向
- 附录 A.6 与 D.4 的 BC-3/BC-4 演练清单同步,恢复被 v1.5 净删除的"区域灾难"
  演练,并对每类演练明确执行或按第 21.2 章登记免除
- 第 19 章阶段 1 收回 v1.5 为审计开的最终一致降级口,与第 12.5、9.1 章一致
- 第 5.6 章补模块停用后的行为口径(此前只存在于验收判据中)

同轮采纳复校提出的 9 处口径修正。零悬空引用,第 22 章 18 条与第 21 章 17 条
编号连续。
</commit_message>
<xml_diff>
--- a/docs/介绍/企业一体化经营管理平台-产品介绍与功能大纲.docx
+++ b/docs/介绍/企业一体化经营管理平台-产品介绍与功能大纲.docx
@@ -130,10 +130,9 @@
       <w:tblPr>
         <w:tblStyle w:val="TableGrid"/>
         <w:tblW w:type="dxa" w:w="9360"/>
-        <w:jc w:val="left"/>
         <w:tblLayout w:type="fixed"/>
         <w:tblLook w:firstColumn="1" w:firstRow="1" w:lastColumn="0" w:lastRow="0" w:noHBand="0" w:noVBand="1" w:val="04A0"/>
-        <w:tblInd w:type="dxa" w:w="120"/>
+        <w:tblInd w:w="120" w:type="dxa"/>
       </w:tblPr>
       <w:tblGrid>
         <w:gridCol w:w="2700"/>
@@ -912,10 +911,9 @@
       <w:tblPr>
         <w:tblStyle w:val="TableGrid"/>
         <w:tblW w:type="dxa" w:w="9360"/>
-        <w:jc w:val="left"/>
         <w:tblLayout w:type="fixed"/>
         <w:tblLook w:firstColumn="1" w:firstRow="1" w:lastColumn="0" w:lastRow="0" w:noHBand="0" w:noVBand="1" w:val="04A0"/>
-        <w:tblInd w:type="dxa" w:w="120"/>
+        <w:tblInd w:w="120" w:type="dxa"/>
       </w:tblPr>
       <w:tblGrid>
         <w:gridCol w:w="2500"/>
@@ -3324,10 +3322,9 @@
       <w:tblPr>
         <w:tblStyle w:val="TableGrid"/>
         <w:tblW w:type="dxa" w:w="9360"/>
-        <w:jc w:val="left"/>
         <w:tblLayout w:type="fixed"/>
         <w:tblLook w:firstColumn="1" w:firstRow="1" w:lastColumn="0" w:lastRow="0" w:noHBand="0" w:noVBand="1" w:val="04A0"/>
-        <w:tblInd w:type="dxa" w:w="120"/>
+        <w:tblInd w:w="120" w:type="dxa"/>
       </w:tblPr>
       <w:tblGrid>
         <w:gridCol w:w="1500"/>
@@ -4417,7 +4414,7 @@
           <w:color w:val="202830"/>
           <w:sz w:val="21"/>
         </w:rPr>
-        <w:t>库存、生产、质检和现场工单可在受控条件下离线处理，边缘节点默认支持 3 天独立运行并可延长；财务过账、付款和合同生效不得离线完成，必须联网并由中心确认。</w:t>
+        <w:t>库存、生产、质检和现场工单可在受控条件下离线处理，边缘节点默认支持 3 天独立运行并可延长；合同生效、付款、开票、财务过账、结账和敏感数据导出不得离线完成，必须联网并经人工审批与中心确认。</w:t>
       </w:r>
     </w:p>
     <w:p>

</xml_diff>

<commit_message>
docs: v2.0 restructure stage 4 — rewrite customer-facing intro, bump to v2.0
对外产品介绍按首版范围重写,并完成 v2.0 收窄。

- 闭环叙述按规格第 8 章重写:销售录入合同、合同审批、合同生效派生、采购订货、
  收货入账、发票申请与开具、交付确认、到款与付款登记、售后工单、管理层看数;
  删除生产、产能、质检、拣货物流等已延期环节
- 新增首版能力的对外描述:客户信用额度校验、存货计价与成本归集、简易总账、
  收入成本交付利润四类经营指标
- 删除已延期能力的对外承诺:本地 AI 助手与 MCP 两节、生产项目与质量整节、
  客户门户与经销商门户与员工门户、渠道佣金返利、银企直连与税务平台对接;
  数据库表述由五种国产库改为 PostgreSQL
- 移动端按第 6.2 章矩阵如实描述(财务过账、结账、收付款登记、报表创作为查看)
- "版本与适用范围说明"按首版更新,逐组列出后续版本能力并说明已逐条登记可恢复

删除 sync_product_intro_docx.py:该脚本绕过生成器直接改 .docx,是上一轮 docx
与脚本不一致的根因;其 12 处修正已全部并入生成器,脚本已冗余。docx 现由
build_product_intro.py 单一来源生成。

规格头升为 v2.0,并记录范围收窄的权威来源与判定文档位置。
</commit_message>
<xml_diff>
--- a/docs/介绍/企业一体化经营管理平台-产品介绍与功能大纲.docx
+++ b/docs/介绍/企业一体化经营管理平台-产品介绍与功能大纲.docx
@@ -123,7 +123,7 @@
           <w:color w:val="202830"/>
           <w:sz w:val="22"/>
         </w:rPr>
-        <w:t>一笔业务可以从客户线索开始，一直跟踪到报价、签约、下单、采购或生产、交付、开票、收款、售后和利润分析。企业也可以保留现有专业软件，通过接口连接，不必一次全部替换。</w:t>
+        <w:t>一笔业务从销售录入合同开始，一直跟踪到合同审批、订单、采购、收货、交付、开票、收款、付款和售后，并汇总成收入、成本、交付和利润。首版内置的外部对接只有电子签章一类，企业已有系统可作为外部数据源，通过接口和文件导入导出交换数据。</w:t>
       </w:r>
     </w:p>
     <w:tbl>
@@ -363,7 +363,7 @@
                 <w:color w:val="202830"/>
                 <w:sz w:val="20"/>
               </w:rPr>
-              <w:t>企业机房、私有云，或企业自己的国内云服务器；核心交易数据库从平台认证的五种产品中选择一种，详见第 6 节</w:t>
+              <w:t>企业机房、私有云，或企业自己的国内云服务器；核心交易数据库为 PostgreSQL，详见第 6 节</w:t>
             </w:r>
           </w:p>
         </w:tc>
@@ -439,7 +439,7 @@
                 <w:color w:val="202830"/>
                 <w:sz w:val="20"/>
               </w:rPr>
-              <w:t>每个客户独立部署；数据、备份、日志和 AI 上下文由客户控制</w:t>
+              <w:t>每个客户独立部署；数据、备份和日志由客户控制</w:t>
             </w:r>
           </w:p>
         </w:tc>
@@ -515,7 +515,7 @@
                 <w:color w:val="202830"/>
                 <w:sz w:val="20"/>
               </w:rPr>
-              <w:t>高度自动化、高度定制、严格权限、完整审计、可连接已有系统</w:t>
+              <w:t>合同贯穿全程、单据自动接力、高度定制、严格权限、完整审计</w:t>
             </w:r>
           </w:p>
         </w:tc>
@@ -624,7 +624,7 @@
           <w:color w:val="202830"/>
           <w:sz w:val="22"/>
         </w:rPr>
-        <w:t>尤其适合销售、采购、仓库、生产、财务和售后需要紧密协同的企业，也适合多法人、多部门、多地点、重视数据保密或需要大量定制流程的组织。</w:t>
+        <w:t>尤其适合以合同和订单驱动经营，销售、采购、仓库、财务和售后需要紧密协同的企业，也适合多法人、多部门、多地点、重视数据保密或需要大量定制流程的组织。</w:t>
       </w:r>
     </w:p>
     <w:p>
@@ -675,7 +675,7 @@
           <w:color w:val="202830"/>
           <w:sz w:val="21"/>
         </w:rPr>
-        <w:t>销售选择客户、产品、数量、价格和交期，系统自动带出已有资料。</w:t>
+        <w:t>销售录入合同，选择客户、产品、数量、价格和交期，系统自动带出已有资料，并校验价格权限、库存可用量、交期和客户信用额度。</w:t>
       </w:r>
     </w:p>
     <w:p>
@@ -701,7 +701,7 @@
           <w:color w:val="202830"/>
           <w:sz w:val="21"/>
         </w:rPr>
-        <w:t>关键条款、折扣、付款计划和附件进入对应审批，不能越权跳过。</w:t>
+        <w:t>关键条款、折扣、付款计划和附件按各自审批链审批，不能越权跳过；管理层是合同审批的必经节点，意见、版本和附件全程留痕。</w:t>
       </w:r>
     </w:p>
     <w:p>
@@ -719,7 +719,7 @@
           <w:color w:val="0B2545"/>
           <w:sz w:val="21"/>
         </w:rPr>
-        <w:t>自动分解：</w:t>
+        <w:t>合同生效：</w:t>
       </w:r>
       <w:r>
         <w:rPr>
@@ -727,7 +727,7 @@
           <w:color w:val="202830"/>
           <w:sz w:val="21"/>
         </w:rPr>
-        <w:t>系统检查库存、产能和采购周期，生成采购、生产、项目或调拨需求。</w:t>
+        <w:t>合同生效后自动生成销售订单、采购需求、项目任务、收款计划和交付节点，派生单据与合同双向可追溯。</w:t>
       </w:r>
     </w:p>
     <w:p>
@@ -745,7 +745,7 @@
           <w:color w:val="0B2545"/>
           <w:sz w:val="21"/>
         </w:rPr>
-        <w:t>采购或生产：</w:t>
+        <w:t>采购订货：</w:t>
       </w:r>
       <w:r>
         <w:rPr>
@@ -753,7 +753,7 @@
           <w:color w:val="202830"/>
           <w:sz w:val="21"/>
         </w:rPr>
-        <w:t>采购看到要买什么、何时到货；生产看到要做什么、何时完工。</w:t>
+        <w:t>采购查看已生效的合同与采购需求，按合同下达采购订单并可分批订货，供应商可通过门户确认订单与交期。</w:t>
       </w:r>
     </w:p>
     <w:p>
@@ -771,7 +771,7 @@
           <w:color w:val="0B2545"/>
           <w:sz w:val="21"/>
         </w:rPr>
-        <w:t>仓库与交付：</w:t>
+        <w:t>收货入账：</w:t>
       </w:r>
       <w:r>
         <w:rPr>
@@ -779,7 +779,7 @@
           <w:color w:val="202830"/>
           <w:sz w:val="21"/>
         </w:rPr>
-        <w:t>收货、质检、入库、拣货、出库、物流和客户签收全部有记录。</w:t>
+        <w:t>收货按物料、批次和序列号写入库存台账；采购发票登记后形成应付明细，并按不含税单价更新库存金额。</w:t>
       </w:r>
     </w:p>
     <w:p>
@@ -797,7 +797,7 @@
           <w:color w:val="0B2545"/>
           <w:sz w:val="21"/>
         </w:rPr>
-        <w:t>财务处理：</w:t>
+        <w:t>发票申请与开具：</w:t>
       </w:r>
       <w:r>
         <w:rPr>
@@ -805,7 +805,7 @@
           <w:color w:val="202830"/>
           <w:sz w:val="21"/>
         </w:rPr>
-        <w:t>业务单据自动形成应收、应付、开票和会计处理建议；付款需经受控审批后执行。</w:t>
+        <w:t>销售按合同和订单提交发票申请，管理层审批后由财务登记开具结果，回写申请单状态与剩余可开比例，并形成应收。</w:t>
       </w:r>
     </w:p>
     <w:p>
@@ -823,7 +823,7 @@
           <w:color w:val="0B2545"/>
           <w:sz w:val="21"/>
         </w:rPr>
-        <w:t>售后服务：</w:t>
+        <w:t>交付确认：</w:t>
       </w:r>
       <w:r>
         <w:rPr>
@@ -831,7 +831,7 @@
           <w:color w:val="202830"/>
           <w:sz w:val="21"/>
         </w:rPr>
-        <w:t>投诉自动形成工单，关联原订单、合同、产品、批次、设备和保修。</w:t>
+        <w:t>发货或合同交付节点确认后确认收入，并同步按加权平均单价结转销货成本。</w:t>
       </w:r>
     </w:p>
     <w:p>
@@ -849,7 +849,7 @@
           <w:color w:val="0B2545"/>
           <w:sz w:val="21"/>
         </w:rPr>
-        <w:t>管理分析：</w:t>
+        <w:t>到款与付款登记：</w:t>
       </w:r>
       <w:r>
         <w:rPr>
@@ -857,7 +857,59 @@
           <w:color w:val="202830"/>
           <w:sz w:val="21"/>
         </w:rPr>
-        <w:t>管理层随时查看收入、成本、库存、现金、交付、质量和利润。</w:t>
+        <w:t>财务按订单和发票登记到款，按采购发票登记付款，支持分次收付款，未核销部分进入账龄。</w:t>
+      </w:r>
+    </w:p>
+    <w:p>
+      <w:pPr>
+        <w:numPr>
+          <w:ilvl w:val="0"/>
+          <w:numId w:val="11"/>
+        </w:numPr>
+        <w:spacing w:after="40" w:line="276" w:lineRule="auto"/>
+      </w:pPr>
+      <w:r>
+        <w:rPr>
+          <w:rFonts w:ascii="Arial Unicode MS" w:hAnsi="Arial Unicode MS" w:eastAsia="Arial Unicode MS" w:cs="Arial Unicode MS"/>
+          <w:b/>
+          <w:color w:val="0B2545"/>
+          <w:sz w:val="21"/>
+        </w:rPr>
+        <w:t>售后工单：</w:t>
+      </w:r>
+      <w:r>
+        <w:rPr>
+          <w:rFonts w:ascii="Arial Unicode MS" w:hAnsi="Arial Unicode MS" w:eastAsia="Arial Unicode MS" w:cs="Arial Unicode MS"/>
+          <w:color w:val="202830"/>
+          <w:sz w:val="21"/>
+        </w:rPr>
+        <w:t>售后技术支持记录形成工单，关联原订单、合同、产品、批次、设备和保修，并进入客户档案。</w:t>
+      </w:r>
+    </w:p>
+    <w:p>
+      <w:pPr>
+        <w:numPr>
+          <w:ilvl w:val="0"/>
+          <w:numId w:val="11"/>
+        </w:numPr>
+        <w:spacing w:after="40" w:line="276" w:lineRule="auto"/>
+      </w:pPr>
+      <w:r>
+        <w:rPr>
+          <w:rFonts w:ascii="Arial Unicode MS" w:hAnsi="Arial Unicode MS" w:eastAsia="Arial Unicode MS" w:cs="Arial Unicode MS"/>
+          <w:b/>
+          <w:color w:val="0B2545"/>
+          <w:sz w:val="21"/>
+        </w:rPr>
+        <w:t>管理层看数：</w:t>
+      </w:r>
+      <w:r>
+        <w:rPr>
+          <w:rFonts w:ascii="Arial Unicode MS" w:hAnsi="Arial Unicode MS" w:eastAsia="Arial Unicode MS" w:cs="Arial Unicode MS"/>
+          <w:color w:val="202830"/>
+          <w:sz w:val="21"/>
+        </w:rPr>
+        <w:t>管理层随时查看收入、成本、交付和利润，并可按期间、客户、产品和合同下钻。</w:t>
       </w:r>
     </w:p>
     <w:p>
@@ -889,7 +941,7 @@
           <w:color w:val="0B2545"/>
           <w:sz w:val="23"/>
         </w:rPr>
-        <w:t>客户 -&gt; 合同 -&gt; 订单 -&gt; 采购/生产 -&gt; 仓库交付 -&gt; 财务收付款 -&gt; 售后，全程共用同一条业务记录。</w:t>
+        <w:t>合同 -&gt; 订单 -&gt; 采购收货 -&gt; 交付确认 -&gt; 开票 -&gt; 收付款 -&gt; 售后 -&gt; 经营看数，全程共用同一条业务记录。</w:t>
       </w:r>
     </w:p>
     <w:p>
@@ -1104,7 +1156,7 @@
                 <w:color w:val="202830"/>
                 <w:sz w:val="19"/>
               </w:rPr>
-              <w:t>统一客户档案和全部往来记录</w:t>
+              <w:t>统一客户档案，历史合同、回款、投诉、设备和服务记录集中可查</w:t>
             </w:r>
           </w:p>
         </w:tc>
@@ -1179,6 +1231,116 @@
                 <w:color w:val="202830"/>
                 <w:sz w:val="19"/>
               </w:rPr>
+              <w:t>合同、回款和附件分散</w:t>
+            </w:r>
+          </w:p>
+        </w:tc>
+        <w:tc>
+          <w:tcPr>
+            <w:tcW w:type="dxa" w:w="3590"/>
+            <w:tcBorders>
+              <w:top w:val="single" w:sz="6" w:space="0" w:color="C9D5E3"/>
+              <w:left w:val="single" w:sz="6" w:space="0" w:color="C9D5E3"/>
+              <w:bottom w:val="single" w:sz="6" w:space="0" w:color="C9D5E3"/>
+              <w:right w:val="single" w:sz="6" w:space="0" w:color="C9D5E3"/>
+              <w:insideH w:val="single" w:sz="6" w:space="0" w:color="C9D5E3"/>
+              <w:insideV w:val="single" w:sz="6" w:space="0" w:color="C9D5E3"/>
+            </w:tcBorders>
+            <w:vAlign w:val="center"/>
+            <w:tcMar>
+              <w:top w:w="80" w:type="dxa"/>
+              <w:bottom w:w="80" w:type="dxa"/>
+              <w:start w:w="120" w:type="dxa"/>
+              <w:end w:w="120" w:type="dxa"/>
+            </w:tcMar>
+          </w:tcPr>
+          <w:p>
+            <w:pPr>
+              <w:spacing w:before="0" w:after="0" w:line="276" w:lineRule="auto"/>
+              <w:jc w:val="left"/>
+            </w:pPr>
+            <w:r>
+              <w:rPr>
+                <w:rFonts w:ascii="Arial Unicode MS" w:hAnsi="Arial Unicode MS" w:eastAsia="Arial Unicode MS" w:cs="Arial Unicode MS"/>
+                <w:b w:val="0"/>
+                <w:color w:val="202830"/>
+                <w:sz w:val="19"/>
+              </w:rPr>
+              <w:t>关键条款、收付款信息、版本和附件放在一起</w:t>
+            </w:r>
+          </w:p>
+        </w:tc>
+        <w:tc>
+          <w:tcPr>
+            <w:tcW w:type="dxa" w:w="3270"/>
+            <w:tcBorders>
+              <w:top w:val="single" w:sz="6" w:space="0" w:color="C9D5E3"/>
+              <w:left w:val="single" w:sz="6" w:space="0" w:color="C9D5E3"/>
+              <w:bottom w:val="single" w:sz="6" w:space="0" w:color="C9D5E3"/>
+              <w:right w:val="single" w:sz="6" w:space="0" w:color="C9D5E3"/>
+              <w:insideH w:val="single" w:sz="6" w:space="0" w:color="C9D5E3"/>
+              <w:insideV w:val="single" w:sz="6" w:space="0" w:color="C9D5E3"/>
+            </w:tcBorders>
+            <w:vAlign w:val="center"/>
+            <w:tcMar>
+              <w:top w:w="80" w:type="dxa"/>
+              <w:bottom w:w="80" w:type="dxa"/>
+              <w:start w:w="120" w:type="dxa"/>
+              <w:end w:w="120" w:type="dxa"/>
+            </w:tcMar>
+          </w:tcPr>
+          <w:p>
+            <w:pPr>
+              <w:spacing w:before="0" w:after="0" w:line="276" w:lineRule="auto"/>
+              <w:jc w:val="left"/>
+            </w:pPr>
+            <w:r>
+              <w:rPr>
+                <w:rFonts w:ascii="Arial Unicode MS" w:hAnsi="Arial Unicode MS" w:eastAsia="Arial Unicode MS" w:cs="Arial Unicode MS"/>
+                <w:b w:val="0"/>
+                <w:color w:val="202830"/>
+                <w:sz w:val="19"/>
+              </w:rPr>
+              <w:t>履约、到期和欠款随时可查</w:t>
+            </w:r>
+          </w:p>
+        </w:tc>
+      </w:tr>
+      <w:tr>
+        <w:trPr>
+          <w:cantSplit/>
+        </w:trPr>
+        <w:tc>
+          <w:tcPr>
+            <w:tcW w:type="dxa" w:w="2500"/>
+            <w:tcBorders>
+              <w:top w:val="single" w:sz="6" w:space="0" w:color="C9D5E3"/>
+              <w:left w:val="single" w:sz="6" w:space="0" w:color="C9D5E3"/>
+              <w:bottom w:val="single" w:sz="6" w:space="0" w:color="C9D5E3"/>
+              <w:right w:val="single" w:sz="6" w:space="0" w:color="C9D5E3"/>
+              <w:insideH w:val="single" w:sz="6" w:space="0" w:color="C9D5E3"/>
+              <w:insideV w:val="single" w:sz="6" w:space="0" w:color="C9D5E3"/>
+            </w:tcBorders>
+            <w:vAlign w:val="center"/>
+            <w:tcMar>
+              <w:top w:w="80" w:type="dxa"/>
+              <w:bottom w:w="80" w:type="dxa"/>
+              <w:start w:w="120" w:type="dxa"/>
+              <w:end w:w="120" w:type="dxa"/>
+            </w:tcMar>
+          </w:tcPr>
+          <w:p>
+            <w:pPr>
+              <w:spacing w:before="0" w:after="0" w:line="276" w:lineRule="auto"/>
+              <w:jc w:val="left"/>
+            </w:pPr>
+            <w:r>
+              <w:rPr>
+                <w:rFonts w:ascii="Arial Unicode MS" w:hAnsi="Arial Unicode MS" w:eastAsia="Arial Unicode MS" w:cs="Arial Unicode MS"/>
+                <w:b w:val="0"/>
+                <w:color w:val="202830"/>
+                <w:sz w:val="19"/>
+              </w:rPr>
               <w:t>订单靠 Excel 或聊天转发</w:t>
             </w:r>
           </w:p>
@@ -1214,7 +1376,7 @@
                 <w:color w:val="202830"/>
                 <w:sz w:val="19"/>
               </w:rPr>
-              <w:t>订单自动流向采购、仓库、生产和财务</w:t>
+              <w:t>合同生效后自动派生订单、采购需求、收款计划和交付节点</w:t>
             </w:r>
           </w:p>
         </w:tc>
@@ -1289,116 +1451,6 @@
                 <w:color w:val="202830"/>
                 <w:sz w:val="19"/>
               </w:rPr>
-              <w:t>合同、回款和附件分散</w:t>
-            </w:r>
-          </w:p>
-        </w:tc>
-        <w:tc>
-          <w:tcPr>
-            <w:tcW w:type="dxa" w:w="3590"/>
-            <w:tcBorders>
-              <w:top w:val="single" w:sz="6" w:space="0" w:color="C9D5E3"/>
-              <w:left w:val="single" w:sz="6" w:space="0" w:color="C9D5E3"/>
-              <w:bottom w:val="single" w:sz="6" w:space="0" w:color="C9D5E3"/>
-              <w:right w:val="single" w:sz="6" w:space="0" w:color="C9D5E3"/>
-              <w:insideH w:val="single" w:sz="6" w:space="0" w:color="C9D5E3"/>
-              <w:insideV w:val="single" w:sz="6" w:space="0" w:color="C9D5E3"/>
-            </w:tcBorders>
-            <w:vAlign w:val="center"/>
-            <w:tcMar>
-              <w:top w:w="80" w:type="dxa"/>
-              <w:bottom w:w="80" w:type="dxa"/>
-              <w:start w:w="120" w:type="dxa"/>
-              <w:end w:w="120" w:type="dxa"/>
-            </w:tcMar>
-          </w:tcPr>
-          <w:p>
-            <w:pPr>
-              <w:spacing w:before="0" w:after="0" w:line="276" w:lineRule="auto"/>
-              <w:jc w:val="left"/>
-            </w:pPr>
-            <w:r>
-              <w:rPr>
-                <w:rFonts w:ascii="Arial Unicode MS" w:hAnsi="Arial Unicode MS" w:eastAsia="Arial Unicode MS" w:cs="Arial Unicode MS"/>
-                <w:b w:val="0"/>
-                <w:color w:val="202830"/>
-                <w:sz w:val="19"/>
-              </w:rPr>
-              <w:t>关键条款、收款计划、版本和附件放在一起</w:t>
-            </w:r>
-          </w:p>
-        </w:tc>
-        <w:tc>
-          <w:tcPr>
-            <w:tcW w:type="dxa" w:w="3270"/>
-            <w:tcBorders>
-              <w:top w:val="single" w:sz="6" w:space="0" w:color="C9D5E3"/>
-              <w:left w:val="single" w:sz="6" w:space="0" w:color="C9D5E3"/>
-              <w:bottom w:val="single" w:sz="6" w:space="0" w:color="C9D5E3"/>
-              <w:right w:val="single" w:sz="6" w:space="0" w:color="C9D5E3"/>
-              <w:insideH w:val="single" w:sz="6" w:space="0" w:color="C9D5E3"/>
-              <w:insideV w:val="single" w:sz="6" w:space="0" w:color="C9D5E3"/>
-            </w:tcBorders>
-            <w:vAlign w:val="center"/>
-            <w:tcMar>
-              <w:top w:w="80" w:type="dxa"/>
-              <w:bottom w:w="80" w:type="dxa"/>
-              <w:start w:w="120" w:type="dxa"/>
-              <w:end w:w="120" w:type="dxa"/>
-            </w:tcMar>
-          </w:tcPr>
-          <w:p>
-            <w:pPr>
-              <w:spacing w:before="0" w:after="0" w:line="276" w:lineRule="auto"/>
-              <w:jc w:val="left"/>
-            </w:pPr>
-            <w:r>
-              <w:rPr>
-                <w:rFonts w:ascii="Arial Unicode MS" w:hAnsi="Arial Unicode MS" w:eastAsia="Arial Unicode MS" w:cs="Arial Unicode MS"/>
-                <w:b w:val="0"/>
-                <w:color w:val="202830"/>
-                <w:sz w:val="19"/>
-              </w:rPr>
-              <w:t>履约、到期和欠款随时可查</w:t>
-            </w:r>
-          </w:p>
-        </w:tc>
-      </w:tr>
-      <w:tr>
-        <w:trPr>
-          <w:cantSplit/>
-        </w:trPr>
-        <w:tc>
-          <w:tcPr>
-            <w:tcW w:type="dxa" w:w="2500"/>
-            <w:tcBorders>
-              <w:top w:val="single" w:sz="6" w:space="0" w:color="C9D5E3"/>
-              <w:left w:val="single" w:sz="6" w:space="0" w:color="C9D5E3"/>
-              <w:bottom w:val="single" w:sz="6" w:space="0" w:color="C9D5E3"/>
-              <w:right w:val="single" w:sz="6" w:space="0" w:color="C9D5E3"/>
-              <w:insideH w:val="single" w:sz="6" w:space="0" w:color="C9D5E3"/>
-              <w:insideV w:val="single" w:sz="6" w:space="0" w:color="C9D5E3"/>
-            </w:tcBorders>
-            <w:vAlign w:val="center"/>
-            <w:tcMar>
-              <w:top w:w="80" w:type="dxa"/>
-              <w:bottom w:w="80" w:type="dxa"/>
-              <w:start w:w="120" w:type="dxa"/>
-              <w:end w:w="120" w:type="dxa"/>
-            </w:tcMar>
-          </w:tcPr>
-          <w:p>
-            <w:pPr>
-              <w:spacing w:before="0" w:after="0" w:line="276" w:lineRule="auto"/>
-              <w:jc w:val="left"/>
-            </w:pPr>
-            <w:r>
-              <w:rPr>
-                <w:rFonts w:ascii="Arial Unicode MS" w:hAnsi="Arial Unicode MS" w:eastAsia="Arial Unicode MS" w:cs="Arial Unicode MS"/>
-                <w:b w:val="0"/>
-                <w:color w:val="202830"/>
-                <w:sz w:val="19"/>
-              </w:rPr>
               <w:t>采购不知道销售何时要货</w:t>
             </w:r>
           </w:p>
@@ -1434,7 +1486,7 @@
                 <w:color w:val="202830"/>
                 <w:sz w:val="19"/>
               </w:rPr>
-              <w:t>系统按订单、库存和交期形成采购建议</w:t>
+              <w:t>采购建议按合同、订单和库存不足自动形成</w:t>
             </w:r>
           </w:p>
         </w:tc>
@@ -1509,7 +1561,7 @@
                 <w:color w:val="202830"/>
                 <w:sz w:val="19"/>
               </w:rPr>
-              <w:t>投诉没有负责人或超期</w:t>
+              <w:t>赊销额度靠人工把关</w:t>
             </w:r>
           </w:p>
         </w:tc>
@@ -1544,7 +1596,227 @@
                 <w:color w:val="202830"/>
                 <w:sz w:val="19"/>
               </w:rPr>
-              <w:t>投诉自动建工单并按服务时限升级</w:t>
+              <w:t>下单时自动校验客户信用额度，超额按配置阻断或转审批</w:t>
+            </w:r>
+          </w:p>
+        </w:tc>
+        <w:tc>
+          <w:tcPr>
+            <w:tcW w:type="dxa" w:w="3270"/>
+            <w:tcBorders>
+              <w:top w:val="single" w:sz="6" w:space="0" w:color="C9D5E3"/>
+              <w:left w:val="single" w:sz="6" w:space="0" w:color="C9D5E3"/>
+              <w:bottom w:val="single" w:sz="6" w:space="0" w:color="C9D5E3"/>
+              <w:right w:val="single" w:sz="6" w:space="0" w:color="C9D5E3"/>
+              <w:insideH w:val="single" w:sz="6" w:space="0" w:color="C9D5E3"/>
+              <w:insideV w:val="single" w:sz="6" w:space="0" w:color="C9D5E3"/>
+            </w:tcBorders>
+            <w:vAlign w:val="center"/>
+            <w:tcMar>
+              <w:top w:w="80" w:type="dxa"/>
+              <w:bottom w:w="80" w:type="dxa"/>
+              <w:start w:w="120" w:type="dxa"/>
+              <w:end w:w="120" w:type="dxa"/>
+            </w:tcMar>
+          </w:tcPr>
+          <w:p>
+            <w:pPr>
+              <w:spacing w:before="0" w:after="0" w:line="276" w:lineRule="auto"/>
+              <w:jc w:val="left"/>
+            </w:pPr>
+            <w:r>
+              <w:rPr>
+                <w:rFonts w:ascii="Arial Unicode MS" w:hAnsi="Arial Unicode MS" w:eastAsia="Arial Unicode MS" w:cs="Arial Unicode MS"/>
+                <w:b w:val="0"/>
+                <w:color w:val="202830"/>
+                <w:sz w:val="19"/>
+              </w:rPr>
+              <w:t>减少超额赊销带来的呆账</w:t>
+            </w:r>
+          </w:p>
+        </w:tc>
+      </w:tr>
+      <w:tr>
+        <w:trPr>
+          <w:cantSplit/>
+        </w:trPr>
+        <w:tc>
+          <w:tcPr>
+            <w:tcW w:type="dxa" w:w="2500"/>
+            <w:tcBorders>
+              <w:top w:val="single" w:sz="6" w:space="0" w:color="C9D5E3"/>
+              <w:left w:val="single" w:sz="6" w:space="0" w:color="C9D5E3"/>
+              <w:bottom w:val="single" w:sz="6" w:space="0" w:color="C9D5E3"/>
+              <w:right w:val="single" w:sz="6" w:space="0" w:color="C9D5E3"/>
+              <w:insideH w:val="single" w:sz="6" w:space="0" w:color="C9D5E3"/>
+              <w:insideV w:val="single" w:sz="6" w:space="0" w:color="C9D5E3"/>
+            </w:tcBorders>
+            <w:vAlign w:val="center"/>
+            <w:tcMar>
+              <w:top w:w="80" w:type="dxa"/>
+              <w:bottom w:w="80" w:type="dxa"/>
+              <w:start w:w="120" w:type="dxa"/>
+              <w:end w:w="120" w:type="dxa"/>
+            </w:tcMar>
+          </w:tcPr>
+          <w:p>
+            <w:pPr>
+              <w:spacing w:before="0" w:after="0" w:line="276" w:lineRule="auto"/>
+              <w:jc w:val="left"/>
+            </w:pPr>
+            <w:r>
+              <w:rPr>
+                <w:rFonts w:ascii="Arial Unicode MS" w:hAnsi="Arial Unicode MS" w:eastAsia="Arial Unicode MS" w:cs="Arial Unicode MS"/>
+                <w:b w:val="0"/>
+                <w:color w:val="202830"/>
+                <w:sz w:val="19"/>
+              </w:rPr>
+              <w:t>发票和收款对不上</w:t>
+            </w:r>
+          </w:p>
+        </w:tc>
+        <w:tc>
+          <w:tcPr>
+            <w:tcW w:type="dxa" w:w="3590"/>
+            <w:tcBorders>
+              <w:top w:val="single" w:sz="6" w:space="0" w:color="C9D5E3"/>
+              <w:left w:val="single" w:sz="6" w:space="0" w:color="C9D5E3"/>
+              <w:bottom w:val="single" w:sz="6" w:space="0" w:color="C9D5E3"/>
+              <w:right w:val="single" w:sz="6" w:space="0" w:color="C9D5E3"/>
+              <w:insideH w:val="single" w:sz="6" w:space="0" w:color="C9D5E3"/>
+              <w:insideV w:val="single" w:sz="6" w:space="0" w:color="C9D5E3"/>
+            </w:tcBorders>
+            <w:vAlign w:val="center"/>
+            <w:tcMar>
+              <w:top w:w="80" w:type="dxa"/>
+              <w:bottom w:w="80" w:type="dxa"/>
+              <w:start w:w="120" w:type="dxa"/>
+              <w:end w:w="120" w:type="dxa"/>
+            </w:tcMar>
+          </w:tcPr>
+          <w:p>
+            <w:pPr>
+              <w:spacing w:before="0" w:after="0" w:line="276" w:lineRule="auto"/>
+              <w:jc w:val="left"/>
+            </w:pPr>
+            <w:r>
+              <w:rPr>
+                <w:rFonts w:ascii="Arial Unicode MS" w:hAnsi="Arial Unicode MS" w:eastAsia="Arial Unicode MS" w:cs="Arial Unicode MS"/>
+                <w:b w:val="0"/>
+                <w:color w:val="202830"/>
+                <w:sz w:val="19"/>
+              </w:rPr>
+              <w:t>发票申请、开具登记、收款计划与到款核销逐笔勾稽</w:t>
+            </w:r>
+          </w:p>
+        </w:tc>
+        <w:tc>
+          <w:tcPr>
+            <w:tcW w:type="dxa" w:w="3270"/>
+            <w:tcBorders>
+              <w:top w:val="single" w:sz="6" w:space="0" w:color="C9D5E3"/>
+              <w:left w:val="single" w:sz="6" w:space="0" w:color="C9D5E3"/>
+              <w:bottom w:val="single" w:sz="6" w:space="0" w:color="C9D5E3"/>
+              <w:right w:val="single" w:sz="6" w:space="0" w:color="C9D5E3"/>
+              <w:insideH w:val="single" w:sz="6" w:space="0" w:color="C9D5E3"/>
+              <w:insideV w:val="single" w:sz="6" w:space="0" w:color="C9D5E3"/>
+            </w:tcBorders>
+            <w:vAlign w:val="center"/>
+            <w:tcMar>
+              <w:top w:w="80" w:type="dxa"/>
+              <w:bottom w:w="80" w:type="dxa"/>
+              <w:start w:w="120" w:type="dxa"/>
+              <w:end w:w="120" w:type="dxa"/>
+            </w:tcMar>
+          </w:tcPr>
+          <w:p>
+            <w:pPr>
+              <w:spacing w:before="0" w:after="0" w:line="276" w:lineRule="auto"/>
+              <w:jc w:val="left"/>
+            </w:pPr>
+            <w:r>
+              <w:rPr>
+                <w:rFonts w:ascii="Arial Unicode MS" w:hAnsi="Arial Unicode MS" w:eastAsia="Arial Unicode MS" w:cs="Arial Unicode MS"/>
+                <w:b w:val="0"/>
+                <w:color w:val="202830"/>
+                <w:sz w:val="19"/>
+              </w:rPr>
+              <w:t>应收余额和账龄一目了然</w:t>
+            </w:r>
+          </w:p>
+        </w:tc>
+      </w:tr>
+      <w:tr>
+        <w:trPr>
+          <w:cantSplit/>
+        </w:trPr>
+        <w:tc>
+          <w:tcPr>
+            <w:tcW w:type="dxa" w:w="2500"/>
+            <w:tcBorders>
+              <w:top w:val="single" w:sz="6" w:space="0" w:color="C9D5E3"/>
+              <w:left w:val="single" w:sz="6" w:space="0" w:color="C9D5E3"/>
+              <w:bottom w:val="single" w:sz="6" w:space="0" w:color="C9D5E3"/>
+              <w:right w:val="single" w:sz="6" w:space="0" w:color="C9D5E3"/>
+              <w:insideH w:val="single" w:sz="6" w:space="0" w:color="C9D5E3"/>
+              <w:insideV w:val="single" w:sz="6" w:space="0" w:color="C9D5E3"/>
+            </w:tcBorders>
+            <w:vAlign w:val="center"/>
+            <w:tcMar>
+              <w:top w:w="80" w:type="dxa"/>
+              <w:bottom w:w="80" w:type="dxa"/>
+              <w:start w:w="120" w:type="dxa"/>
+              <w:end w:w="120" w:type="dxa"/>
+            </w:tcMar>
+          </w:tcPr>
+          <w:p>
+            <w:pPr>
+              <w:spacing w:before="0" w:after="0" w:line="276" w:lineRule="auto"/>
+              <w:jc w:val="left"/>
+            </w:pPr>
+            <w:r>
+              <w:rPr>
+                <w:rFonts w:ascii="Arial Unicode MS" w:hAnsi="Arial Unicode MS" w:eastAsia="Arial Unicode MS" w:cs="Arial Unicode MS"/>
+                <w:b w:val="0"/>
+                <w:color w:val="202830"/>
+                <w:sz w:val="19"/>
+              </w:rPr>
+              <w:t>售后找不到单据出处</w:t>
+            </w:r>
+          </w:p>
+        </w:tc>
+        <w:tc>
+          <w:tcPr>
+            <w:tcW w:type="dxa" w:w="3590"/>
+            <w:tcBorders>
+              <w:top w:val="single" w:sz="6" w:space="0" w:color="C9D5E3"/>
+              <w:left w:val="single" w:sz="6" w:space="0" w:color="C9D5E3"/>
+              <w:bottom w:val="single" w:sz="6" w:space="0" w:color="C9D5E3"/>
+              <w:right w:val="single" w:sz="6" w:space="0" w:color="C9D5E3"/>
+              <w:insideH w:val="single" w:sz="6" w:space="0" w:color="C9D5E3"/>
+              <w:insideV w:val="single" w:sz="6" w:space="0" w:color="C9D5E3"/>
+            </w:tcBorders>
+            <w:vAlign w:val="center"/>
+            <w:tcMar>
+              <w:top w:w="80" w:type="dxa"/>
+              <w:bottom w:w="80" w:type="dxa"/>
+              <w:start w:w="120" w:type="dxa"/>
+              <w:end w:w="120" w:type="dxa"/>
+            </w:tcMar>
+          </w:tcPr>
+          <w:p>
+            <w:pPr>
+              <w:spacing w:before="0" w:after="0" w:line="276" w:lineRule="auto"/>
+              <w:jc w:val="left"/>
+            </w:pPr>
+            <w:r>
+              <w:rPr>
+                <w:rFonts w:ascii="Arial Unicode MS" w:hAnsi="Arial Unicode MS" w:eastAsia="Arial Unicode MS" w:cs="Arial Unicode MS"/>
+                <w:b w:val="0"/>
+                <w:color w:val="202830"/>
+                <w:sz w:val="19"/>
+              </w:rPr>
+              <w:t>工单关联原订单、合同、产品、批次、设备和保修</w:t>
             </w:r>
           </w:p>
         </w:tc>
@@ -1654,7 +1926,7 @@
                 <w:color w:val="202830"/>
                 <w:sz w:val="19"/>
               </w:rPr>
-              <w:t>业务数据持续汇总到统一报表；常用报表的性能指标以合同约定的基线环境与验收清单为准</w:t>
+              <w:t>收入、成本、交付和利润由业务单据持续汇总；常用报表的性能指标以合同约定的基线环境与验收清单为准</w:t>
             </w:r>
           </w:p>
         </w:tc>
@@ -1737,7 +2009,7 @@
           <w:color w:val="202830"/>
           <w:sz w:val="22"/>
         </w:rPr>
-        <w:t>统一管理客户、联系人、线索、商机、跟进、报价、销售目标和预测。</w:t>
+        <w:t>统一管理客户档案、联系人和客户 360 视图，销售建单时自动带出客户、产品和价目资料。</w:t>
       </w:r>
     </w:p>
     <w:p>
@@ -1754,7 +2026,7 @@
           <w:color w:val="202830"/>
           <w:sz w:val="22"/>
         </w:rPr>
-        <w:t>销售可查看客户的历史报价、订单、合同、回款、投诉、设备和服务记录。</w:t>
+        <w:t>销售可查看客户的历史合同、回款、投诉、设备和服务记录。</w:t>
       </w:r>
     </w:p>
     <w:p>
@@ -1771,7 +2043,24 @@
           <w:color w:val="202830"/>
           <w:sz w:val="22"/>
         </w:rPr>
-        <w:t>支持渠道、经销商、线索报备、返利和佣金，也可让客户通过门户自助查询。</w:t>
+        <w:t>维护产品价目，录入合同和下单时校验价格权限，折扣随合同审批链审批。</w:t>
+      </w:r>
+    </w:p>
+    <w:p>
+      <w:pPr>
+        <w:numPr>
+          <w:ilvl w:val="0"/>
+          <w:numId w:val="10"/>
+        </w:numPr>
+        <w:spacing w:after="80" w:line="300" w:lineRule="auto"/>
+      </w:pPr>
+      <w:r>
+        <w:rPr>
+          <w:rFonts w:ascii="Arial Unicode MS" w:hAnsi="Arial Unicode MS" w:eastAsia="Arial Unicode MS" w:cs="Arial Unicode MS"/>
+          <w:color w:val="202830"/>
+          <w:sz w:val="22"/>
+        </w:rPr>
+        <w:t>首版不含线索、商机、漏斗、市场活动、销售预测和渠道佣金。</w:t>
       </w:r>
     </w:p>
     <w:p>
@@ -1813,7 +2102,7 @@
           <w:color w:val="202830"/>
           <w:sz w:val="22"/>
         </w:rPr>
-        <w:t>支持模板、版本、批注、审批、签章、印章、履约、续签和到期提醒。</w:t>
+        <w:t>支持模板、版本、批注、审批、签章、印章、履约、续签和到期提醒，合同也可以合并。</w:t>
       </w:r>
     </w:p>
     <w:p>
@@ -1831,6 +2120,40 @@
           <w:sz w:val="22"/>
         </w:rPr>
         <w:t>合同审批后，可自动生成订单、采购需求、项目任务、收款计划和交付节点。</w:t>
+      </w:r>
+    </w:p>
+    <w:p>
+      <w:pPr>
+        <w:numPr>
+          <w:ilvl w:val="0"/>
+          <w:numId w:val="10"/>
+        </w:numPr>
+        <w:spacing w:after="80" w:line="300" w:lineRule="auto"/>
+      </w:pPr>
+      <w:r>
+        <w:rPr>
+          <w:rFonts w:ascii="Arial Unicode MS" w:hAnsi="Arial Unicode MS" w:eastAsia="Arial Unicode MS" w:cs="Arial Unicode MS"/>
+          <w:color w:val="202830"/>
+          <w:sz w:val="22"/>
+        </w:rPr>
+        <w:t>合同变更按新版本重新派生或调整已派生的单据，派生单据与合同双向可追溯。</w:t>
+      </w:r>
+    </w:p>
+    <w:p>
+      <w:pPr>
+        <w:numPr>
+          <w:ilvl w:val="0"/>
+          <w:numId w:val="10"/>
+        </w:numPr>
+        <w:spacing w:after="80" w:line="300" w:lineRule="auto"/>
+      </w:pPr>
+      <w:r>
+        <w:rPr>
+          <w:rFonts w:ascii="Arial Unicode MS" w:hAnsi="Arial Unicode MS" w:eastAsia="Arial Unicode MS" w:cs="Arial Unicode MS"/>
+          <w:color w:val="202830"/>
+          <w:sz w:val="22"/>
+        </w:rPr>
+        <w:t>合同生效属高风险操作，须重新确认身份，审批链不能越权跳过。</w:t>
       </w:r>
     </w:p>
     <w:p>
@@ -1855,7 +2178,7 @@
           <w:color w:val="202830"/>
           <w:sz w:val="22"/>
         </w:rPr>
-        <w:t>销售下单后，系统自动检查价格权限、合同、库存和交期。</w:t>
+        <w:t>销售下单后，系统自动检查价格权限、合同、库存可用量、交期和客户信用额度。</w:t>
       </w:r>
     </w:p>
     <w:p>
@@ -1872,7 +2195,24 @@
           <w:color w:val="202830"/>
           <w:sz w:val="22"/>
         </w:rPr>
-        <w:t>支持订单变更、分批交付、退货、换货、直运、寄售、订阅和租赁。</w:t>
+        <w:t>客户信用额度由应收未收金额与在途订单金额推算，超出可用额度时按配置阻断或转审批。</w:t>
+      </w:r>
+    </w:p>
+    <w:p>
+      <w:pPr>
+        <w:numPr>
+          <w:ilvl w:val="0"/>
+          <w:numId w:val="10"/>
+        </w:numPr>
+        <w:spacing w:after="80" w:line="300" w:lineRule="auto"/>
+      </w:pPr>
+      <w:r>
+        <w:rPr>
+          <w:rFonts w:ascii="Arial Unicode MS" w:hAnsi="Arial Unicode MS" w:eastAsia="Arial Unicode MS" w:cs="Arial Unicode MS"/>
+          <w:color w:val="202830"/>
+          <w:sz w:val="22"/>
+        </w:rPr>
+        <w:t>支持订单变更、分批交付、退货、换货、直运和寄售；订阅与租赁作为订单类型登记周期和租期。</w:t>
       </w:r>
     </w:p>
     <w:p>
@@ -1914,7 +2254,7 @@
           <w:color w:val="202830"/>
           <w:sz w:val="22"/>
         </w:rPr>
-        <w:t>订单、生产、项目或库存不足都可以自动形成采购建议。</w:t>
+        <w:t>合同、销售订单、项目任务或库存不足都可以自动形成采购建议。</w:t>
       </w:r>
     </w:p>
     <w:p>
@@ -1931,7 +2271,7 @@
           <w:color w:val="202830"/>
           <w:sz w:val="22"/>
         </w:rPr>
-        <w:t>覆盖申请、询价、比价、招标、合同、订单、收货、退货、发票和付款。</w:t>
+        <w:t>采购查看审批生效的合同，按合同下达采购订单并可分批订货，覆盖收货、退货、采购发票和付款申请。</w:t>
       </w:r>
     </w:p>
     <w:p>
@@ -1948,7 +2288,41 @@
           <w:color w:val="202830"/>
           <w:sz w:val="22"/>
         </w:rPr>
-        <w:t>记录供应商资质、价格、交期、质量和风险；供应商也可通过门户协同。</w:t>
+        <w:t>记录供应商准入与资质，以及价格、交期、质量和风险信息。</w:t>
+      </w:r>
+    </w:p>
+    <w:p>
+      <w:pPr>
+        <w:numPr>
+          <w:ilvl w:val="0"/>
+          <w:numId w:val="10"/>
+        </w:numPr>
+        <w:spacing w:after="80" w:line="300" w:lineRule="auto"/>
+      </w:pPr>
+      <w:r>
+        <w:rPr>
+          <w:rFonts w:ascii="Arial Unicode MS" w:hAnsi="Arial Unicode MS" w:eastAsia="Arial Unicode MS" w:cs="Arial Unicode MS"/>
+          <w:color w:val="202830"/>
+          <w:sz w:val="22"/>
+        </w:rPr>
+        <w:t>供应商可通过门户确认采购订单与交期、提交送货通知、上传发票、查询收付款对账并维护自身档案。</w:t>
+      </w:r>
+    </w:p>
+    <w:p>
+      <w:pPr>
+        <w:numPr>
+          <w:ilvl w:val="0"/>
+          <w:numId w:val="10"/>
+        </w:numPr>
+        <w:spacing w:after="80" w:line="300" w:lineRule="auto"/>
+      </w:pPr>
+      <w:r>
+        <w:rPr>
+          <w:rFonts w:ascii="Arial Unicode MS" w:hAnsi="Arial Unicode MS" w:eastAsia="Arial Unicode MS" w:cs="Arial Unicode MS"/>
+          <w:color w:val="202830"/>
+          <w:sz w:val="22"/>
+        </w:rPr>
+        <w:t>首版不含询比价、招投标、VMI 和供应商绩效评分模型。</w:t>
       </w:r>
     </w:p>
     <w:p>
@@ -1978,7 +2352,7 @@
           <w:color w:val="2E74B5"/>
           <w:sz w:val="26"/>
         </w:rPr>
-        <w:t>库存、仓库与交付</w:t>
+        <w:t>库存与存货计价</w:t>
       </w:r>
     </w:p>
     <w:p>
@@ -1988,7 +2362,7 @@
           <w:color w:val="202830"/>
           <w:sz w:val="22"/>
         </w:rPr>
-        <w:t>管理多仓库、多库位、批次、序列号、保质期、条码、二维码和 RFID。</w:t>
+        <w:t>管理仓库与库存台账、收发存记录、可用量查询，以及批次与序列号标识。</w:t>
       </w:r>
     </w:p>
     <w:p>
@@ -2005,7 +2379,7 @@
           <w:color w:val="202830"/>
           <w:sz w:val="22"/>
         </w:rPr>
-        <w:t>覆盖收货、质检、上架、预留、拣货、复核、包装、出库、调拨和盘点。</w:t>
+        <w:t>收货、出库和退货按物料、批次和序列号登记，可用量直接支撑下单校验和交期判断。</w:t>
       </w:r>
     </w:p>
     <w:p>
@@ -2022,32 +2396,7 @@
           <w:color w:val="202830"/>
           <w:sz w:val="22"/>
         </w:rPr>
-        <w:t>发生质量问题时，可追踪受影响的批次、订单、客户、设备和售后记录。</w:t>
-      </w:r>
-    </w:p>
-    <w:p>
-      <w:pPr>
-        <w:pStyle w:val="Heading2"/>
-        <w:pageBreakBefore w:val="0"/>
-      </w:pPr>
-      <w:r>
-        <w:rPr>
-          <w:rFonts w:ascii="Arial Unicode MS" w:hAnsi="Arial Unicode MS" w:eastAsia="Arial Unicode MS" w:cs="Arial Unicode MS"/>
-          <w:b/>
-          <w:color w:val="2E74B5"/>
-          <w:sz w:val="26"/>
-        </w:rPr>
-        <w:t>财务、税务与资金</w:t>
-      </w:r>
-    </w:p>
-    <w:p>
-      <w:r>
-        <w:rPr>
-          <w:rFonts w:ascii="Arial Unicode MS" w:hAnsi="Arial Unicode MS" w:eastAsia="Arial Unicode MS" w:cs="Arial Unicode MS"/>
-          <w:color w:val="202830"/>
-          <w:sz w:val="22"/>
-        </w:rPr>
-        <w:t>业务单据按规则形成财务处理建议，减少财务人员重复录入。</w:t>
+        <w:t>存货计价采用移动加权平均一种方法：入库按采购不含税单价计价，出库按加权平均单价结转金额，数量账与金额账同步更新。</w:t>
       </w:r>
     </w:p>
     <w:p>
@@ -2064,7 +2413,7 @@
           <w:color w:val="202830"/>
           <w:sz w:val="22"/>
         </w:rPr>
-        <w:t>覆盖总账、应收、应付、费用、资产、成本、预算、合并、税务和电子会计档案。</w:t>
+        <w:t>提供按仓库和物料的库存金额查询与期末库存价值表；退货按当时的加权平均单价回冲，不重算历史成本。</w:t>
       </w:r>
     </w:p>
     <w:p>
@@ -2081,7 +2430,32 @@
           <w:color w:val="202830"/>
           <w:sz w:val="22"/>
         </w:rPr>
-        <w:t>支持中国大陆人民币业务、数电发票、银行对账和受控付款审批。</w:t>
+        <w:t>首版不含库位、质检、预留、拣货、波次、调拨和盘点，也不含先进先出、标准成本和采购费用分摊。</w:t>
+      </w:r>
+    </w:p>
+    <w:p>
+      <w:pPr>
+        <w:pStyle w:val="Heading2"/>
+        <w:pageBreakBefore w:val="0"/>
+      </w:pPr>
+      <w:r>
+        <w:rPr>
+          <w:rFonts w:ascii="Arial Unicode MS" w:hAnsi="Arial Unicode MS" w:eastAsia="Arial Unicode MS" w:cs="Arial Unicode MS"/>
+          <w:b/>
+          <w:color w:val="2E74B5"/>
+          <w:sz w:val="26"/>
+        </w:rPr>
+        <w:t>财务：应收应付、开票与总账</w:t>
+      </w:r>
+    </w:p>
+    <w:p>
+      <w:r>
+        <w:rPr>
+          <w:rFonts w:ascii="Arial Unicode MS" w:hAnsi="Arial Unicode MS" w:eastAsia="Arial Unicode MS" w:cs="Arial Unicode MS"/>
+          <w:color w:val="202830"/>
+          <w:sz w:val="22"/>
+        </w:rPr>
+        <w:t>业务单据按固定规则生成财务记录，减少重复录入；开票与收付款在系统内登记，不依赖外部账套。</w:t>
       </w:r>
     </w:p>
     <w:p>
@@ -2098,32 +2472,7 @@
           <w:color w:val="202830"/>
           <w:sz w:val="22"/>
         </w:rPr>
-        <w:t>首版面向中国大陆业务，不含多币种、外汇、进出口、报关和信用证。</w:t>
-      </w:r>
-    </w:p>
-    <w:p>
-      <w:pPr>
-        <w:pStyle w:val="Heading2"/>
-        <w:pageBreakBefore w:val="0"/>
-      </w:pPr>
-      <w:r>
-        <w:rPr>
-          <w:rFonts w:ascii="Arial Unicode MS" w:hAnsi="Arial Unicode MS" w:eastAsia="Arial Unicode MS" w:cs="Arial Unicode MS"/>
-          <w:b/>
-          <w:color w:val="2E74B5"/>
-          <w:sz w:val="26"/>
-        </w:rPr>
-        <w:t>投诉、工单与售后</w:t>
-      </w:r>
-    </w:p>
-    <w:p>
-      <w:r>
-        <w:rPr>
-          <w:rFonts w:ascii="Arial Unicode MS" w:hAnsi="Arial Unicode MS" w:eastAsia="Arial Unicode MS" w:cs="Arial Unicode MS"/>
-          <w:color w:val="202830"/>
-          <w:sz w:val="22"/>
-        </w:rPr>
-        <w:t>投诉进入系统后自动形成工单，关联客户、订单、合同、产品、批次和保修。</w:t>
+        <w:t>应收台账按客户、合同、订单和发票记录应收明细、收款计划、到款核销和账龄；应付台账按供应商、采购订单和采购发票记录应付明细、付款申请、付款核销和账龄。</w:t>
       </w:r>
     </w:p>
     <w:p>
@@ -2140,7 +2489,7 @@
           <w:color w:val="202830"/>
           <w:sz w:val="22"/>
         </w:rPr>
-        <w:t>工单可按规则辅助分派给责任人，并按服务时限自动提醒和升级。</w:t>
+        <w:t>发票申请、审批、开具登记与合同收款计划的勾稽在系统内连成一条链路；开票有误时可在系统内登记作废或红字冲销。</w:t>
       </w:r>
     </w:p>
     <w:p>
@@ -2157,7 +2506,7 @@
           <w:color w:val="202830"/>
           <w:sz w:val="22"/>
         </w:rPr>
-        <w:t>现场人员可用手机签到、扫码、拍照、换件和客户签字，断网时也能完成现场作业。</w:t>
+        <w:t>到款和付款按订单与发票登记，支持分次收付款，一笔款项可核销多张发票或订单；银行与现金账户档案和资金流水由人工登记。</w:t>
       </w:r>
     </w:p>
     <w:p>
@@ -2174,32 +2523,7 @@
           <w:color w:val="202830"/>
           <w:sz w:val="22"/>
         </w:rPr>
-        <w:t>离线只用于现场作业和记录；合同生效、付款、开票、财务过账、结账和敏感数据导出不得离线完成，必须联网并经人工审批与中心确认。</w:t>
-      </w:r>
-    </w:p>
-    <w:p>
-      <w:pPr>
-        <w:pStyle w:val="Heading2"/>
-        <w:pageBreakBefore w:val="0"/>
-      </w:pPr>
-      <w:r>
-        <w:rPr>
-          <w:rFonts w:ascii="Arial Unicode MS" w:hAnsi="Arial Unicode MS" w:eastAsia="Arial Unicode MS" w:cs="Arial Unicode MS"/>
-          <w:b/>
-          <w:color w:val="2E74B5"/>
-          <w:sz w:val="26"/>
-        </w:rPr>
-        <w:t>生产、项目与质量</w:t>
-      </w:r>
-    </w:p>
-    <w:p>
-      <w:r>
-        <w:rPr>
-          <w:rFonts w:ascii="Arial Unicode MS" w:hAnsi="Arial Unicode MS" w:eastAsia="Arial Unicode MS" w:cs="Arial Unicode MS"/>
-          <w:color w:val="202830"/>
-          <w:sz w:val="22"/>
-        </w:rPr>
-        <w:t>需要时可安装制造、项目、研发、质量和设备管理模块。</w:t>
+        <w:t>简易总账提供会计科目表、凭证生成、科目余额表、总账与明细账查询、试算平衡、月度期间开闭和年度损益结转；已过账凭证只能以红字冲销或更正凭证追加更正。</w:t>
       </w:r>
     </w:p>
     <w:p>
@@ -2216,7 +2540,7 @@
           <w:color w:val="202830"/>
           <w:sz w:val="22"/>
         </w:rPr>
-        <w:t>支持离散制造、流程制造、项目型制造，以及 MRP、排产、MES 和委外。</w:t>
+        <w:t>成本来源只有两类：交付确认时按加权平均结转的销货成本，以及直接关联合同、订单或项目的采购发票与外购服务费用；可按合同、订单、客户和项目查询成本并得出毛利。</w:t>
       </w:r>
     </w:p>
     <w:p>
@@ -2233,7 +2557,227 @@
           <w:color w:val="202830"/>
           <w:sz w:val="22"/>
         </w:rPr>
-        <w:t>支持项目预算和利润、图纸与版本、来料/过程/成品质量、实验室和召回。</w:t>
+        <w:t>收入确认只有一种口径：交付确认时确认收入并同步结转销货成本，开票时形成应收和销项税额。</w:t>
+      </w:r>
+    </w:p>
+    <w:p>
+      <w:pPr>
+        <w:numPr>
+          <w:ilvl w:val="0"/>
+          <w:numId w:val="10"/>
+        </w:numPr>
+        <w:spacing w:after="80" w:line="300" w:lineRule="auto"/>
+      </w:pPr>
+      <w:r>
+        <w:rPr>
+          <w:rFonts w:ascii="Arial Unicode MS" w:hAnsi="Arial Unicode MS" w:eastAsia="Arial Unicode MS" w:cs="Arial Unicode MS"/>
+          <w:color w:val="202830"/>
+          <w:sz w:val="22"/>
+        </w:rPr>
+        <w:t>首版为人民币单一账簿，发票开具指按实际开票结果在系统内登记；不含固定资产、预算、费用报销、管理会计、合并报表、多币种、外汇、进出口、信用证、银企直连、自动对账和税务平台直连。</w:t>
+      </w:r>
+    </w:p>
+    <w:p>
+      <w:pPr>
+        <w:pStyle w:val="Heading2"/>
+        <w:pageBreakBefore w:val="0"/>
+      </w:pPr>
+      <w:r>
+        <w:rPr>
+          <w:rFonts w:ascii="Arial Unicode MS" w:hAnsi="Arial Unicode MS" w:eastAsia="Arial Unicode MS" w:cs="Arial Unicode MS"/>
+          <w:b/>
+          <w:color w:val="2E74B5"/>
+          <w:sz w:val="26"/>
+        </w:rPr>
+        <w:t>售后工单与设备台账</w:t>
+      </w:r>
+    </w:p>
+    <w:p>
+      <w:r>
+        <w:rPr>
+          <w:rFonts w:ascii="Arial Unicode MS" w:hAnsi="Arial Unicode MS" w:eastAsia="Arial Unicode MS" w:cs="Arial Unicode MS"/>
+          <w:color w:val="202830"/>
+          <w:sz w:val="22"/>
+        </w:rPr>
+        <w:t>售后技术支持记录形成工单，关联原订单、合同、产品、批次、设备和保修。</w:t>
+      </w:r>
+    </w:p>
+    <w:p>
+      <w:pPr>
+        <w:numPr>
+          <w:ilvl w:val="0"/>
+          <w:numId w:val="10"/>
+        </w:numPr>
+        <w:spacing w:after="80" w:line="300" w:lineRule="auto"/>
+      </w:pPr>
+      <w:r>
+        <w:rPr>
+          <w:rFonts w:ascii="Arial Unicode MS" w:hAnsi="Arial Unicode MS" w:eastAsia="Arial Unicode MS" w:cs="Arial Unicode MS"/>
+          <w:color w:val="202830"/>
+          <w:sz w:val="22"/>
+        </w:rPr>
+        <w:t>设备台账记录设备编号或序列号、型号、所属客户、关联产品与批次、交付与安装日期和当前状态。</w:t>
+      </w:r>
+    </w:p>
+    <w:p>
+      <w:pPr>
+        <w:numPr>
+          <w:ilvl w:val="0"/>
+          <w:numId w:val="10"/>
+        </w:numPr>
+        <w:spacing w:after="80" w:line="300" w:lineRule="auto"/>
+      </w:pPr>
+      <w:r>
+        <w:rPr>
+          <w:rFonts w:ascii="Arial Unicode MS" w:hAnsi="Arial Unicode MS" w:eastAsia="Arial Unicode MS" w:cs="Arial Unicode MS"/>
+          <w:color w:val="202830"/>
+          <w:sz w:val="22"/>
+        </w:rPr>
+        <w:t>保修记录起止日期、保修范围和条款文本，建工单时自动读取在保状态。</w:t>
+      </w:r>
+    </w:p>
+    <w:p>
+      <w:pPr>
+        <w:numPr>
+          <w:ilvl w:val="0"/>
+          <w:numId w:val="10"/>
+        </w:numPr>
+        <w:spacing w:after="80" w:line="300" w:lineRule="auto"/>
+      </w:pPr>
+      <w:r>
+        <w:rPr>
+          <w:rFonts w:ascii="Arial Unicode MS" w:hAnsi="Arial Unicode MS" w:eastAsia="Arial Unicode MS" w:cs="Arial Unicode MS"/>
+          <w:color w:val="202830"/>
+          <w:sz w:val="22"/>
+        </w:rPr>
+        <w:t>客户投诉与工单进入客户 360 视图，退换修登记与订单的退货、换货打通。</w:t>
+      </w:r>
+    </w:p>
+    <w:p>
+      <w:pPr>
+        <w:numPr>
+          <w:ilvl w:val="0"/>
+          <w:numId w:val="10"/>
+        </w:numPr>
+        <w:spacing w:after="80" w:line="300" w:lineRule="auto"/>
+      </w:pPr>
+      <w:r>
+        <w:rPr>
+          <w:rFonts w:ascii="Arial Unicode MS" w:hAnsi="Arial Unicode MS" w:eastAsia="Arial Unicode MS" w:cs="Arial Unicode MS"/>
+          <w:color w:val="202830"/>
+          <w:sz w:val="22"/>
+        </w:rPr>
+        <w:t>工单按流程设定的时限自动提醒和升级；首版不含现场派工调度、服务权益计费和售后知识库。</w:t>
+      </w:r>
+    </w:p>
+    <w:p>
+      <w:pPr>
+        <w:pStyle w:val="Heading2"/>
+        <w:pageBreakBefore w:val="0"/>
+      </w:pPr>
+      <w:r>
+        <w:rPr>
+          <w:rFonts w:ascii="Arial Unicode MS" w:hAnsi="Arial Unicode MS" w:eastAsia="Arial Unicode MS" w:cs="Arial Unicode MS"/>
+          <w:b/>
+          <w:color w:val="2E74B5"/>
+          <w:sz w:val="26"/>
+        </w:rPr>
+        <w:t>报表与经营看板</w:t>
+      </w:r>
+    </w:p>
+    <w:p>
+      <w:r>
+        <w:rPr>
+          <w:rFonts w:ascii="Arial Unicode MS" w:hAnsi="Arial Unicode MS" w:eastAsia="Arial Unicode MS" w:cs="Arial Unicode MS"/>
+          <w:color w:val="202830"/>
+          <w:sz w:val="22"/>
+        </w:rPr>
+        <w:t>报表和看板的数据直接来自业务单据，管理层不必等月底手工汇总。</w:t>
+      </w:r>
+    </w:p>
+    <w:p>
+      <w:pPr>
+        <w:numPr>
+          <w:ilvl w:val="0"/>
+          <w:numId w:val="10"/>
+        </w:numPr>
+        <w:spacing w:after="80" w:line="300" w:lineRule="auto"/>
+      </w:pPr>
+      <w:r>
+        <w:rPr>
+          <w:rFonts w:ascii="Arial Unicode MS" w:hAnsi="Arial Unicode MS" w:eastAsia="Arial Unicode MS" w:cs="Arial Unicode MS"/>
+          <w:color w:val="202830"/>
+          <w:sz w:val="22"/>
+        </w:rPr>
+        <w:t>预置收入、成本、利润、交付四类指标和一个默认管理驾驶舱，并配套应收账龄、应付账龄两张基础表。</w:t>
+      </w:r>
+    </w:p>
+    <w:p>
+      <w:pPr>
+        <w:numPr>
+          <w:ilvl w:val="0"/>
+          <w:numId w:val="10"/>
+        </w:numPr>
+        <w:spacing w:after="80" w:line="300" w:lineRule="auto"/>
+      </w:pPr>
+      <w:r>
+        <w:rPr>
+          <w:rFonts w:ascii="Arial Unicode MS" w:hAnsi="Arial Unicode MS" w:eastAsia="Arial Unicode MS" w:cs="Arial Unicode MS"/>
+          <w:color w:val="202830"/>
+          <w:sz w:val="22"/>
+        </w:rPr>
+        <w:t>四类指标可按期间、客户、产品和合同下钻；交付看合同交付节点与订单分批交付的按期完成率和逾期清单。</w:t>
+      </w:r>
+    </w:p>
+    <w:p>
+      <w:pPr>
+        <w:numPr>
+          <w:ilvl w:val="0"/>
+          <w:numId w:val="10"/>
+        </w:numPr>
+        <w:spacing w:after="80" w:line="300" w:lineRule="auto"/>
+      </w:pPr>
+      <w:r>
+        <w:rPr>
+          <w:rFonts w:ascii="Arial Unicode MS" w:hAnsi="Arial Unicode MS" w:eastAsia="Arial Unicode MS" w:cs="Arial Unicode MS"/>
+          <w:color w:val="202830"/>
+          <w:sz w:val="22"/>
+        </w:rPr>
+        <w:t>报表设计器支持拖拽设计、筛选、分组、汇总和像素级打印模板，企业可以建立自己的指标。</w:t>
+      </w:r>
+    </w:p>
+    <w:p>
+      <w:pPr>
+        <w:numPr>
+          <w:ilvl w:val="0"/>
+          <w:numId w:val="10"/>
+        </w:numPr>
+        <w:spacing w:after="80" w:line="300" w:lineRule="auto"/>
+      </w:pPr>
+      <w:r>
+        <w:rPr>
+          <w:rFonts w:ascii="Arial Unicode MS" w:hAnsi="Arial Unicode MS" w:eastAsia="Arial Unicode MS" w:cs="Arial Unicode MS"/>
+          <w:color w:val="202830"/>
+          <w:sz w:val="22"/>
+        </w:rPr>
+        <w:t>报表和看板的结果继承法人、记录和字段级权限，无权查看的数据不会出现在结果中。</w:t>
+      </w:r>
+    </w:p>
+    <w:p>
+      <w:pPr>
+        <w:numPr>
+          <w:ilvl w:val="0"/>
+          <w:numId w:val="10"/>
+        </w:numPr>
+        <w:spacing w:after="80" w:line="300" w:lineRule="auto"/>
+      </w:pPr>
+      <w:r>
+        <w:rPr>
+          <w:rFonts w:ascii="Arial Unicode MS" w:hAnsi="Arial Unicode MS" w:eastAsia="Arial Unicode MS" w:cs="Arial Unicode MS"/>
+          <w:color w:val="202830"/>
+          <w:sz w:val="22"/>
+        </w:rPr>
+        <w:t>首版不含内嵌电子表格、报表订阅与定时分发，以及外部 BI 平台的语义层对接。</w:t>
       </w:r>
     </w:p>
     <w:p>
@@ -2248,7 +2792,7 @@
           <w:color w:val="2E74B5"/>
           <w:sz w:val="32"/>
         </w:rPr>
-        <w:t>4. 按需增加的企业功能</w:t>
+        <w:t>4. 首版模块安装范围与后续版本</w:t>
       </w:r>
     </w:p>
     <w:p>
@@ -2258,7 +2802,22 @@
           <w:color w:val="202830"/>
           <w:sz w:val="22"/>
         </w:rPr>
-        <w:t>平台不会把所有企业强行做成同一种管理方式。功能可以按模块安装，也可以连接企业已有系统。停用模块时，历史数据仍按规则安全保留。</w:t>
+        <w:t>首版按模块交付。首版范围内的模块都可以按许可证安装、启用、停用、再启用和升级；停用只关闭该模块的界面入口、写入接口、定时任务和对外事件，历史数据继续保留，授权范围内仍可查询和审计检索。</w:t>
+      </w:r>
+    </w:p>
+    <w:p>
+      <w:pPr>
+        <w:pStyle w:val="Heading2"/>
+        <w:pageBreakBefore w:val="0"/>
+      </w:pPr>
+      <w:r>
+        <w:rPr>
+          <w:rFonts w:ascii="Arial Unicode MS" w:hAnsi="Arial Unicode MS" w:eastAsia="Arial Unicode MS" w:cs="Arial Unicode MS"/>
+          <w:b/>
+          <w:color w:val="2E74B5"/>
+          <w:sz w:val="26"/>
+        </w:rPr>
+        <w:t>首版可以安装的能力</w:t>
       </w:r>
     </w:p>
     <w:p>
@@ -2276,7 +2835,7 @@
           <w:color w:val="202830"/>
           <w:sz w:val="21"/>
         </w:rPr>
-        <w:t>制造与现场：</w:t>
+        <w:t>核心业务：</w:t>
       </w:r>
       <w:r>
         <w:rPr>
@@ -2284,7 +2843,7 @@
           <w:color w:val="202830"/>
           <w:sz w:val="21"/>
         </w:rPr>
-        <w:t>MRP/APS、MES、PLM、QMS、LIMS、设备维护、物联网、数字孪生和追溯召回。</w:t>
+        <w:t>主数据、客户档案与客户 360、合同、销售订单与客户信用额度校验、采购与供应商、库存台账与存货计价、成本归集、项目任务与交付节点、售后工单与设备台账。</w:t>
       </w:r>
     </w:p>
     <w:p>
@@ -2302,7 +2861,7 @@
           <w:color w:val="202830"/>
           <w:sz w:val="21"/>
         </w:rPr>
-        <w:t>企业运营：</w:t>
+        <w:t>财务：</w:t>
       </w:r>
       <w:r>
         <w:rPr>
@@ -2310,7 +2869,7 @@
           <w:color w:val="202830"/>
           <w:sz w:val="21"/>
         </w:rPr>
-        <w:t>人力资源、项目组合、物流运输、EHS、GRC、IT 服务、法务、费用差旅、ESG 与碳管理。</w:t>
+        <w:t>应收与应付台账、发票申请与开具登记、到款与付款登记、简易总账与期间结账。</w:t>
       </w:r>
     </w:p>
     <w:p>
@@ -2328,7 +2887,7 @@
           <w:color w:val="202830"/>
           <w:sz w:val="21"/>
         </w:rPr>
-        <w:t>商业增长：</w:t>
+        <w:t>报表与经营看板：</w:t>
       </w:r>
       <w:r>
         <w:rPr>
@@ -2336,7 +2895,7 @@
           <w:color w:val="202830"/>
           <w:sz w:val="21"/>
         </w:rPr>
-        <w:t>CPQ、订阅、租赁、渠道佣金、电商、POS、市场平台、PIM/DAM、CMS 和 GIS。</w:t>
+        <w:t>报表设计器、仪表盘、企业自定义指标、打印模板，以及收入、成本、交付、利润的预置指标与默认管理驾驶舱。</w:t>
       </w:r>
     </w:p>
     <w:p>
@@ -2354,7 +2913,7 @@
           <w:color w:val="202830"/>
           <w:sz w:val="21"/>
         </w:rPr>
-        <w:t>门户与协作：</w:t>
+        <w:t>供应商门户：</w:t>
       </w:r>
       <w:r>
         <w:rPr>
@@ -2362,7 +2921,7 @@
           <w:color w:val="202830"/>
           <w:sz w:val="21"/>
         </w:rPr>
-        <w:t>客户、供应商、渠道、员工门户，以及知识、文档、日历、任务、通知和联络中心。</w:t>
+        <w:t>供应商查看与确认采购订单和交期、提交送货通知、上传发票、查询收付款对账、维护自身资质与价格交期档案。</w:t>
       </w:r>
     </w:p>
     <w:p>
@@ -2380,7 +2939,7 @@
           <w:color w:val="202830"/>
           <w:sz w:val="21"/>
         </w:rPr>
-        <w:t>分析与计划：</w:t>
+        <w:t>电子签章连接器：</w:t>
       </w:r>
       <w:r>
         <w:rPr>
@@ -2388,7 +2947,266 @@
           <w:color w:val="202830"/>
           <w:sz w:val="21"/>
         </w:rPr>
-        <w:t>经营驾驶舱、BI、预算预测、产销协同、流程挖掘、知识图谱、优化和情景模拟。</w:t>
+        <w:t>合同审批通过后发起签署，回传签署结果与带签章的合同文件，用印留痕并归入合同附件与审计。</w:t>
+      </w:r>
+    </w:p>
+    <w:p>
+      <w:pPr>
+        <w:numPr>
+          <w:ilvl w:val="0"/>
+          <w:numId w:val="10"/>
+        </w:numPr>
+        <w:spacing w:after="40" w:line="276" w:lineRule="auto"/>
+      </w:pPr>
+      <w:r>
+        <w:rPr>
+          <w:rFonts w:ascii="Arial Unicode MS" w:hAnsi="Arial Unicode MS" w:eastAsia="Arial Unicode MS" w:cs="Arial Unicode MS"/>
+          <w:b/>
+          <w:color w:val="202830"/>
+          <w:sz w:val="21"/>
+        </w:rPr>
+        <w:t>其他：</w:t>
+      </w:r>
+      <w:r>
+        <w:rPr>
+          <w:rFonts w:ascii="Arial Unicode MS" w:hAnsi="Arial Unicode MS" w:eastAsia="Arial Unicode MS" w:cs="Arial Unicode MS"/>
+          <w:color w:val="202830"/>
+          <w:sz w:val="21"/>
+        </w:rPr>
+        <w:t>全文检索，以及订阅与租赁两种订单类型。</w:t>
+      </w:r>
+    </w:p>
+    <w:p>
+      <w:pPr>
+        <w:pStyle w:val="Heading2"/>
+        <w:pageBreakBefore w:val="0"/>
+      </w:pPr>
+      <w:r>
+        <w:rPr>
+          <w:rFonts w:ascii="Arial Unicode MS" w:hAnsi="Arial Unicode MS" w:eastAsia="Arial Unicode MS" w:cs="Arial Unicode MS"/>
+          <w:b/>
+          <w:color w:val="2E74B5"/>
+          <w:sz w:val="26"/>
+        </w:rPr>
+        <w:t>属于后续版本的能力</w:t>
+      </w:r>
+    </w:p>
+    <w:p>
+      <w:r>
+        <w:rPr>
+          <w:rFonts w:ascii="Arial Unicode MS" w:hAnsi="Arial Unicode MS" w:eastAsia="Arial Unicode MS" w:cs="Arial Unicode MS"/>
+          <w:color w:val="202830"/>
+          <w:sz w:val="22"/>
+        </w:rPr>
+        <w:t>以下能力首版不交付，也不提供安装入口。它们已按原名称逐条登记，后续版本可以按登记恢复；恢复需要重新确定范围，不能在首版通过低代码配置、插件或连接器变相实现。</w:t>
+      </w:r>
+    </w:p>
+    <w:p>
+      <w:pPr>
+        <w:numPr>
+          <w:ilvl w:val="0"/>
+          <w:numId w:val="10"/>
+        </w:numPr>
+        <w:spacing w:after="40" w:line="276" w:lineRule="auto"/>
+      </w:pPr>
+      <w:r>
+        <w:rPr>
+          <w:rFonts w:ascii="Arial Unicode MS" w:hAnsi="Arial Unicode MS" w:eastAsia="Arial Unicode MS" w:cs="Arial Unicode MS"/>
+          <w:b/>
+          <w:color w:val="202830"/>
+          <w:sz w:val="21"/>
+        </w:rPr>
+        <w:t>制造与生产：</w:t>
+      </w:r>
+      <w:r>
+        <w:rPr>
+          <w:rFonts w:ascii="Arial Unicode MS" w:hAnsi="Arial Unicode MS" w:eastAsia="Arial Unicode MS" w:cs="Arial Unicode MS"/>
+          <w:color w:val="202830"/>
+          <w:sz w:val="21"/>
+        </w:rPr>
+        <w:t>MRP、APS、MES、PLM、QMS、LIMS，以及设备点检、维修工单、备件和预测维护。</w:t>
+      </w:r>
+    </w:p>
+    <w:p>
+      <w:pPr>
+        <w:numPr>
+          <w:ilvl w:val="0"/>
+          <w:numId w:val="10"/>
+        </w:numPr>
+        <w:spacing w:after="40" w:line="276" w:lineRule="auto"/>
+      </w:pPr>
+      <w:r>
+        <w:rPr>
+          <w:rFonts w:ascii="Arial Unicode MS" w:hAnsi="Arial Unicode MS" w:eastAsia="Arial Unicode MS" w:cs="Arial Unicode MS"/>
+          <w:b/>
+          <w:color w:val="202830"/>
+          <w:sz w:val="21"/>
+        </w:rPr>
+        <w:t>企业运营与治理：</w:t>
+      </w:r>
+      <w:r>
+        <w:rPr>
+          <w:rFonts w:ascii="Arial Unicode MS" w:hAnsi="Arial Unicode MS" w:eastAsia="Arial Unicode MS" w:cs="Arial Unicode MS"/>
+          <w:color w:val="202830"/>
+          <w:sz w:val="21"/>
+        </w:rPr>
+        <w:t>人力资源、运输管理、EHS、GRC、IT 服务、法务、商旅费控、文档与知识库、内容管理、统一消息中心、联络中心和 GIS。</w:t>
+      </w:r>
+    </w:p>
+    <w:p>
+      <w:pPr>
+        <w:numPr>
+          <w:ilvl w:val="0"/>
+          <w:numId w:val="10"/>
+        </w:numPr>
+        <w:spacing w:after="40" w:line="276" w:lineRule="auto"/>
+      </w:pPr>
+      <w:r>
+        <w:rPr>
+          <w:rFonts w:ascii="Arial Unicode MS" w:hAnsi="Arial Unicode MS" w:eastAsia="Arial Unicode MS" w:cs="Arial Unicode MS"/>
+          <w:b/>
+          <w:color w:val="202830"/>
+          <w:sz w:val="21"/>
+        </w:rPr>
+        <w:t>商业与渠道：</w:t>
+      </w:r>
+      <w:r>
+        <w:rPr>
+          <w:rFonts w:ascii="Arial Unicode MS" w:hAnsi="Arial Unicode MS" w:eastAsia="Arial Unicode MS" w:cs="Arial Unicode MS"/>
+          <w:color w:val="202830"/>
+          <w:sz w:val="21"/>
+        </w:rPr>
+        <w:t>电商、POS、会员、渠道佣金与返利，以及按量计费、独立账单和催收。</w:t>
+      </w:r>
+    </w:p>
+    <w:p>
+      <w:pPr>
+        <w:numPr>
+          <w:ilvl w:val="0"/>
+          <w:numId w:val="10"/>
+        </w:numPr>
+        <w:spacing w:after="40" w:line="276" w:lineRule="auto"/>
+      </w:pPr>
+      <w:r>
+        <w:rPr>
+          <w:rFonts w:ascii="Arial Unicode MS" w:hAnsi="Arial Unicode MS" w:eastAsia="Arial Unicode MS" w:cs="Arial Unicode MS"/>
+          <w:b/>
+          <w:color w:val="202830"/>
+          <w:sz w:val="21"/>
+        </w:rPr>
+        <w:t>门户：</w:t>
+      </w:r>
+      <w:r>
+        <w:rPr>
+          <w:rFonts w:ascii="Arial Unicode MS" w:hAnsi="Arial Unicode MS" w:eastAsia="Arial Unicode MS" w:cs="Arial Unicode MS"/>
+          <w:color w:val="202830"/>
+          <w:sz w:val="21"/>
+        </w:rPr>
+        <w:t>客户门户、经销商门户和员工门户；首版对外门户只有供应商门户。</w:t>
+      </w:r>
+    </w:p>
+    <w:p>
+      <w:pPr>
+        <w:numPr>
+          <w:ilvl w:val="0"/>
+          <w:numId w:val="10"/>
+        </w:numPr>
+        <w:spacing w:after="40" w:line="276" w:lineRule="auto"/>
+      </w:pPr>
+      <w:r>
+        <w:rPr>
+          <w:rFonts w:ascii="Arial Unicode MS" w:hAnsi="Arial Unicode MS" w:eastAsia="Arial Unicode MS" w:cs="Arial Unicode MS"/>
+          <w:b/>
+          <w:color w:val="202830"/>
+          <w:sz w:val="21"/>
+        </w:rPr>
+        <w:t>智能与检索：</w:t>
+      </w:r>
+      <w:r>
+        <w:rPr>
+          <w:rFonts w:ascii="Arial Unicode MS" w:hAnsi="Arial Unicode MS" w:eastAsia="Arial Unicode MS" w:cs="Arial Unicode MS"/>
+          <w:color w:val="202830"/>
+          <w:sz w:val="21"/>
+        </w:rPr>
+        <w:t>本地 AI、OCR、MCP、向量检索、知识图谱、流程挖掘、预测和仿真；首版检索能力只有全文检索。</w:t>
+      </w:r>
+    </w:p>
+    <w:p>
+      <w:pPr>
+        <w:numPr>
+          <w:ilvl w:val="0"/>
+          <w:numId w:val="10"/>
+        </w:numPr>
+        <w:spacing w:after="40" w:line="276" w:lineRule="auto"/>
+      </w:pPr>
+      <w:r>
+        <w:rPr>
+          <w:rFonts w:ascii="Arial Unicode MS" w:hAnsi="Arial Unicode MS" w:eastAsia="Arial Unicode MS" w:cs="Arial Unicode MS"/>
+          <w:b/>
+          <w:color w:val="202830"/>
+          <w:sz w:val="21"/>
+        </w:rPr>
+        <w:t>现场与设备联网：</w:t>
+      </w:r>
+      <w:r>
+        <w:rPr>
+          <w:rFonts w:ascii="Arial Unicode MS" w:hAnsi="Arial Unicode MS" w:eastAsia="Arial Unicode MS" w:cs="Arial Unicode MS"/>
+          <w:color w:val="202830"/>
+          <w:sz w:val="21"/>
+        </w:rPr>
+        <w:t>边缘节点、断网独立运行、工业协议接入、物联网和数字孪生。</w:t>
+      </w:r>
+    </w:p>
+    <w:p>
+      <w:pPr>
+        <w:numPr>
+          <w:ilvl w:val="0"/>
+          <w:numId w:val="10"/>
+        </w:numPr>
+        <w:spacing w:after="40" w:line="276" w:lineRule="auto"/>
+      </w:pPr>
+      <w:r>
+        <w:rPr>
+          <w:rFonts w:ascii="Arial Unicode MS" w:hAnsi="Arial Unicode MS" w:eastAsia="Arial Unicode MS" w:cs="Arial Unicode MS"/>
+          <w:b/>
+          <w:color w:val="202830"/>
+          <w:sz w:val="21"/>
+        </w:rPr>
+        <w:t>外部资金与税务：</w:t>
+      </w:r>
+      <w:r>
+        <w:rPr>
+          <w:rFonts w:ascii="Arial Unicode MS" w:hAnsi="Arial Unicode MS" w:eastAsia="Arial Unicode MS" w:cs="Arial Unicode MS"/>
+          <w:color w:val="202830"/>
+          <w:sz w:val="21"/>
+        </w:rPr>
+        <w:t>银企直连、自动对账、第三方支付渠道，以及数电发票平台与税控设备对接。</w:t>
+      </w:r>
+    </w:p>
+    <w:p>
+      <w:pPr>
+        <w:numPr>
+          <w:ilvl w:val="0"/>
+          <w:numId w:val="10"/>
+        </w:numPr>
+        <w:spacing w:after="40" w:line="276" w:lineRule="auto"/>
+      </w:pPr>
+      <w:r>
+        <w:rPr>
+          <w:rFonts w:ascii="Arial Unicode MS" w:hAnsi="Arial Unicode MS" w:eastAsia="Arial Unicode MS" w:cs="Arial Unicode MS"/>
+          <w:b/>
+          <w:color w:val="202830"/>
+          <w:sz w:val="21"/>
+        </w:rPr>
+        <w:t>更深的业务能力：</w:t>
+      </w:r>
+      <w:r>
+        <w:rPr>
+          <w:rFonts w:ascii="Arial Unicode MS" w:hAnsi="Arial Unicode MS" w:eastAsia="Arial Unicode MS" w:cs="Arial Unicode MS"/>
+          <w:color w:val="202830"/>
+          <w:sz w:val="21"/>
+        </w:rPr>
+        <w:t>完整仓库作业（波次、拣货、盘点、质检、预留、调拨）、完整财务与管理会计（多账簿、固定资产、预算、费用报销、合并报表、资金管理）、完整成本管理，以及线索、商机、销售预测、询比价和招投标。</w:t>
       </w:r>
     </w:p>
     <w:p>
@@ -2411,7 +3229,7 @@
           <w:color w:val="2E74B5"/>
           <w:sz w:val="21"/>
         </w:rPr>
-        <w:t xml:space="preserve">自由组合  </w:t>
+        <w:t xml:space="preserve">范围提醒  </w:t>
       </w:r>
       <w:r>
         <w:rPr>
@@ -2420,7 +3238,7 @@
           <w:color w:val="0B2545"/>
           <w:sz w:val="23"/>
         </w:rPr>
-        <w:t>每个业务领域都可以选择：使用系统内置模块，或连接现有专业软件；同一份数据只指定一个主系统，避免互相覆盖。</w:t>
+        <w:t>首版交付以合同为中心的销售、采购、财务与工单闭环；上面列为后续版本的能力不在首版交付范围内。</w:t>
       </w:r>
     </w:p>
     <w:p>
@@ -2617,7 +3435,7 @@
           <w:color w:val="202830"/>
           <w:sz w:val="21"/>
         </w:rPr>
-        <w:t>通过签名模块或受控插件增加特殊能力；配置先验证审批，出现问题可回退。</w:t>
+        <w:t>通过签名模块或受控插件，在首版已交付的能力范围内增加特殊能力；配置先验证审批，出现问题可回退。插件默认没有网络、文件、密钥和业务数据权限，需要哪些能力必须先声明，经审批后按最小权限授予。</w:t>
       </w:r>
     </w:p>
     <w:p>
@@ -2632,7 +3450,7 @@
           <w:color w:val="2E74B5"/>
           <w:sz w:val="32"/>
         </w:rPr>
-        <w:t>5. Excel、文档、AI 与外部连接</w:t>
+        <w:t>5. Excel、文档与外部连接</w:t>
       </w:r>
     </w:p>
     <w:p>
@@ -2647,7 +3465,7 @@
           <w:color w:val="2E74B5"/>
           <w:sz w:val="26"/>
         </w:rPr>
-        <w:t>Excel 与 WPS</w:t>
+        <w:t>Excel 与批量数据</w:t>
       </w:r>
     </w:p>
     <w:p>
@@ -2664,7 +3482,7 @@
           <w:color w:val="202830"/>
           <w:sz w:val="22"/>
         </w:rPr>
-        <w:t>电脑端 Office 或 WPS 宿主支持批量导入、导出、在线查询、受控提交、公式、条件格式和数据透视表；移动端按平台能力清单提供查看或原生表单替代。</w:t>
+        <w:t>首版提供 Excel 导入与导出，用于批量建档、批量录入和把查询结果带出系统，四端能力一致。</w:t>
       </w:r>
     </w:p>
     <w:p>
@@ -2681,7 +3499,7 @@
           <w:color w:val="202830"/>
           <w:sz w:val="22"/>
         </w:rPr>
-        <w:t>常用分析可以继续在熟悉的表格方式中完成，再发布为正式报表。</w:t>
+        <w:t>为了安全，不执行 VBA、任意宏或第三方 Excel 加载项。</w:t>
       </w:r>
     </w:p>
     <w:p>
@@ -2698,7 +3516,7 @@
           <w:color w:val="202830"/>
           <w:sz w:val="22"/>
         </w:rPr>
-        <w:t>为了安全，不执行 VBA、任意宏或未经批准的第三方加载项。</w:t>
+        <w:t>首版不提供 Excel 或 WPS 加载项，也不提供在表格中实时查询与提交、复杂公式、数据透视和条件格式。</w:t>
       </w:r>
     </w:p>
     <w:p>
@@ -2713,7 +3531,7 @@
           <w:color w:val="2E74B5"/>
           <w:sz w:val="26"/>
         </w:rPr>
-        <w:t>合同、附件与电子档案</w:t>
+        <w:t>合同、附件与档案</w:t>
       </w:r>
     </w:p>
     <w:p>
@@ -2730,7 +3548,7 @@
           <w:color w:val="202830"/>
           <w:sz w:val="22"/>
         </w:rPr>
-        <w:t>合同、发票、图片、Word/WPS、PDF、OFD 和常见工程文件统一存档。</w:t>
+        <w:t>合同与单据附件支持模板套用、批注、版本与版本比较；DOCX 提供下载与查看。</w:t>
       </w:r>
     </w:p>
     <w:p>
@@ -2747,7 +3565,7 @@
           <w:color w:val="202830"/>
           <w:sz w:val="22"/>
         </w:rPr>
-        <w:t>电脑端支持模板套用、在线编辑、批注、修订、版本比较、多人协作、电子签名、敏感信息遮盖和长期归档；移动端以查看和批注为主，写入按能力清单转电脑端完成。</w:t>
+        <w:t>PDF 支持查看、下载、批注、电子签章和归档校验；合同、发票、会计凭证和审计证据保存在经认证的不可篡改存储中。</w:t>
       </w:r>
     </w:p>
     <w:p>
@@ -2764,22 +3582,7 @@
           <w:color w:val="202830"/>
           <w:sz w:val="22"/>
         </w:rPr>
-        <w:t>大文件支持分片上传、断点续传、去重、安全扫描和权限控制。</w:t>
-      </w:r>
-    </w:p>
-    <w:p>
-      <w:pPr>
-        <w:pStyle w:val="Heading2"/>
-        <w:pageBreakBefore w:val="0"/>
-      </w:pPr>
-      <w:r>
-        <w:rPr>
-          <w:rFonts w:ascii="Arial Unicode MS" w:hAnsi="Arial Unicode MS" w:eastAsia="Arial Unicode MS" w:cs="Arial Unicode MS"/>
-          <w:b/>
-          <w:color w:val="2E74B5"/>
-          <w:sz w:val="26"/>
-        </w:rPr>
-        <w:t>完全本地的 AI 助手</w:t>
+        <w:t>大文件支持分片上传、断点续传、类型识别、恶意内容检查和权限控制。</w:t>
       </w:r>
     </w:p>
     <w:p>
@@ -2796,7 +3599,7 @@
           <w:color w:val="202830"/>
           <w:sz w:val="22"/>
         </w:rPr>
-        <w:t>可帮助识别合同和发票、整理客户与工单摘要、搜索知识、填写草稿和预测需求。</w:t>
+        <w:t>移动端对模板套用、版本比较和 PDF 签章只提供查看与只读批注，写入操作在电脑端完成。</w:t>
       </w:r>
     </w:p>
     <w:p>
@@ -2813,7 +3616,32 @@
           <w:color w:val="202830"/>
           <w:sz w:val="22"/>
         </w:rPr>
-        <w:t>模型和企业数据在客户控制的环境内运行，不把敏感内容发送给公共 AI。</w:t>
+        <w:t>首版不提供文档在线编辑、修订与多人协作，也不提供 OCR、PDF/OFD 遮盖与格式转换、CAD 预览。</w:t>
+      </w:r>
+    </w:p>
+    <w:p>
+      <w:pPr>
+        <w:pStyle w:val="Heading2"/>
+        <w:pageBreakBefore w:val="0"/>
+      </w:pPr>
+      <w:r>
+        <w:rPr>
+          <w:rFonts w:ascii="Arial Unicode MS" w:hAnsi="Arial Unicode MS" w:eastAsia="Arial Unicode MS" w:cs="Arial Unicode MS"/>
+          <w:b/>
+          <w:color w:val="2E74B5"/>
+          <w:sz w:val="26"/>
+        </w:rPr>
+        <w:t>接口与外部连接</w:t>
+      </w:r>
+    </w:p>
+    <w:p>
+      <w:r>
+        <w:rPr>
+          <w:rFonts w:ascii="Arial Unicode MS" w:hAnsi="Arial Unicode MS" w:eastAsia="Arial Unicode MS" w:cs="Arial Unicode MS"/>
+          <w:color w:val="202830"/>
+          <w:sz w:val="22"/>
+        </w:rPr>
+        <w:t>首版随正式版交付的成品连接器只有电子签章一类：合同审批通过后发起签署，回传签署结果与带签章的合同文件，用印留痕并归入合同附件与审计。实际启用需完成签章机构准入，并按客户逐项联调。</w:t>
       </w:r>
     </w:p>
     <w:p>
@@ -2830,32 +3658,7 @@
           <w:color w:val="202830"/>
           <w:sz w:val="22"/>
         </w:rPr>
-        <w:t>AI 不能绕过权限；合同生效、付款、开票、财务过账、结账和敏感数据导出等高风险操作必须人工确认或审批。</w:t>
-      </w:r>
-    </w:p>
-    <w:p>
-      <w:pPr>
-        <w:pStyle w:val="Heading2"/>
-        <w:pageBreakBefore w:val="0"/>
-      </w:pPr>
-      <w:r>
-        <w:rPr>
-          <w:rFonts w:ascii="Arial Unicode MS" w:hAnsi="Arial Unicode MS" w:eastAsia="Arial Unicode MS" w:cs="Arial Unicode MS"/>
-          <w:b/>
-          <w:color w:val="2E74B5"/>
-          <w:sz w:val="26"/>
-        </w:rPr>
-        <w:t>MCP、接口与现有软件</w:t>
-      </w:r>
-    </w:p>
-    <w:p>
-      <w:r>
-        <w:rPr>
-          <w:rFonts w:ascii="Arial Unicode MS" w:hAnsi="Arial Unicode MS" w:eastAsia="Arial Unicode MS" w:cs="Arial Unicode MS"/>
-          <w:color w:val="202830"/>
-          <w:sz w:val="22"/>
-        </w:rPr>
-        <w:t>可以把 MCP 理解为一套受控的“工具连接标准”：企业 AI 只能在员工原有权限内查询资料、生成草稿或发起流程，每次调用都有身份、范围和审计记录。</w:t>
+        <w:t>银行与税务侧首版不做系统对接：到款、付款与发票开具都在系统内登记，可人工录入或批量导入，闭环不依赖银企直连与税务平台。</w:t>
       </w:r>
     </w:p>
     <w:p>
@@ -2872,7 +3675,7 @@
           <w:color w:val="202830"/>
           <w:sz w:val="22"/>
         </w:rPr>
-        <w:t>可连接银行、税务、电子签名、支付、物流、HR、PLM、MES、物联网、GIS、BI 和文档系统；实际范围取决于对方接口、准入和逐客户联调条件。</w:t>
+        <w:t>平台提供 REST 接口、OpenAPI 说明、批量接口、Webhook、业务事件，以及 CSV、Excel、XML 文件导入导出，供企业按需自行对接。</w:t>
       </w:r>
     </w:p>
     <w:p>
@@ -2889,7 +3692,7 @@
           <w:color w:val="202830"/>
           <w:sz w:val="22"/>
         </w:rPr>
-        <w:t>连接失败时支持重试、告警、待修复队列、重放和对账，不让问题悄悄丢失。</w:t>
+        <w:t>对外调用失败时支持超时、退避重试、熔断、死信队列和人工修复，不让问题悄悄丢失。</w:t>
       </w:r>
     </w:p>
     <w:p>
@@ -2929,7 +3732,111 @@
           <w:color w:val="202830"/>
           <w:sz w:val="22"/>
         </w:rPr>
-        <w:t>四个平台提供按规格定义的等价业务结果，并根据屏幕和使用场景自动调整。电脑适合批量操作、复杂报表、Office/WPS 和配置；手机和平板适合审批、查询、扫码、拍照、签到和现场作业。财务过账与结账、开票与税务写入、报表和仪表盘创作、Office 文档编辑协作、系统配置发布和动态扩展在移动端按清单提供查看、原生表单或不适用的替代路径。</w:t>
+        <w:t>四个平台使用同一套数据、权限和业务规则：同一操作在任一端发起、审批或查询，产生的记录、校验、审计和结果相同；界面按屏幕和使用场景重排，不要求四端外观一致。电脑端适合批量操作、复杂报表和系统配置，手机和平板适合审批、查询、扫码和现场记录。</w:t>
+      </w:r>
+    </w:p>
+    <w:p>
+      <w:pPr>
+        <w:numPr>
+          <w:ilvl w:val="0"/>
+          <w:numId w:val="10"/>
+        </w:numPr>
+        <w:spacing w:after="40" w:line="276" w:lineRule="auto"/>
+      </w:pPr>
+      <w:r>
+        <w:rPr>
+          <w:rFonts w:ascii="Arial Unicode MS" w:hAnsi="Arial Unicode MS" w:eastAsia="Arial Unicode MS" w:cs="Arial Unicode MS"/>
+          <w:b/>
+          <w:color w:val="202830"/>
+          <w:sz w:val="21"/>
+        </w:rPr>
+        <w:t>移动端完整使用：</w:t>
+      </w:r>
+      <w:r>
+        <w:rPr>
+          <w:rFonts w:ascii="Arial Unicode MS" w:hAnsi="Arial Unicode MS" w:eastAsia="Arial Unicode MS" w:cs="Arial Unicode MS"/>
+          <w:color w:val="202830"/>
+          <w:sz w:val="21"/>
+        </w:rPr>
+        <w:t>库存台账与收发扫码、售后工单与设备台账、审批待办与站内通知。</w:t>
+      </w:r>
+    </w:p>
+    <w:p>
+      <w:pPr>
+        <w:numPr>
+          <w:ilvl w:val="0"/>
+          <w:numId w:val="10"/>
+        </w:numPr>
+        <w:spacing w:after="40" w:line="276" w:lineRule="auto"/>
+      </w:pPr>
+      <w:r>
+        <w:rPr>
+          <w:rFonts w:ascii="Arial Unicode MS" w:hAnsi="Arial Unicode MS" w:eastAsia="Arial Unicode MS" w:cs="Arial Unicode MS"/>
+          <w:b/>
+          <w:color w:val="202830"/>
+          <w:sz w:val="21"/>
+        </w:rPr>
+        <w:t>移动端简化使用：</w:t>
+      </w:r>
+      <w:r>
+        <w:rPr>
+          <w:rFonts w:ascii="Arial Unicode MS" w:hAnsi="Arial Unicode MS" w:eastAsia="Arial Unicode MS" w:cs="Arial Unicode MS"/>
+          <w:color w:val="202830"/>
+          <w:sz w:val="21"/>
+        </w:rPr>
+        <w:t>客户档案与客户 360 查询、合同条款与电子签章、销售订单与履约、采购与供应商协同、项目任务与交付节点、主数据维护与审批、全文检索；业务对象、权限和流程结果不变，交互形态与单次批量规模受限。</w:t>
+      </w:r>
+    </w:p>
+    <w:p>
+      <w:pPr>
+        <w:numPr>
+          <w:ilvl w:val="0"/>
+          <w:numId w:val="10"/>
+        </w:numPr>
+        <w:spacing w:after="40" w:line="276" w:lineRule="auto"/>
+      </w:pPr>
+      <w:r>
+        <w:rPr>
+          <w:rFonts w:ascii="Arial Unicode MS" w:hAnsi="Arial Unicode MS" w:eastAsia="Arial Unicode MS" w:cs="Arial Unicode MS"/>
+          <w:b/>
+          <w:color w:val="202830"/>
+          <w:sz w:val="21"/>
+        </w:rPr>
+        <w:t>移动端只提供查看：</w:t>
+      </w:r>
+      <w:r>
+        <w:rPr>
+          <w:rFonts w:ascii="Arial Unicode MS" w:hAnsi="Arial Unicode MS" w:eastAsia="Arial Unicode MS" w:cs="Arial Unicode MS"/>
+          <w:color w:val="202830"/>
+          <w:sz w:val="21"/>
+        </w:rPr>
+        <w:t>财务过账与期末结账、到款与付款登记、发票申请与开具登记、报表与像素级打印、文档与附件协作、系统管理与配置发布；对应的写入操作在电脑端完成。</w:t>
+      </w:r>
+    </w:p>
+    <w:p>
+      <w:pPr>
+        <w:numPr>
+          <w:ilvl w:val="0"/>
+          <w:numId w:val="10"/>
+        </w:numPr>
+        <w:spacing w:after="40" w:line="276" w:lineRule="auto"/>
+      </w:pPr>
+      <w:r>
+        <w:rPr>
+          <w:rFonts w:ascii="Arial Unicode MS" w:hAnsi="Arial Unicode MS" w:eastAsia="Arial Unicode MS" w:cs="Arial Unicode MS"/>
+          <w:b/>
+          <w:color w:val="202830"/>
+          <w:sz w:val="21"/>
+        </w:rPr>
+        <w:t>移动端不承载：</w:t>
+      </w:r>
+      <w:r>
+        <w:rPr>
+          <w:rFonts w:ascii="Arial Unicode MS" w:hAnsi="Arial Unicode MS" w:eastAsia="Arial Unicode MS" w:cs="Arial Unicode MS"/>
+          <w:color w:val="202830"/>
+          <w:sz w:val="21"/>
+        </w:rPr>
+        <w:t>扩展插件与动态下发的扩展代码；移动端的设备能力只有相机扫码，随应用版本发布。</w:t>
       </w:r>
     </w:p>
     <w:p>
@@ -2946,7 +3853,7 @@
           <w:color w:val="202830"/>
           <w:sz w:val="22"/>
         </w:rPr>
-        <w:t>不同设备使用同一套数据、权限和业务规则。</w:t>
+        <w:t>所有业务写入经中心校验后生效。网络中断期间客户端只能保存本地草稿，恢复连接后由中心重新校验并提交，不在本地产生正式业务记录。首版不提供断网独立运行。</w:t>
       </w:r>
     </w:p>
     <w:p>
@@ -2963,41 +3870,7 @@
           <w:color w:val="202830"/>
           <w:sz w:val="22"/>
         </w:rPr>
-        <w:t>仓库、工厂和现场可在受控条件下断网工作，恢复网络后再安全同步。</w:t>
-      </w:r>
-    </w:p>
-    <w:p>
-      <w:pPr>
-        <w:numPr>
-          <w:ilvl w:val="0"/>
-          <w:numId w:val="10"/>
-        </w:numPr>
-        <w:spacing w:after="80" w:line="300" w:lineRule="auto"/>
-      </w:pPr>
-      <w:r>
-        <w:rPr>
-          <w:rFonts w:ascii="Arial Unicode MS" w:hAnsi="Arial Unicode MS" w:eastAsia="Arial Unicode MS" w:cs="Arial Unicode MS"/>
-          <w:color w:val="202830"/>
-          <w:sz w:val="22"/>
-        </w:rPr>
-        <w:t>离线范围限于库存、生产、质检和现场工单；合同生效、付款、开票、财务过账、结账和敏感数据导出不得离线完成，必须联网并经人工审批与中心确认。</w:t>
-      </w:r>
-    </w:p>
-    <w:p>
-      <w:pPr>
-        <w:numPr>
-          <w:ilvl w:val="0"/>
-          <w:numId w:val="10"/>
-        </w:numPr>
-        <w:spacing w:after="80" w:line="300" w:lineRule="auto"/>
-      </w:pPr>
-      <w:r>
-        <w:rPr>
-          <w:rFonts w:ascii="Arial Unicode MS" w:hAnsi="Arial Unicode MS" w:eastAsia="Arial Unicode MS" w:cs="Arial Unicode MS"/>
-          <w:color w:val="202830"/>
-          <w:sz w:val="22"/>
-        </w:rPr>
-        <w:t>边缘节点默认支持 3 天独立运行，可按容量和业务连续性要求延长。</w:t>
+        <w:t>合同生效、付款、开票、财务过账、结账和敏感数据导出属高风险操作，必须重新认证后才能提交并进入审批，审批人不得与发起人为同一人，四端口径一致。</w:t>
       </w:r>
     </w:p>
     <w:p>
@@ -3046,7 +3919,7 @@
           <w:color w:val="202830"/>
           <w:sz w:val="22"/>
         </w:rPr>
-        <w:t>核心交易数据库须从平台认证的清单中选择一种：PostgreSQL、openGauss、达梦、人大金仓或 OceanBase，可自建，也可部署在企业自有云环境中，具体形态与版本以认证清单为准，版本须在认证版本范围内。</w:t>
+        <w:t>首版核心交易数据库只支持 PostgreSQL 16，可自建，也可部署在企业自有云环境中，版本须在认证版本范围内。</w:t>
       </w:r>
     </w:p>
     <w:p>
@@ -3063,7 +3936,7 @@
           <w:color w:val="202830"/>
           <w:sz w:val="22"/>
         </w:rPr>
-        <w:t>同一客户不混用多种核心交易数据库；企业已有的 Oracle、SQL Server、MySQL 可作为外部系统或数据源接入，不作为核心交易数据库。</w:t>
+        <w:t>企业已有的 Oracle、SQL Server、MySQL 可作为外部数据源接入，不作为核心交易数据库。</w:t>
       </w:r>
     </w:p>
     <w:p>
@@ -3097,7 +3970,7 @@
           <w:color w:val="202830"/>
           <w:sz w:val="22"/>
         </w:rPr>
-        <w:t>生产数据、备份、日志、索引和 AI 上下文限定在中国大陆境内。</w:t>
+        <w:t>生产数据、备份、日志和索引限定在中国大陆境内。</w:t>
       </w:r>
     </w:p>
     <w:p>
@@ -3138,7 +4011,7 @@
           <w:color w:val="202830"/>
           <w:sz w:val="22"/>
         </w:rPr>
-        <w:t>可以控制到法人、部门、项目、客户、单条记录和单个字段。</w:t>
+        <w:t>可以控制到法人、部门、岗位、项目、客户、单条记录和单个字段；策略默认拒绝，不设置全能超级管理员。</w:t>
       </w:r>
     </w:p>
     <w:p>
@@ -3164,7 +4037,7 @@
           <w:color w:val="202830"/>
           <w:sz w:val="22"/>
         </w:rPr>
-        <w:t>系统、数据、安全、审计和密钥管理员相互制约。</w:t>
+        <w:t>系统、数据、安全、审计和密钥管理员相互制约；申请人不可自审，审批链不可越权跳过。</w:t>
       </w:r>
     </w:p>
     <w:p>
@@ -3190,7 +4063,7 @@
           <w:color w:val="202830"/>
           <w:sz w:val="22"/>
         </w:rPr>
-        <w:t>传输、数据库、附件、备份和设备缓存均受加密与密钥管理保护。</w:t>
+        <w:t>传输、数据库、附件、备份和设备本地缓存均受加密与密钥管理保护，每个法人使用独立的密钥域。</w:t>
       </w:r>
     </w:p>
     <w:p>
@@ -3208,7 +4081,7 @@
           <w:color w:val="202830"/>
           <w:sz w:val="22"/>
         </w:rPr>
-        <w:t>防止外泄：</w:t>
+        <w:t>控制外泄：</w:t>
       </w:r>
       <w:r>
         <w:rPr>
@@ -3216,7 +4089,7 @@
           <w:color w:val="202830"/>
           <w:sz w:val="22"/>
         </w:rPr>
-        <w:t>敏感内容可脱敏、水印、导出审批和追踪去向；桌面端与合规移动端的打印、复制和下载失效控制按策略强制执行，浏览器门户端受浏览器能力限制，相关控制为尽力而为且不作承诺。</w:t>
+        <w:t>敏感字段按经批准的清单脱敏，并可执行水印、导出审批、打印阻断和剪贴板拦截；浏览器门户端受浏览器能力限制，打印阻断与已下载文件失效为尽力而为，不作承诺。</w:t>
       </w:r>
     </w:p>
     <w:p>
@@ -3242,7 +4115,7 @@
           <w:color w:val="202830"/>
           <w:sz w:val="22"/>
         </w:rPr>
-        <w:t>关键查看、修改、审批、导出和系统调用均留下防篡改证据。</w:t>
+        <w:t>关键查看、修改、审批、导出和系统调用留下防篡改证据，审计记录只追加、可逐条验证。</w:t>
       </w:r>
     </w:p>
     <w:p>
@@ -3268,7 +4141,7 @@
           <w:color w:val="202830"/>
           <w:sz w:val="22"/>
         </w:rPr>
-        <w:t>正式生产采用高可用部署，并配合异地不可变备份和恢复演练。</w:t>
+        <w:t>正式生产采用单区域三故障域高可用部署，并配合境内异地不可变备份和定期恢复演练。</w:t>
       </w:r>
     </w:p>
     <w:p>
@@ -3550,7 +4423,7 @@
                 <w:color w:val="202830"/>
                 <w:sz w:val="20"/>
               </w:rPr>
-              <w:t>客户全景、准确报价、订单进度和回款提醒</w:t>
+              <w:t>客户全景、合同与订单进度、开票与到款状态、信用额度校验</w:t>
             </w:r>
           </w:p>
         </w:tc>
@@ -3625,7 +4498,7 @@
                 <w:color w:val="202830"/>
                 <w:sz w:val="20"/>
               </w:rPr>
-              <w:t>临时催料、需求反复变化、供应商难比较</w:t>
+              <w:t>合同要买什么不清楚、付款进度靠问</w:t>
             </w:r>
           </w:p>
         </w:tc>
@@ -3660,7 +4533,7 @@
                 <w:color w:val="202830"/>
                 <w:sz w:val="20"/>
               </w:rPr>
-              <w:t>自动采购建议、比价、交期和供应商绩效</w:t>
+              <w:t>按合同下达的采购订单与分批订货、供应商档案、付款申请与进度</w:t>
             </w:r>
           </w:p>
         </w:tc>
@@ -3770,117 +4643,7 @@
                 <w:color w:val="202830"/>
                 <w:sz w:val="20"/>
               </w:rPr>
-              <w:t>实时库存、扫码作业、批次追溯和盘点闭环</w:t>
-            </w:r>
-          </w:p>
-        </w:tc>
-      </w:tr>
-      <w:tr>
-        <w:trPr>
-          <w:cantSplit/>
-        </w:trPr>
-        <w:tc>
-          <w:tcPr>
-            <w:tcW w:type="dxa" w:w="1500"/>
-            <w:tcBorders>
-              <w:top w:val="single" w:sz="6" w:space="0" w:color="C9D5E3"/>
-              <w:left w:val="single" w:sz="6" w:space="0" w:color="C9D5E3"/>
-              <w:bottom w:val="single" w:sz="6" w:space="0" w:color="C9D5E3"/>
-              <w:right w:val="single" w:sz="6" w:space="0" w:color="C9D5E3"/>
-              <w:insideH w:val="single" w:sz="6" w:space="0" w:color="C9D5E3"/>
-              <w:insideV w:val="single" w:sz="6" w:space="0" w:color="C9D5E3"/>
-            </w:tcBorders>
-            <w:vAlign w:val="center"/>
-            <w:tcMar>
-              <w:top w:w="80" w:type="dxa"/>
-              <w:bottom w:w="80" w:type="dxa"/>
-              <w:start w:w="120" w:type="dxa"/>
-              <w:end w:w="120" w:type="dxa"/>
-            </w:tcMar>
-          </w:tcPr>
-          <w:p>
-            <w:pPr>
-              <w:spacing w:before="0" w:after="0" w:line="276" w:lineRule="auto"/>
-              <w:jc w:val="left"/>
-            </w:pPr>
-            <w:r>
-              <w:rPr>
-                <w:rFonts w:ascii="Arial Unicode MS" w:hAnsi="Arial Unicode MS" w:eastAsia="Arial Unicode MS" w:cs="Arial Unicode MS"/>
-                <w:b w:val="0"/>
-                <w:color w:val="202830"/>
-                <w:sz w:val="20"/>
-              </w:rPr>
-              <w:t>生产/项目</w:t>
-            </w:r>
-          </w:p>
-        </w:tc>
-        <w:tc>
-          <w:tcPr>
-            <w:tcW w:type="dxa" w:w="3770"/>
-            <w:tcBorders>
-              <w:top w:val="single" w:sz="6" w:space="0" w:color="C9D5E3"/>
-              <w:left w:val="single" w:sz="6" w:space="0" w:color="C9D5E3"/>
-              <w:bottom w:val="single" w:sz="6" w:space="0" w:color="C9D5E3"/>
-              <w:right w:val="single" w:sz="6" w:space="0" w:color="C9D5E3"/>
-              <w:insideH w:val="single" w:sz="6" w:space="0" w:color="C9D5E3"/>
-              <w:insideV w:val="single" w:sz="6" w:space="0" w:color="C9D5E3"/>
-            </w:tcBorders>
-            <w:vAlign w:val="center"/>
-            <w:tcMar>
-              <w:top w:w="80" w:type="dxa"/>
-              <w:bottom w:w="80" w:type="dxa"/>
-              <w:start w:w="120" w:type="dxa"/>
-              <w:end w:w="120" w:type="dxa"/>
-            </w:tcMar>
-          </w:tcPr>
-          <w:p>
-            <w:pPr>
-              <w:spacing w:before="0" w:after="0" w:line="276" w:lineRule="auto"/>
-              <w:jc w:val="left"/>
-            </w:pPr>
-            <w:r>
-              <w:rPr>
-                <w:rFonts w:ascii="Arial Unicode MS" w:hAnsi="Arial Unicode MS" w:eastAsia="Arial Unicode MS" w:cs="Arial Unicode MS"/>
-                <w:b w:val="0"/>
-                <w:color w:val="202830"/>
-                <w:sz w:val="20"/>
-              </w:rPr>
-              <w:t>物料、进度、成本和变更各自分散</w:t>
-            </w:r>
-          </w:p>
-        </w:tc>
-        <w:tc>
-          <w:tcPr>
-            <w:tcW w:type="dxa" w:w="4090"/>
-            <w:tcBorders>
-              <w:top w:val="single" w:sz="6" w:space="0" w:color="C9D5E3"/>
-              <w:left w:val="single" w:sz="6" w:space="0" w:color="C9D5E3"/>
-              <w:bottom w:val="single" w:sz="6" w:space="0" w:color="C9D5E3"/>
-              <w:right w:val="single" w:sz="6" w:space="0" w:color="C9D5E3"/>
-              <w:insideH w:val="single" w:sz="6" w:space="0" w:color="C9D5E3"/>
-              <w:insideV w:val="single" w:sz="6" w:space="0" w:color="C9D5E3"/>
-            </w:tcBorders>
-            <w:vAlign w:val="center"/>
-            <w:tcMar>
-              <w:top w:w="80" w:type="dxa"/>
-              <w:bottom w:w="80" w:type="dxa"/>
-              <w:start w:w="120" w:type="dxa"/>
-              <w:end w:w="120" w:type="dxa"/>
-            </w:tcMar>
-          </w:tcPr>
-          <w:p>
-            <w:pPr>
-              <w:spacing w:before="0" w:after="0" w:line="276" w:lineRule="auto"/>
-              <w:jc w:val="left"/>
-            </w:pPr>
-            <w:r>
-              <w:rPr>
-                <w:rFonts w:ascii="Arial Unicode MS" w:hAnsi="Arial Unicode MS" w:eastAsia="Arial Unicode MS" w:cs="Arial Unicode MS"/>
-                <w:b w:val="0"/>
-                <w:color w:val="202830"/>
-                <w:sz w:val="20"/>
-              </w:rPr>
-              <w:t>统一计划、任务、资源、质量、成本和交付</w:t>
+              <w:t>实时库存台账、扫码收发、批次与序列号追溯</w:t>
             </w:r>
           </w:p>
         </w:tc>
@@ -3955,7 +4718,7 @@
                 <w:color w:val="202830"/>
                 <w:sz w:val="20"/>
               </w:rPr>
-              <w:t>重复录入、业务对不上账、凭证来源不清</w:t>
+              <w:t>重复录入、收付款对不上、凭证来源不清</w:t>
             </w:r>
           </w:p>
         </w:tc>
@@ -3990,7 +4753,7 @@
                 <w:color w:val="202830"/>
                 <w:sz w:val="20"/>
               </w:rPr>
-              <w:t>业财联动、自动对账、受控过账和完整证据</w:t>
+              <w:t>应收应付台账、分次到款付款核销、按业务事件生成的凭证与账簿</w:t>
             </w:r>
           </w:p>
         </w:tc>
@@ -4065,7 +4828,7 @@
                 <w:color w:val="202830"/>
                 <w:sz w:val="20"/>
               </w:rPr>
-              <w:t>投诉丢失、找不到历史、工单超期</w:t>
+              <w:t>找不到历史、工单没人跟</w:t>
             </w:r>
           </w:p>
         </w:tc>
@@ -4100,7 +4863,7 @@
                 <w:color w:val="202830"/>
                 <w:sz w:val="20"/>
               </w:rPr>
-              <w:t>自动建单、规则分派、现场移动作业和服务追踪</w:t>
+              <w:t>关联订单、合同、产品、批次、设备和保修的工单，以及客户服务历史</w:t>
             </w:r>
           </w:p>
         </w:tc>
@@ -4210,7 +4973,7 @@
                 <w:color w:val="202830"/>
                 <w:sz w:val="20"/>
               </w:rPr>
-              <w:t>统一指标、准实时经营视图、风险提醒和利润分析</w:t>
+              <w:t>合同与发票申请的审批入口，收入、成本、交付、利润的经营看板</w:t>
             </w:r>
           </w:p>
         </w:tc>
@@ -4243,7 +5006,7 @@
           <w:color w:val="202830"/>
           <w:sz w:val="22"/>
         </w:rPr>
-        <w:t>这套平台不是要求企业立刻更换所有软件，而是建立一套统一、可控的经营底座。企业可以先启用客户、合同、订单、采购、财务和售后，再逐步增加制造、质量、项目、人力或其他模块。已有专业系统也可以继续使用，通过统一权限、接口和主数据规则连接起来。</w:t>
+        <w:t>首版要解决的是一件具体的事：一笔业务从销售建单和合同审批开始，经采购订货、收货入库、发票申请与开具登记、到款与付款登记、交付确认和售后工单，一直走到管理层看到收入、成本、交付和利润，全过程在同一套系统内完成，不依赖外部系统或线下台账。</w:t>
       </w:r>
     </w:p>
     <w:p>
@@ -4253,7 +5016,17 @@
           <w:color w:val="202830"/>
           <w:sz w:val="22"/>
         </w:rPr>
-        <w:t>核心后台采用 Rust 构建，强调稳定、安全和长期可维护；客户差异通过配置、模块和签名插件实现，不为每个客户长期复制一套无法升级的代码。</w:t>
+        <w:t>首版不追求覆盖所有业务领域。制造、企业运营、电商与计费、客户与经销商门户、智能能力，以及银行和税务的系统对接属于后续版本，首版不交付。企业之间的差异通过配置、低代码、签名模块和受控插件实现，不为每个客户长期复制一套无法升级的代码。</w:t>
+      </w:r>
+    </w:p>
+    <w:p>
+      <w:r>
+        <w:rPr>
+          <w:rFonts w:ascii="Arial Unicode MS" w:hAnsi="Arial Unicode MS" w:eastAsia="Arial Unicode MS" w:cs="Arial Unicode MS"/>
+          <w:color w:val="202830"/>
+          <w:sz w:val="22"/>
+        </w:rPr>
+        <w:t>核心后台采用 Rust 构建，强调稳定、安全和长期可维护；每个客户拥有独立部署、独立数据、独立密钥和独立升级通道。</w:t>
       </w:r>
     </w:p>
     <w:p>
@@ -4285,7 +5058,7 @@
           <w:color w:val="0B2545"/>
           <w:sz w:val="23"/>
         </w:rPr>
-        <w:t>最终目标：让企业的人、客户、订单、货物、资金、文件和流程在同一个可信体系中协同。</w:t>
+        <w:t>首版目标：让合同、订单、货物、资金、发票和服务记录在同一套可信记录中衔接，管理层随时看到同一口径的经营结果。</w:t>
       </w:r>
     </w:p>
     <w:p>
@@ -4310,7 +5083,7 @@
           <w:color w:val="202830"/>
           <w:sz w:val="22"/>
         </w:rPr>
-        <w:t>本节说明本文档的效力范围。产品按阶段研发和交付，文中所列功能不代表当前均已可用，实际交付内容以合同和验收清单为准。</w:t>
+        <w:t>本节说明本文档的效力范围。产品处于分阶段研发过程中，文中所列功能不代表当前均已可用，实际交付内容以正式发布版本、合同和验收清单为准。</w:t>
       </w:r>
     </w:p>
     <w:p>
@@ -4336,7 +5109,7 @@
           <w:color w:val="202830"/>
           <w:sz w:val="21"/>
         </w:rPr>
-        <w:t>产品处于总体设计与分阶段研发阶段，不设置固定的完整版发布日期；所有正式业务模块完成并通过验收后才发布完整正式版。</w:t>
+        <w:t>产品处于总体设计与分阶段研发阶段，不设置固定的发布日期；首版范围内的全部模块完成并通过验收后才对外发布首版。</w:t>
       </w:r>
     </w:p>
     <w:p>
@@ -4380,6 +5153,58 @@
           <w:color w:val="202830"/>
           <w:sz w:val="21"/>
         </w:rPr>
+        <w:t>首版范围：</w:t>
+      </w:r>
+      <w:r>
+        <w:rPr>
+          <w:rFonts w:ascii="Arial Unicode MS" w:hAnsi="Arial Unicode MS" w:eastAsia="Arial Unicode MS" w:cs="Arial Unicode MS"/>
+          <w:color w:val="202830"/>
+          <w:sz w:val="21"/>
+        </w:rPr>
+        <w:t>首版是以合同为中心的销售、采购、财务与工单闭环：合同、订单与客户信用额度校验、采购与供应商、库存台账与存货计价、成本归集、售后工单与设备台账、应收应付与简易总账、发票申请与开具登记、报表与经营看板，以及权限与定制能力；对外协同只有供应商门户，成品连接器只有电子签章。</w:t>
+      </w:r>
+    </w:p>
+    <w:p>
+      <w:pPr>
+        <w:numPr>
+          <w:ilvl w:val="0"/>
+          <w:numId w:val="10"/>
+        </w:numPr>
+        <w:spacing w:after="40" w:line="276" w:lineRule="auto"/>
+      </w:pPr>
+      <w:r>
+        <w:rPr>
+          <w:rFonts w:ascii="Arial Unicode MS" w:hAnsi="Arial Unicode MS" w:eastAsia="Arial Unicode MS" w:cs="Arial Unicode MS"/>
+          <w:b/>
+          <w:color w:val="202830"/>
+          <w:sz w:val="21"/>
+        </w:rPr>
+        <w:t>后续版本：</w:t>
+      </w:r>
+      <w:r>
+        <w:rPr>
+          <w:rFonts w:ascii="Arial Unicode MS" w:hAnsi="Arial Unicode MS" w:eastAsia="Arial Unicode MS" w:cs="Arial Unicode MS"/>
+          <w:color w:val="202830"/>
+          <w:sz w:val="21"/>
+        </w:rPr>
+        <w:t>制造与生产、企业运营与治理、电商与计费、本地 AI 与 OCR、MCP、向量检索与知识图谱、边缘节点与断网运行、工业接入与物联网、客户门户与经销商门户与员工门户、银企直连与税务平台对接，以及四种国产数据库的适配，首版均不交付；相关条目已逐条登记，后续版本可按登记恢复。</w:t>
+      </w:r>
+    </w:p>
+    <w:p>
+      <w:pPr>
+        <w:numPr>
+          <w:ilvl w:val="0"/>
+          <w:numId w:val="10"/>
+        </w:numPr>
+        <w:spacing w:after="40" w:line="276" w:lineRule="auto"/>
+      </w:pPr>
+      <w:r>
+        <w:rPr>
+          <w:rFonts w:ascii="Arial Unicode MS" w:hAnsi="Arial Unicode MS" w:eastAsia="Arial Unicode MS" w:cs="Arial Unicode MS"/>
+          <w:b/>
+          <w:color w:val="202830"/>
+          <w:sz w:val="21"/>
+        </w:rPr>
         <w:t>语言与币种：</w:t>
       </w:r>
       <w:r>
@@ -4406,7 +5231,7 @@
           <w:color w:val="202830"/>
           <w:sz w:val="21"/>
         </w:rPr>
-        <w:t>离线边界：</w:t>
+        <w:t>联网要求：</w:t>
       </w:r>
       <w:r>
         <w:rPr>
@@ -4414,7 +5239,7 @@
           <w:color w:val="202830"/>
           <w:sz w:val="21"/>
         </w:rPr>
-        <w:t>库存、生产、质检和现场工单可在受控条件下离线处理，边缘节点默认支持 3 天独立运行并可延长；合同生效、付款、开票、财务过账、结账和敏感数据导出不得离线完成，必须联网并经人工审批与中心确认。</w:t>
+        <w:t>全部业务写入由中心完成，首版不提供断网独立运行；网络中断期间客户端只保存本地草稿，恢复连接后由中心校验通过才写入。</w:t>
       </w:r>
     </w:p>
     <w:p>
@@ -4440,7 +5265,33 @@
           <w:color w:val="202830"/>
           <w:sz w:val="21"/>
         </w:rPr>
-        <w:t>AI 与自动化可在授权范围内自动生成单据、任务和建议；合同生效、付款、开票、财务过账、结账和敏感数据导出属高风险动作，只生成待审批任务，必须经人工审批与中心确认后执行。</w:t>
+        <w:t>合同生效、付款、开票、财务过账、结账和敏感数据导出属高风险操作，必须重新认证后才能提交并进入审批，审批链不可越权跳过，审批人不得与发起人为同一人。</w:t>
+      </w:r>
+    </w:p>
+    <w:p>
+      <w:pPr>
+        <w:numPr>
+          <w:ilvl w:val="0"/>
+          <w:numId w:val="10"/>
+        </w:numPr>
+        <w:spacing w:after="40" w:line="276" w:lineRule="auto"/>
+      </w:pPr>
+      <w:r>
+        <w:rPr>
+          <w:rFonts w:ascii="Arial Unicode MS" w:hAnsi="Arial Unicode MS" w:eastAsia="Arial Unicode MS" w:cs="Arial Unicode MS"/>
+          <w:b/>
+          <w:color w:val="202830"/>
+          <w:sz w:val="21"/>
+        </w:rPr>
+        <w:t>数据库：</w:t>
+      </w:r>
+      <w:r>
+        <w:rPr>
+          <w:rFonts w:ascii="Arial Unicode MS" w:hAnsi="Arial Unicode MS" w:eastAsia="Arial Unicode MS" w:cs="Arial Unicode MS"/>
+          <w:color w:val="202830"/>
+          <w:sz w:val="21"/>
+        </w:rPr>
+        <w:t>首版核心交易数据库只支持并只认证 PostgreSQL 16；其他数据库产品只能作为外部数据源。</w:t>
       </w:r>
     </w:p>
     <w:p>
@@ -4466,7 +5317,33 @@
           <w:color w:val="202830"/>
           <w:sz w:val="21"/>
         </w:rPr>
-        <w:t>银行、税务与数电发票、支付、电子签章等接入需完成相应准入，并按具体银行和属地逐项开户、报备与联调；未完成时按交付说明和合同采用回单、对账文件导入等替代方式。</w:t>
+        <w:t>首版成品连接器只有电子签章一类，启用需完成机构准入并按客户逐项联调；银行与税务侧首版不做系统对接，到款、付款与发票开具在系统内登记，可人工录入或批量导入。</w:t>
+      </w:r>
+    </w:p>
+    <w:p>
+      <w:pPr>
+        <w:numPr>
+          <w:ilvl w:val="0"/>
+          <w:numId w:val="10"/>
+        </w:numPr>
+        <w:spacing w:after="40" w:line="276" w:lineRule="auto"/>
+      </w:pPr>
+      <w:r>
+        <w:rPr>
+          <w:rFonts w:ascii="Arial Unicode MS" w:hAnsi="Arial Unicode MS" w:eastAsia="Arial Unicode MS" w:cs="Arial Unicode MS"/>
+          <w:b/>
+          <w:color w:val="202830"/>
+          <w:sz w:val="21"/>
+        </w:rPr>
+        <w:t>性能与容量：</w:t>
+      </w:r>
+      <w:r>
+        <w:rPr>
+          <w:rFonts w:ascii="Arial Unicode MS" w:hAnsi="Arial Unicode MS" w:eastAsia="Arial Unicode MS" w:cs="Arial Unicode MS"/>
+          <w:color w:val="202830"/>
+          <w:sz w:val="21"/>
+        </w:rPr>
+        <w:t>响应时间、并发规模、恢复时间等指标以合同约定的基线环境和验收清单为准，本文档不单独作出量化承诺。</w:t>
       </w:r>
     </w:p>
     <w:p>

</xml_diff>

<commit_message>
docs: v2.0 stage 7 — close remaining ledger edge cases
第三轮验证 9 条 blocking,本批修补(判定表回写已手工完成)。

- 零结存销售退货:补取价兜底。合同型业务交付后结存归零是常态,此时按加权平均
  单价回冲得到单价 0,原结转的销货成本永不冲回、货以零成本入账,而借贷平衡、
  数量守恒、金额账等式(单价 0 时恒等)与子账总账勾稽全部通过,不变量查不出来。
  改为结存或单价为零时按原交付确认结转单价与本次退货数量回冲
- 先票后货:补第三条结清路径(后续收货与超量部分反向匹配)。此前只有红字冲回与
  审批转成本两条,叠加"关账前必须结清为零"会强制转成本,货到再按暂估入库且无
  发票可匹配,成本与负债各重复一次
- 直运销售退货改为两段式:退货事件本身只冲收入与未开票过渡科目不生成成本冲回
  分录,成本冲回由货退供应商时按采购退货已登记发票分支单独登记并勾稽,只允许
  冲回一次;供应商不接受退回时成本保留并标注
- 删除"库存出入库"事件类别(十一类改十类):该事件是唯一没有分录定义的一项,
  实施方若理解为存货腿统一承载者会与交付确认、采购收货重复过账
- 寄售补首版边界:只作订单类型标记,货权转移以交付确认为准,在库管理与代销
  结算延期
- 第 10.2、17.2、17.3、19、22 章补超量开票科目的勾稽项、必测分支与验收落点

复校提出 7 条 blocking,处理方式:超量开票的"在途期挂账例外"直接删除而非继续
补定义——它引入"合理在途期""匹配预期"两个无定义概念,且与第 10.2 章"差异
清零前不得关账"正面冲突,等于给硬约束开无法判定的口子;超量匹配的收货改为按
发票单价同源入账、不走暂估、不产生价差,消除三种读法。另补四条配套编辑修正
"只改一侧":第 7.2 章驱动事件清单、第 5.2 章库存条目的暂估例外、第 5.7 章与
第 20 章的寄售延期登记。
</commit_message>
<xml_diff>
--- a/docs/介绍/企业一体化经营管理平台-产品介绍与功能大纲.docx
+++ b/docs/介绍/企业一体化经营管理平台-产品介绍与功能大纲.docx
@@ -2119,6 +2119,40 @@
           <w:color w:val="202830"/>
           <w:sz w:val="22"/>
         </w:rPr>
+        <w:t>支持合同续签：按原合同派生续签版本，保留与原合同的关联关系，以及原合同的履约记录、收付款计划和已派生单据的追溯链路；续签版本重新审批生效后派生新的订单、收款计划和交付节点。</w:t>
+      </w:r>
+    </w:p>
+    <w:p>
+      <w:pPr>
+        <w:numPr>
+          <w:ilvl w:val="0"/>
+          <w:numId w:val="10"/>
+        </w:numPr>
+        <w:spacing w:after="80" w:line="300" w:lineRule="auto"/>
+      </w:pPr>
+      <w:r>
+        <w:rPr>
+          <w:rFonts w:ascii="Arial Unicode MS" w:hAnsi="Arial Unicode MS" w:eastAsia="Arial Unicode MS" w:cs="Arial Unicode MS"/>
+          <w:color w:val="202830"/>
+          <w:sz w:val="22"/>
+        </w:rPr>
+        <w:t>支持合同到期提醒：按合同有效期、交付节点日期和收付款计划到期日生成提醒。</w:t>
+      </w:r>
+    </w:p>
+    <w:p>
+      <w:pPr>
+        <w:numPr>
+          <w:ilvl w:val="0"/>
+          <w:numId w:val="10"/>
+        </w:numPr>
+        <w:spacing w:after="80" w:line="300" w:lineRule="auto"/>
+      </w:pPr>
+      <w:r>
+        <w:rPr>
+          <w:rFonts w:ascii="Arial Unicode MS" w:hAnsi="Arial Unicode MS" w:eastAsia="Arial Unicode MS" w:cs="Arial Unicode MS"/>
+          <w:color w:val="202830"/>
+          <w:sz w:val="22"/>
+        </w:rPr>
         <w:t>合同审批后，可自动生成订单、采购需求、项目任务、收款计划和交付节点。</w:t>
       </w:r>
     </w:p>
@@ -2843,7 +2877,7 @@
           <w:color w:val="202830"/>
           <w:sz w:val="21"/>
         </w:rPr>
-        <w:t>主数据、客户档案与客户 360、合同、销售订单与客户信用额度校验、采购与供应商、库存台账与存货计价、成本归集、项目任务与交付节点、售后工单与设备台账。</w:t>
+        <w:t>主数据、客户档案与客户 360、合同（含续签与到期提醒）、销售订单与客户信用额度校验、采购与供应商、库存台账与存货计价、成本归集、项目任务与交付节点、售后工单与设备台账。</w:t>
       </w:r>
     </w:p>
     <w:p>
@@ -4089,7 +4123,7 @@
           <w:color w:val="202830"/>
           <w:sz w:val="22"/>
         </w:rPr>
-        <w:t>敏感字段按经批准的清单脱敏，并可执行水印、导出审批、打印阻断和剪贴板拦截；浏览器门户端受浏览器能力限制，打印阻断与已下载文件失效为尽力而为，不作承诺。</w:t>
+        <w:t>敏感字段按经批准的清单脱敏；电脑端与移动端强制执行水印、导出审批、打印阻断、剪贴板拦截和分享控制，已下载文件失效在装有原生插件的电脑端和满足设备合规要求的移动端强制执行；浏览器门户端强制执行脱敏投影、水印、导出审批和操作审计，打印阻断、剪贴板拦截与已下载文件失效受浏览器能力限制，为尽力而为，不作承诺。</w:t>
       </w:r>
     </w:p>
     <w:p>
@@ -5161,7 +5195,7 @@
           <w:color w:val="202830"/>
           <w:sz w:val="21"/>
         </w:rPr>
-        <w:t>首版是以合同为中心的销售、采购、财务与工单闭环：合同、订单与客户信用额度校验、采购与供应商、库存台账与存货计价、成本归集、售后工单与设备台账、应收应付与简易总账、发票申请与开具登记、报表与经营看板，以及权限与定制能力；对外协同只有供应商门户，成品连接器只有电子签章。</w:t>
+        <w:t>首版是以合同为中心的销售、采购、财务与工单闭环：合同（含续签与到期提醒）、订单与客户信用额度校验、采购与供应商、库存台账与存货计价、成本归集、售后工单与设备台账、应收应付与简易总账、发票申请与开具登记、报表与经营看板，以及权限与定制能力；对外协同只有供应商门户，成品连接器只有电子签章。</w:t>
       </w:r>
     </w:p>
     <w:p>

</xml_diff>

<commit_message>
docs: v2.0 stage 8 — fix silent accounting errors and OOXML defect
第四轮验证 7 条 blocking(去重 6 类),本批全部修补。这轮的问题都属于"不变量
查不出来的静默错误",危害高于明显矛盾。

- 超量开票未限定物料类:直接费用类采购不产生收货,累计收货数量恒为零,按字面
  每笔服务采购与直运成本全额构成"超量"须挂待处理科目;而三条结清路径对它全部
  走不通(路径一以收货到达为前提),叠加"关账前必须结清为零"会使每个会计期间的
  关账被常态阻断。已限定为物料类,并声明直接费用类不适用匹配、暂估、价差与超量
  判定;同时删除第一条结清路径中不可能触发的直接费用类分支
- 价差拆分基数不递减:"尚有库存数量"取发票登记时点结存数量这一固定值,在跨多次
  收货、一次收货分多票、部分匹配场景下同一份结存被重复占用,已出库数量被系统性
  算成零、价差全额调入存货,当期成本少计、毛利虚增,而加权平均单价由金额倒算
  使不变量恒成立。改为随匹配递减的可分配在库数量
- 应收账款未开票过渡科目只定义"已交付未开票"单向:而第 8 章明写开票与交付先后
  不限,先开票后交付时该科目必然出现贷方余额,子账侧算出零,勾稽差额非零并按
  第 10.2 章拦截关账——闭环默认单据顺序会稳定触发误报。改为净额双向口径并
  明确不设关账归零要求
- 对外介绍:寄售此前与直运、退换货并列且无限定,而规格四处已收窄为只作订单类型
  标记。已加限定并把寄售在库与代销结算补入后续版本清单
- 生成器 OOXML 缺陷:create_numbering 把新建 abstractNum 追加到根元素末尾,
  落在既有 num 之后,违反 CT_Numbering 的元素顺序要求(实测序列 A×9 N×9 A N A N),
  客户在 Word 中可能看到"内容有问题"提示。改为插入到首个 num 之前,重新生成后
  序列为 A×11 N×11

判定表附录 B 条目的六处三类残留一并回写,并补记决策人与已同步文件清单。
</commit_message>
<xml_diff>
--- a/docs/介绍/企业一体化经营管理平台-产品介绍与功能大纲.docx
+++ b/docs/介绍/企业一体化经营管理平台-产品介绍与功能大纲.docx
@@ -2246,7 +2246,7 @@
           <w:color w:val="202830"/>
           <w:sz w:val="22"/>
         </w:rPr>
-        <w:t>支持订单变更、分批交付、退货、换货、直运和寄售；订阅与租赁作为订单类型登记周期和租期。</w:t>
+        <w:t>支持订单变更、分批交付、退货、换货和直运；订阅、租赁与寄售作为订单类型登记：订阅与租赁登记周期和租期，寄售只登记订单类型，不含寄售在库台账与代销结算，货权转移仍以交付确认为准。</w:t>
       </w:r>
     </w:p>
     <w:p>
@@ -3240,7 +3240,7 @@
           <w:color w:val="202830"/>
           <w:sz w:val="21"/>
         </w:rPr>
-        <w:t>完整仓库作业（波次、拣货、盘点、质检、预留、调拨）、完整财务与管理会计（多账簿、固定资产、预算、费用报销、合并报表、资金管理）、完整成本管理，以及线索、商机、销售预测、询比价和招投标。</w:t>
+        <w:t>完整仓库作业（波次、拣货、盘点、质检、预留、调拨）、寄售在库管理与代销结算、完整财务与管理会计（多账簿、固定资产、预算、费用报销、合并报表、资金管理）、完整成本管理，以及线索、商机、销售预测、询比价和招投标。</w:t>
       </w:r>
     </w:p>
     <w:p>
@@ -5725,6 +5725,44 @@
       </w:rPr>
     </w:lvl>
   </w:abstractNum>
+  <w:abstractNum w:abstractNumId="9">
+    <w:multiLevelType w:val="singleLevel"/>
+    <w:lvl w:ilvl="0">
+      <w:start w:val="1"/>
+      <w:numFmt w:val="bullet"/>
+      <w:lvlText w:val="•"/>
+      <w:lvlJc w:val="left"/>
+      <w:pPr>
+        <w:tabs>
+          <w:tab w:val="num" w:pos="540"/>
+        </w:tabs>
+        <w:ind w:left="540" w:hanging="270"/>
+        <w:spacing w:after="80" w:line="300" w:lineRule="auto"/>
+      </w:pPr>
+      <w:rPr>
+        <w:rFonts w:ascii="Arial Unicode MS" w:hAnsi="Arial Unicode MS" w:eastAsia="Arial Unicode MS"/>
+      </w:rPr>
+    </w:lvl>
+  </w:abstractNum>
+  <w:abstractNum w:abstractNumId="10">
+    <w:multiLevelType w:val="singleLevel"/>
+    <w:lvl w:ilvl="0">
+      <w:start w:val="1"/>
+      <w:numFmt w:val="decimal"/>
+      <w:lvlText w:val="%1."/>
+      <w:lvlJc w:val="left"/>
+      <w:pPr>
+        <w:tabs>
+          <w:tab w:val="num" w:pos="540"/>
+        </w:tabs>
+        <w:ind w:left="540" w:hanging="270"/>
+        <w:spacing w:after="80" w:line="300" w:lineRule="auto"/>
+      </w:pPr>
+      <w:rPr>
+        <w:rFonts w:ascii="Arial Unicode MS" w:hAnsi="Arial Unicode MS" w:eastAsia="Arial Unicode MS"/>
+      </w:rPr>
+    </w:lvl>
+  </w:abstractNum>
   <w:num w:numId="1">
     <w:abstractNumId w:val="8"/>
   </w:num>
@@ -5752,47 +5790,9 @@
   <w:num w:numId="9">
     <w:abstractNumId w:val="0"/>
   </w:num>
-  <w:abstractNum w:abstractNumId="9">
-    <w:multiLevelType w:val="singleLevel"/>
-    <w:lvl w:ilvl="0">
-      <w:start w:val="1"/>
-      <w:numFmt w:val="bullet"/>
-      <w:lvlText w:val="•"/>
-      <w:lvlJc w:val="left"/>
-      <w:pPr>
-        <w:tabs>
-          <w:tab w:val="num" w:pos="540"/>
-        </w:tabs>
-        <w:ind w:left="540" w:hanging="270"/>
-        <w:spacing w:after="80" w:line="300" w:lineRule="auto"/>
-      </w:pPr>
-      <w:rPr>
-        <w:rFonts w:ascii="Arial Unicode MS" w:hAnsi="Arial Unicode MS" w:eastAsia="Arial Unicode MS"/>
-      </w:rPr>
-    </w:lvl>
-  </w:abstractNum>
   <w:num w:numId="10">
     <w:abstractNumId w:val="9"/>
   </w:num>
-  <w:abstractNum w:abstractNumId="10">
-    <w:multiLevelType w:val="singleLevel"/>
-    <w:lvl w:ilvl="0">
-      <w:start w:val="1"/>
-      <w:numFmt w:val="decimal"/>
-      <w:lvlText w:val="%1."/>
-      <w:lvlJc w:val="left"/>
-      <w:pPr>
-        <w:tabs>
-          <w:tab w:val="num" w:pos="540"/>
-        </w:tabs>
-        <w:ind w:left="540" w:hanging="270"/>
-        <w:spacing w:after="80" w:line="300" w:lineRule="auto"/>
-      </w:pPr>
-      <w:rPr>
-        <w:rFonts w:ascii="Arial Unicode MS" w:hAnsi="Arial Unicode MS" w:eastAsia="Arial Unicode MS"/>
-      </w:rPr>
-    </w:lvl>
-  </w:abstractNum>
   <w:num w:numId="11">
     <w:abstractNumId w:val="10"/>
   </w:num>

</xml_diff>

<commit_message>
docs: finalize F57 resilience and semantic closure
</commit_message>
<xml_diff>
--- a/docs/介绍/企业一体化经营管理平台-产品介绍与功能大纲.docx
+++ b/docs/介绍/企业一体化经营管理平台-产品介绍与功能大纲.docx
@@ -378,7 +378,7 @@
                 <w:sz w:val="20"/>
                 <w:lang w:val="en-US" w:eastAsia="zh-CN" w:bidi="ar-SA"/>
               </w:rPr>
-              <w:t>企业自控物理机或企业自控 IaaS 上的一台 Windows Server 2022 作为唯一写权威；服务器外备份目标、离线轮换介质和洁净恢复能力独立配置。核心交易数据库为自管 PostgreSQL 16，详见第 6 节</w:t>
+              <w:t>当前首版只在企业自控的 ThinkStation P340 物理机上运行一台 Windows Server 2022 作为唯一写权威；服务器外备份目标、离线轮换介质和洁净恢复能力独立配置。核心交易数据库为自管 PostgreSQL 16。未来 IaaS 只能通过新的独立认证档启用，详见第 6 节</w:t>
             </w:r>
           </w:p>
         </w:tc>
@@ -4389,7 +4389,7 @@
           <w:sz w:val="22"/>
           <w:lang w:val="en-US" w:eastAsia="zh-CN" w:bidi="ar-SA"/>
         </w:rPr>
-        <w:t>首版只有一台 Windows Server 2022 单写权威，不依赖第二台应用服务器；它可位于企业自控的中国大陆机房或企业自控境内 IaaS。最高安全生产仍必须另配服务器外连续备份目标、至少两块轮换离线加密介质和洁净 Windows 恢复能力。IaaS 必须证明快照、缓存、日志、运维副本和灾备不跨境，并证明底层 HDD 介质与缓存边界；无法证明时保持 STORAGE_MEDIA_UNVERIFIED，不能承载 HDD_STRICT 正式生产。</w:t>
+        <w:t>首版只有一台运行在企业自控 ThinkStation P340 物理机上的 Windows Server 2022 单写权威，不依赖第二台应用服务器。最高安全生产仍必须另配服务器外连续备份目标、至少两块轮换离线加密介质和洁净 Windows 恢复能力。未来可增加客户自控境内 IaaS 独立认证档，但当前不实现、不接受；必须先发布新的架构与认证版本，并分别证明驻留、vTPM、底层 HDD、缓存、快照、运维副本、备份域和安全关机边界，不能复用 P340 证据。</w:t>
       </w:r>
     </w:p>
     <w:p>
@@ -4697,7 +4697,7 @@
           <w:sz w:val="23"/>
           <w:lang w:val="en-US" w:eastAsia="zh-CN" w:bidi="ar-SA"/>
         </w:rPr>
-        <w:t>云服务器只是可选的部署位置，不代表使用共享 SaaS。每个客户仍拥有独立系统、独立数据、独立密钥和独立升级通道。</w:t>
+        <w:t>云服务器仅是未来认证选项，当前首版只接受 P340；它不等于共享 SaaS，每个客户仍有独立系统、数据、密钥和升级通道。</w:t>
       </w:r>
     </w:p>
     <w:p>
@@ -5745,14 +5745,14 @@
           <w:ilvl w:val="0"/>
           <w:numId w:val="10"/>
         </w:numPr>
-        <w:spacing w:after="40" w:line="264" w:lineRule="auto"/>
+        <w:spacing w:after="40" w:line="252" w:lineRule="auto"/>
       </w:pPr>
       <w:r>
         <w:rPr>
           <w:rFonts w:ascii="Arial" w:hAnsi="Arial" w:eastAsia="Microsoft YaHei" w:cs="Arial"/>
           <w:b/>
           <w:color w:val="202830"/>
-          <w:sz w:val="20"/>
+          <w:sz w:val="19"/>
           <w:lang w:val="en-US" w:eastAsia="zh-CN" w:bidi="ar-SA"/>
         </w:rPr>
         <w:t>阶段与版本：</w:t>
@@ -5761,7 +5761,7 @@
         <w:rPr>
           <w:rFonts w:ascii="Arial" w:hAnsi="Arial" w:eastAsia="Microsoft YaHei" w:cs="Arial"/>
           <w:color w:val="202830"/>
-          <w:sz w:val="20"/>
+          <w:sz w:val="19"/>
           <w:lang w:val="en-US" w:eastAsia="zh-CN" w:bidi="ar-SA"/>
         </w:rPr>
         <w:t>产品处于总体设计与分阶段研发阶段，不设置固定的发布日期；首版范围内的全部模块完成并通过验收后才对外发布首版。</w:t>
@@ -5773,14 +5773,14 @@
           <w:ilvl w:val="0"/>
           <w:numId w:val="10"/>
         </w:numPr>
-        <w:spacing w:after="40" w:line="264" w:lineRule="auto"/>
+        <w:spacing w:after="40" w:line="252" w:lineRule="auto"/>
       </w:pPr>
       <w:r>
         <w:rPr>
           <w:rFonts w:ascii="Arial" w:hAnsi="Arial" w:eastAsia="Microsoft YaHei" w:cs="Arial"/>
           <w:b/>
           <w:color w:val="202830"/>
-          <w:sz w:val="20"/>
+          <w:sz w:val="19"/>
           <w:lang w:val="en-US" w:eastAsia="zh-CN" w:bidi="ar-SA"/>
         </w:rPr>
         <w:t>交付依据：</w:t>
@@ -5789,7 +5789,7 @@
         <w:rPr>
           <w:rFonts w:ascii="Arial" w:hAnsi="Arial" w:eastAsia="Microsoft YaHei" w:cs="Arial"/>
           <w:color w:val="202830"/>
-          <w:sz w:val="20"/>
+          <w:sz w:val="19"/>
           <w:lang w:val="en-US" w:eastAsia="zh-CN" w:bidi="ar-SA"/>
         </w:rPr>
         <w:t>每次交付的模块范围、版本和验收标准以双方签署的合同与验收清单为准，本文档不构成功能交付承诺。</w:t>
@@ -5801,14 +5801,14 @@
           <w:ilvl w:val="0"/>
           <w:numId w:val="10"/>
         </w:numPr>
-        <w:spacing w:after="40" w:line="264" w:lineRule="auto"/>
+        <w:spacing w:after="40" w:line="252" w:lineRule="auto"/>
       </w:pPr>
       <w:r>
         <w:rPr>
           <w:rFonts w:ascii="Arial" w:hAnsi="Arial" w:eastAsia="Microsoft YaHei" w:cs="Arial"/>
           <w:b/>
           <w:color w:val="202830"/>
-          <w:sz w:val="20"/>
+          <w:sz w:val="19"/>
           <w:lang w:val="en-US" w:eastAsia="zh-CN" w:bidi="ar-SA"/>
         </w:rPr>
         <w:t>第一阶段范围：</w:t>
@@ -5817,7 +5817,7 @@
         <w:rPr>
           <w:rFonts w:ascii="Arial" w:hAnsi="Arial" w:eastAsia="Microsoft YaHei" w:cs="Arial"/>
           <w:color w:val="202830"/>
-          <w:sz w:val="20"/>
+          <w:sz w:val="19"/>
           <w:lang w:val="en-US" w:eastAsia="zh-CN" w:bidi="ar-SA"/>
         </w:rPr>
         <w:t>CRM 商机报价、合同、STANDARD/DROP_SHIP 销售、询比价采购、基础库存、项目交付、投诉售后、经营财务、客户与供应商门户、报表、耐久自动化、动态权限、平台定制、受控 MCP、AI/provider 契约、服务器控制中心及四端 Workbench。</w:t>
@@ -5829,14 +5829,14 @@
           <w:ilvl w:val="0"/>
           <w:numId w:val="10"/>
         </w:numPr>
-        <w:spacing w:after="40" w:line="264" w:lineRule="auto"/>
+        <w:spacing w:after="40" w:line="252" w:lineRule="auto"/>
       </w:pPr>
       <w:r>
         <w:rPr>
           <w:rFonts w:ascii="Arial" w:hAnsi="Arial" w:eastAsia="Microsoft YaHei" w:cs="Arial"/>
           <w:b/>
           <w:color w:val="202830"/>
-          <w:sz w:val="20"/>
+          <w:sz w:val="19"/>
           <w:lang w:val="en-US" w:eastAsia="zh-CN" w:bidi="ar-SA"/>
         </w:rPr>
         <w:t>后续版本：</w:t>
@@ -5845,7 +5845,7 @@
         <w:rPr>
           <w:rFonts w:ascii="Arial" w:hAnsi="Arial" w:eastAsia="Microsoft YaHei" w:cs="Arial"/>
           <w:color w:val="202830"/>
-          <w:sz w:val="20"/>
+          <w:sz w:val="19"/>
           <w:lang w:val="en-US" w:eastAsia="zh-CN" w:bidi="ar-SA"/>
         </w:rPr>
         <w:t>上文十二项已登记的产品边界，以及边界登记 DEF-006 的主主/双活/多写和 DEF-007 的 PostgreSQL 外权威数据库，均不在当前交付中；没有登记与证据不得新增宣称。</w:t>
@@ -5857,14 +5857,14 @@
           <w:ilvl w:val="0"/>
           <w:numId w:val="10"/>
         </w:numPr>
-        <w:spacing w:after="40" w:line="264" w:lineRule="auto"/>
+        <w:spacing w:after="40" w:line="252" w:lineRule="auto"/>
       </w:pPr>
       <w:r>
         <w:rPr>
           <w:rFonts w:ascii="Arial" w:hAnsi="Arial" w:eastAsia="Microsoft YaHei" w:cs="Arial"/>
           <w:b/>
           <w:color w:val="202830"/>
-          <w:sz w:val="20"/>
+          <w:sz w:val="19"/>
           <w:lang w:val="en-US" w:eastAsia="zh-CN" w:bidi="ar-SA"/>
         </w:rPr>
         <w:t>语言与币种：</w:t>
@@ -5873,7 +5873,7 @@
         <w:rPr>
           <w:rFonts w:ascii="Arial" w:hAnsi="Arial" w:eastAsia="Microsoft YaHei" w:cs="Arial"/>
           <w:color w:val="202830"/>
-          <w:sz w:val="20"/>
+          <w:sz w:val="19"/>
           <w:lang w:val="en-US" w:eastAsia="zh-CN" w:bidi="ar-SA"/>
         </w:rPr>
         <w:t>首版固定 zh-CN、CNY 和 Asia/Shanghai 业务显示；权威时间戳保存为 UTC，持续时间、租约与超时使用 monotonic clock。不支持多币种、外汇、进出口、报关、信用证和产品内容多语言。</w:t>
@@ -5885,14 +5885,14 @@
           <w:ilvl w:val="0"/>
           <w:numId w:val="10"/>
         </w:numPr>
-        <w:spacing w:after="40" w:line="264" w:lineRule="auto"/>
+        <w:spacing w:after="40" w:line="252" w:lineRule="auto"/>
       </w:pPr>
       <w:r>
         <w:rPr>
           <w:rFonts w:ascii="Arial" w:hAnsi="Arial" w:eastAsia="Microsoft YaHei" w:cs="Arial"/>
           <w:b/>
           <w:color w:val="202830"/>
-          <w:sz w:val="20"/>
+          <w:sz w:val="19"/>
           <w:lang w:val="en-US" w:eastAsia="zh-CN" w:bidi="ar-SA"/>
         </w:rPr>
         <w:t>联网要求：</w:t>
@@ -5901,7 +5901,7 @@
         <w:rPr>
           <w:rFonts w:ascii="Arial" w:hAnsi="Arial" w:eastAsia="Microsoft YaHei" w:cs="Arial"/>
           <w:color w:val="202830"/>
-          <w:sz w:val="20"/>
+          <w:sz w:val="19"/>
           <w:lang w:val="en-US" w:eastAsia="zh-CN" w:bidi="ar-SA"/>
         </w:rPr>
         <w:t>最高安全档默认不启用业务投影离线读取；经签名设备策略逐对象、逐字段显式开放时，只允许有界、加密、可撤销的最小非权威投影。草稿、附件、现场证据和待提交意图可暂存，所有权威写入由服务器重验后生效，高风险动作不得离线生效。</w:t>
@@ -5913,14 +5913,14 @@
           <w:ilvl w:val="0"/>
           <w:numId w:val="10"/>
         </w:numPr>
-        <w:spacing w:after="40" w:line="264" w:lineRule="auto"/>
+        <w:spacing w:after="40" w:line="252" w:lineRule="auto"/>
       </w:pPr>
       <w:r>
         <w:rPr>
           <w:rFonts w:ascii="Arial" w:hAnsi="Arial" w:eastAsia="Microsoft YaHei" w:cs="Arial"/>
           <w:b/>
           <w:color w:val="202830"/>
-          <w:sz w:val="20"/>
+          <w:sz w:val="19"/>
           <w:lang w:val="en-US" w:eastAsia="zh-CN" w:bidi="ar-SA"/>
         </w:rPr>
         <w:t>人工确认：</w:t>
@@ -5929,7 +5929,7 @@
         <w:rPr>
           <w:rFonts w:ascii="Arial" w:hAnsi="Arial" w:eastAsia="Microsoft YaHei" w:cs="Arial"/>
           <w:color w:val="202830"/>
-          <w:sz w:val="20"/>
+          <w:sz w:val="19"/>
           <w:lang w:val="en-US" w:eastAsia="zh-CN" w:bidi="ar-SA"/>
         </w:rPr>
         <w:t>合同生效、付款与退款、开票与红冲、经营分录更正、经营期间锁定、迟到事实顺延例外和敏感数据导出属于高风险操作，必须按现行风险策略重新认证并进入相应审批；审批链不可越权跳过，审批人不得与发起人为同一人。</w:t>
@@ -5941,14 +5941,14 @@
           <w:ilvl w:val="0"/>
           <w:numId w:val="10"/>
         </w:numPr>
-        <w:spacing w:after="40" w:line="264" w:lineRule="auto"/>
+        <w:spacing w:after="40" w:line="252" w:lineRule="auto"/>
       </w:pPr>
       <w:r>
         <w:rPr>
           <w:rFonts w:ascii="Arial" w:hAnsi="Arial" w:eastAsia="Microsoft YaHei" w:cs="Arial"/>
           <w:b/>
           <w:color w:val="202830"/>
-          <w:sz w:val="20"/>
+          <w:sz w:val="19"/>
           <w:lang w:val="en-US" w:eastAsia="zh-CN" w:bidi="ar-SA"/>
         </w:rPr>
         <w:t>数据库与部署：</w:t>
@@ -5957,10 +5957,10 @@
         <w:rPr>
           <w:rFonts w:ascii="Arial" w:hAnsi="Arial" w:eastAsia="Microsoft YaHei" w:cs="Arial"/>
           <w:color w:val="202830"/>
-          <w:sz w:val="20"/>
+          <w:sz w:val="19"/>
           <w:lang w:val="en-US" w:eastAsia="zh-CN" w:bidi="ar-SA"/>
         </w:rPr>
-        <w:t>首版唯一权威数据库认证目标是同机自管 PostgreSQL 16；客户自控物理机或通过驻留和介质证据门禁的 IaaS VM 上，以一台 Windows Server 2022 作为单写权威，同时独立配置服务器外备份与洁净恢复能力。取得实际部署证书前不得称为已认证；权威节点全部客户及衍生持久数据必须落加密 HDD，核心运行不依赖 Linux、WSL、Kubernetes、共享 SaaS 或厂商云控制面。</w:t>
+        <w:t>首版唯一权威数据库认证目标是在 ThinkStation P340 上同机自管 PostgreSQL 16，并以一台 Windows Server 2022 作为单写权威，同时独立配置服务器外备份与洁净恢复能力。取得实际部署证书前不得称为已认证；权威节点全部客户及衍生持久数据必须落加密 HDD，核心运行不依赖 Linux、WSL、Kubernetes、共享 SaaS 或厂商云控制面。IaaS 仅是未来独立 profile 扩展缝，当前选择必须失败关闭。</w:t>
       </w:r>
     </w:p>
     <w:p>
@@ -5969,14 +5969,14 @@
           <w:ilvl w:val="0"/>
           <w:numId w:val="10"/>
         </w:numPr>
-        <w:spacing w:after="40" w:line="264" w:lineRule="auto"/>
+        <w:spacing w:after="40" w:line="252" w:lineRule="auto"/>
       </w:pPr>
       <w:r>
         <w:rPr>
           <w:rFonts w:ascii="Arial" w:hAnsi="Arial" w:eastAsia="Microsoft YaHei" w:cs="Arial"/>
           <w:b/>
           <w:color w:val="202830"/>
-          <w:sz w:val="20"/>
+          <w:sz w:val="19"/>
           <w:lang w:val="en-US" w:eastAsia="zh-CN" w:bidi="ar-SA"/>
         </w:rPr>
         <w:t>外部连接：</w:t>
@@ -5985,7 +5985,7 @@
         <w:rPr>
           <w:rFonts w:ascii="Arial" w:hAnsi="Arial" w:eastAsia="Microsoft YaHei" w:cs="Arial"/>
           <w:color w:val="202830"/>
-          <w:sz w:val="20"/>
+          <w:sz w:val="19"/>
           <w:lang w:val="en-US" w:eastAsia="zh-CN" w:bidi="ar-SA"/>
         </w:rPr>
         <w:t>必须完成认证的核心 provider 目标为本地文件、Office 格式、REST/Webhook/MCP、SMTP 和 AD/LDAP；证据通过前保持关闭。其他身份、消息、签章、银行、税务和办公厂商按签名 provider 契约逐项取证后启用。</w:t>
@@ -5997,14 +5997,14 @@
           <w:ilvl w:val="0"/>
           <w:numId w:val="10"/>
         </w:numPr>
-        <w:spacing w:after="40" w:line="264" w:lineRule="auto"/>
+        <w:spacing w:after="40" w:line="252" w:lineRule="auto"/>
       </w:pPr>
       <w:r>
         <w:rPr>
           <w:rFonts w:ascii="Arial" w:hAnsi="Arial" w:eastAsia="Microsoft YaHei" w:cs="Arial"/>
           <w:b/>
           <w:color w:val="202830"/>
-          <w:sz w:val="20"/>
+          <w:sz w:val="19"/>
           <w:lang w:val="en-US" w:eastAsia="zh-CN" w:bidi="ar-SA"/>
         </w:rPr>
         <w:t>性能与容量：</w:t>
@@ -6013,7 +6013,7 @@
         <w:rPr>
           <w:rFonts w:ascii="Arial" w:hAnsi="Arial" w:eastAsia="Microsoft YaHei" w:cs="Arial"/>
           <w:color w:val="202830"/>
-          <w:sz w:val="20"/>
+          <w:sz w:val="19"/>
           <w:lang w:val="en-US" w:eastAsia="zh-CN" w:bidi="ar-SA"/>
         </w:rPr>
         <w:t>ThinkStation P340 i5-10500、32GB、256GB SSD、单 1TB HDD 以约 20 名活跃用户为实机认证目标，不是登录硬上限或已达成承诺；恢复时间按数据量和实测证书签发。</w:t>

</xml_diff>

<commit_message>
fix(db): fail closed on retry and cleanup
</commit_message>
<xml_diff>
--- a/docs/介绍/企业一体化经营管理平台-产品介绍与功能大纲.docx
+++ b/docs/介绍/企业一体化经营管理平台-产品介绍与功能大纲.docx
@@ -4785,7 +4785,7 @@
           <w:sz w:val="22"/>
           <w:lang w:val="en-US" w:eastAsia="zh-CN" w:bidi="ar-SA"/>
         </w:rPr>
-        <w:t>当前 P340 的单块 1TB HDD 只能是 SINGLE_DISK_DEGRADED_PRODUCTION 候选：UPS、两层备份、洁净恢复、20 人实机混合负载和同一候选版本连续 72 小时稳定运行证据未全部通过前不得录入真实客户数据；任何版本、硬件或关键配置变化都会使该稳定性证据失效并需重测。后续优先升级两块匹配企业 HDD 的经验证 RAID1 和 64GB 内存。</w:t>
+        <w:t>当前 P340 已安装的 1TB HDD 永久不具备生产资格，认证不能把它变成生产权威盘、RAID1 成员或备份目标。只有换装原始容量不少于 2,000,000,000,000 bytes 的可认证企业 CMR HDD，且 NTFS 卷同时满足 1,589,137,899,520 bytes 名义下限及包含当次文件系统元数据的动态容量公式，再通过 UPS、两层备份、洁净恢复、20 人实机混合负载和同一候选版本连续 72 小时稳定运行等全部证据门，才可成为 SINGLE_DISK_DEGRADED_PRODUCTION 候选；证据闭合前状态仍是 PRODUCTION_NOT_READY。后续优先升级两块各自满足同一容量档的匹配企业 HDD 经验证 RAID1 和 64GB 内存。</w:t>
       </w:r>
     </w:p>
     <w:p>
@@ -6016,7 +6016,7 @@
           <w:sz w:val="19"/>
           <w:lang w:val="en-US" w:eastAsia="zh-CN" w:bidi="ar-SA"/>
         </w:rPr>
-        <w:t>ThinkStation P340 i5-10500、32GB、256GB SSD、单 1TB HDD 以约 20 名活跃用户为实机认证目标，不是登录硬上限或已达成承诺；恢复时间按数据量和实测证书签发。</w:t>
+        <w:t>ThinkStation P340 i5-10500、32GB、256GB SSD 与当前单 1TB HDD 只用于开发验证，1TB HDD 永久不能通过认证成为生产盘。约 20 名活跃用户的生产认证目标必须先换装原始容量不少于 2,000,000,000,000 bytes 的合格企业 CMR HDD，并同时满足 NTFS 动态容量公式与全部证据门；在此之前为 PRODUCTION_NOT_READY，不是登录硬上限或已达成承诺，恢复时间按数据量和实测证书签发。</w:t>
       </w:r>
     </w:p>
     <w:sectPr>

</xml_diff>